<commit_message>
feat(reports): nonlinear-regime test + honest verdict (doc 15); refresh report/dossier
Tested the 'AE beats linear PCA on nonlinear data' hypothesis (inner-filter + saturation).
Result: pca_load stays strongest (0.460); AE collapses harder (0.368) — perturbation follows
nuisance-driven reconstruction variance. Transform destroyed info (both oracles dropped) rather
than relocating it. Synthetic ceiling reached; real-data is the decisive lever. Reports regenerated.

Co-Authored-By: Claude Opus 4.8 (1M context) <noreply@anthropic.com>
</commit_message>
<xml_diff>
--- a/docs/spectraforge/COMPLETE-DOSSIER.docx
+++ b/docs/spectraforge/COMPLETE-DOSSIER.docx
@@ -27441,6 +27441,733 @@
         <w:pStyle w:val="Title"/>
       </w:pPr>
       <w:r>
+        <w:t>15 — The nonlinear-regime test (an honest negative, and what it means)</w:t>
+      </w:r>
+    </w:p>
+    <w:p>
+      <w:r>
+        <w:t xml:space="preserve">Hypothesis (the principled route to *exceeding* </w:t>
+      </w:r>
+      <w:r>
+        <w:rPr>
+          <w:rFonts w:ascii="Consolas" w:hAnsi="Consolas"/>
+          <w:color w:val="B03060"/>
+          <w:sz w:val="19"/>
+        </w:rPr>
+        <w:t>pca_load</w:t>
+      </w:r>
+      <w:r>
+        <w:t xml:space="preserve"> by a wide margin): the realistic regime is</w:t>
+      </w:r>
+    </w:p>
+    <w:p>
+      <w:r>
+        <w:t xml:space="preserve">near-saturated because its structure is essentially </w:t>
+      </w:r>
+      <w:r>
+        <w:rPr>
+          <w:b/>
+        </w:rPr>
+        <w:t>linear</w:t>
+      </w:r>
+      <w:r>
+        <w:t>, where PCA is near-optimal. An</w:t>
+      </w:r>
+    </w:p>
+    <w:p>
+      <w:r>
+        <w:t xml:space="preserve">autoencoder's real advantage is </w:t>
+      </w:r>
+      <w:r>
+        <w:rPr>
+          <w:b/>
+        </w:rPr>
+        <w:t>nonlinear</w:t>
+      </w:r>
+      <w:r>
+        <w:t xml:space="preserve"> manifolds — and fluorescence supplies them (inner-filter</w:t>
+      </w:r>
+    </w:p>
+    <w:p>
+      <w:r>
+        <w:t>effect, reabsorption, concentration quenching, detector saturation). So on a genuinely nonlinear scene</w:t>
+      </w:r>
+    </w:p>
+    <w:p>
+      <w:r>
+        <w:t>the AE+perturbation *should* beat the linear baselines by more.</w:t>
+      </w:r>
+    </w:p>
+    <w:p>
+      <w:r>
+        <w:rPr>
+          <w:b/>
+        </w:rPr>
+        <w:t>We tested it (`reports/nonlinear_regime.py`):</w:t>
+      </w:r>
+      <w:r>
+        <w:t xml:space="preserve"> render the realistic scene, then apply a per-pixel</w:t>
+      </w:r>
+    </w:p>
+    <w:p>
+      <w:r>
+        <w:rPr>
+          <w:b/>
+        </w:rPr>
+        <w:t>inner-filter attenuation</w:t>
+      </w:r>
+      <w:r>
+        <w:t xml:space="preserve"> (coupled to total brightness — i.e. the bright nuisances) plus a</w:t>
+      </w:r>
+    </w:p>
+    <w:p>
+      <w:r>
+        <w:rPr>
+          <w:b/>
+        </w:rPr>
+        <w:t>saturating quench</w:t>
+      </w:r>
+      <w:r>
+        <w:t>, and compare blind selectors against both a linear (</w:t>
+      </w:r>
+      <w:r>
+        <w:rPr>
+          <w:rFonts w:ascii="Consolas" w:hAnsi="Consolas"/>
+          <w:color w:val="B03060"/>
+          <w:sz w:val="19"/>
+        </w:rPr>
+        <w:t>f_classif</w:t>
+      </w:r>
+      <w:r>
+        <w:t>) and a nonlinear</w:t>
+      </w:r>
+    </w:p>
+    <w:p>
+      <w:r>
+        <w:t>(</w:t>
+      </w:r>
+      <w:r>
+        <w:rPr>
+          <w:rFonts w:ascii="Consolas" w:hAnsi="Consolas"/>
+          <w:color w:val="B03060"/>
+          <w:sz w:val="19"/>
+        </w:rPr>
+        <w:t>mutual_info_classif</w:t>
+      </w:r>
+      <w:r>
+        <w:t>) top-k oracle. Three seeds, 12-band budget, KNN macro-F1.</w:t>
+      </w:r>
+    </w:p>
+    <w:tbl>
+      <w:tblPr>
+        <w:tblStyle w:val="LightGrid-Accent1"/>
+        <w:tblW w:type="auto" w:w="0"/>
+        <w:tblLook w:firstColumn="1" w:firstRow="1" w:lastColumn="0" w:lastRow="0" w:noHBand="0" w:noVBand="1" w:val="04A0"/>
+      </w:tblPr>
+      <w:tblGrid>
+        <w:gridCol w:w="2880"/>
+        <w:gridCol w:w="2880"/>
+        <w:gridCol w:w="2880"/>
+      </w:tblGrid>
+      <w:tr>
+        <w:tc>
+          <w:tcPr>
+            <w:tcW w:type="dxa" w:w="2880"/>
+          </w:tcPr>
+          <w:p>
+            <w:r>
+              <w:rPr>
+                <w:b/>
+              </w:rPr>
+              <w:t>method</w:t>
+            </w:r>
+          </w:p>
+        </w:tc>
+        <w:tc>
+          <w:tcPr>
+            <w:tcW w:type="dxa" w:w="2880"/>
+          </w:tcPr>
+          <w:p>
+            <w:r>
+              <w:rPr>
+                <w:b/>
+              </w:rPr>
+              <w:t>LINEAR control</w:t>
+            </w:r>
+          </w:p>
+        </w:tc>
+        <w:tc>
+          <w:tcPr>
+            <w:tcW w:type="dxa" w:w="2880"/>
+          </w:tcPr>
+          <w:p>
+            <w:r>
+              <w:rPr>
+                <w:b/>
+              </w:rPr>
+              <w:t>NONLINEAR (IFE+sat)</w:t>
+            </w:r>
+          </w:p>
+        </w:tc>
+      </w:tr>
+      <w:tr>
+        <w:tc>
+          <w:tcPr>
+            <w:tcW w:type="dxa" w:w="2880"/>
+          </w:tcPr>
+          <w:p>
+            <w:r>
+              <w:t>variance</w:t>
+            </w:r>
+          </w:p>
+        </w:tc>
+        <w:tc>
+          <w:tcPr>
+            <w:tcW w:type="dxa" w:w="2880"/>
+          </w:tcPr>
+          <w:p>
+            <w:r>
+              <w:t>0.351</w:t>
+            </w:r>
+          </w:p>
+        </w:tc>
+        <w:tc>
+          <w:tcPr>
+            <w:tcW w:type="dxa" w:w="2880"/>
+          </w:tcPr>
+          <w:p>
+            <w:r>
+              <w:t>0.361</w:t>
+            </w:r>
+          </w:p>
+        </w:tc>
+      </w:tr>
+      <w:tr>
+        <w:tc>
+          <w:tcPr>
+            <w:tcW w:type="dxa" w:w="2880"/>
+          </w:tcPr>
+          <w:p>
+            <w:r>
+              <w:rPr>
+                <w:b/>
+              </w:rPr>
+              <w:t>pca_load[k6]</w:t>
+            </w:r>
+          </w:p>
+        </w:tc>
+        <w:tc>
+          <w:tcPr>
+            <w:tcW w:type="dxa" w:w="2880"/>
+          </w:tcPr>
+          <w:p>
+            <w:r>
+              <w:rPr>
+                <w:b/>
+              </w:rPr>
+              <w:t>0.486</w:t>
+            </w:r>
+          </w:p>
+        </w:tc>
+        <w:tc>
+          <w:tcPr>
+            <w:tcW w:type="dxa" w:w="2880"/>
+          </w:tcPr>
+          <w:p>
+            <w:r>
+              <w:rPr>
+                <w:b/>
+              </w:rPr>
+              <w:t>0.460</w:t>
+            </w:r>
+          </w:p>
+        </w:tc>
+      </w:tr>
+      <w:tr>
+        <w:tc>
+          <w:tcPr>
+            <w:tcW w:type="dxa" w:w="2880"/>
+          </w:tcPr>
+          <w:p>
+            <w:r>
+              <w:rPr>
+                <w:b/>
+              </w:rPr>
+              <w:t>AE+perturb (conv)</w:t>
+            </w:r>
+          </w:p>
+        </w:tc>
+        <w:tc>
+          <w:tcPr>
+            <w:tcW w:type="dxa" w:w="2880"/>
+          </w:tcPr>
+          <w:p>
+            <w:r>
+              <w:t>0.461</w:t>
+            </w:r>
+          </w:p>
+        </w:tc>
+        <w:tc>
+          <w:tcPr>
+            <w:tcW w:type="dxa" w:w="2880"/>
+          </w:tcPr>
+          <w:p>
+            <w:r>
+              <w:rPr>
+                <w:b/>
+              </w:rPr>
+              <w:t>0.368</w:t>
+            </w:r>
+          </w:p>
+        </w:tc>
+      </w:tr>
+      <w:tr>
+        <w:tc>
+          <w:tcPr>
+            <w:tcW w:type="dxa" w:w="2880"/>
+          </w:tcPr>
+          <w:p>
+            <w:r>
+              <w:t xml:space="preserve">oracle </w:t>
+            </w:r>
+            <w:r>
+              <w:rPr>
+                <w:rFonts w:ascii="Consolas" w:hAnsi="Consolas"/>
+                <w:color w:val="B03060"/>
+                <w:sz w:val="19"/>
+              </w:rPr>
+              <w:t>f_classif</w:t>
+            </w:r>
+            <w:r>
+              <w:t xml:space="preserve"> (linear)</w:t>
+            </w:r>
+          </w:p>
+        </w:tc>
+        <w:tc>
+          <w:tcPr>
+            <w:tcW w:type="dxa" w:w="2880"/>
+          </w:tcPr>
+          <w:p>
+            <w:r>
+              <w:t>0.493</w:t>
+            </w:r>
+          </w:p>
+        </w:tc>
+        <w:tc>
+          <w:tcPr>
+            <w:tcW w:type="dxa" w:w="2880"/>
+          </w:tcPr>
+          <w:p>
+            <w:r>
+              <w:t>0.472</w:t>
+            </w:r>
+          </w:p>
+        </w:tc>
+      </w:tr>
+      <w:tr>
+        <w:tc>
+          <w:tcPr>
+            <w:tcW w:type="dxa" w:w="2880"/>
+          </w:tcPr>
+          <w:p>
+            <w:r>
+              <w:t xml:space="preserve">oracle </w:t>
+            </w:r>
+            <w:r>
+              <w:rPr>
+                <w:rFonts w:ascii="Consolas" w:hAnsi="Consolas"/>
+                <w:color w:val="B03060"/>
+                <w:sz w:val="19"/>
+              </w:rPr>
+              <w:t>mutual_info</w:t>
+            </w:r>
+            <w:r>
+              <w:t xml:space="preserve"> (nonlinear)</w:t>
+            </w:r>
+          </w:p>
+        </w:tc>
+        <w:tc>
+          <w:tcPr>
+            <w:tcW w:type="dxa" w:w="2880"/>
+          </w:tcPr>
+          <w:p>
+            <w:r>
+              <w:t>0.480</w:t>
+            </w:r>
+          </w:p>
+        </w:tc>
+        <w:tc>
+          <w:tcPr>
+            <w:tcW w:type="dxa" w:w="2880"/>
+          </w:tcPr>
+          <w:p>
+            <w:r>
+              <w:t>0.450</w:t>
+            </w:r>
+          </w:p>
+        </w:tc>
+      </w:tr>
+    </w:tbl>
+    <w:p/>
+    <w:p>
+      <w:pPr>
+        <w:pStyle w:val="Heading1"/>
+      </w:pPr>
+      <w:r>
+        <w:t xml:space="preserve">Result: the hypothesis was </w:t>
+      </w:r>
+      <w:r>
+        <w:rPr>
+          <w:b/>
+        </w:rPr>
+        <w:t>not</w:t>
+      </w:r>
+      <w:r>
+        <w:t xml:space="preserve"> supported — and the reason is instructive</w:t>
+      </w:r>
+    </w:p>
+    <w:p>
+      <w:pPr>
+        <w:pStyle w:val="ListNumber"/>
+      </w:pPr>
+      <w:r>
+        <w:rPr>
+          <w:b/>
+        </w:rPr>
+        <w:t>The nonlinearity I applied was *destructive*, not *information-relocating*.</w:t>
+      </w:r>
+      <w:r>
+        <w:t xml:space="preserve"> Both oracles</w:t>
+      </w:r>
+    </w:p>
+    <w:p>
+      <w:r>
+        <w:t>*dropped* (f_classif 0.493→0.472, MI 0.480→0.450) and the nonlinear MI-oracle stayed *below* the</w:t>
+      </w:r>
+    </w:p>
+    <w:p>
+      <w:r>
+        <w:t xml:space="preserve">linear one. So the inner-filter+saturation transform mostly </w:t>
+      </w:r>
+      <w:r>
+        <w:rPr>
+          <w:b/>
+        </w:rPr>
+        <w:t>reduced</w:t>
+      </w:r>
+      <w:r>
+        <w:t xml:space="preserve"> the total discriminative</w:t>
+      </w:r>
+    </w:p>
+    <w:p>
+      <w:r>
+        <w:t>information (uniform per-pixel dimming dominated by the bright nuisances) rather than encoding it in</w:t>
+      </w:r>
+    </w:p>
+    <w:p>
+      <w:r>
+        <w:t>nonlinear structure. It is therefore not a fair test of "nonlinear info the AE can exploit."</w:t>
+      </w:r>
+    </w:p>
+    <w:p>
+      <w:pPr>
+        <w:pStyle w:val="ListNumber"/>
+      </w:pPr>
+      <w:r>
+        <w:rPr>
+          <w:b/>
+        </w:rPr>
+        <w:t>pca_load remained the strongest blind method even so</w:t>
+      </w:r>
+      <w:r>
+        <w:t xml:space="preserve"> (0.460), degrading *gracefully*.</w:t>
+      </w:r>
+    </w:p>
+    <w:p>
+      <w:pPr>
+        <w:pStyle w:val="ListNumber"/>
+      </w:pPr>
+      <w:r>
+        <w:rPr>
+          <w:b/>
+        </w:rPr>
+        <w:t>The AE+perturbation collapsed harder (0.461→0.368)</w:t>
+      </w:r>
+      <w:r>
+        <w:t xml:space="preserve"> and its hit-rate on the discriminative window</w:t>
+      </w:r>
+    </w:p>
+    <w:p>
+      <w:r>
+        <w:t xml:space="preserve">fell from 69% to 22%. The diagnostic: the perturbation ranks bands by </w:t>
+      </w:r>
+      <w:r>
+        <w:rPr>
+          <w:b/>
+        </w:rPr>
+        <w:t>reconstruction influence</w:t>
+      </w:r>
+      <w:r>
+        <w:t>,</w:t>
+      </w:r>
+    </w:p>
+    <w:p>
+      <w:r>
+        <w:t>which the bright nuisance-driven attenuation pattern now dominates — so the selector follows the</w:t>
+      </w:r>
+    </w:p>
+    <w:p>
+      <w:r>
+        <w:t xml:space="preserve">nuisances. </w:t>
+      </w:r>
+      <w:r>
+        <w:rPr>
+          <w:b/>
+        </w:rPr>
+        <w:t>The perturbation method is *more* nuisance-sensitive than PCA</w:t>
+      </w:r>
+      <w:r>
+        <w:t>, not less.</w:t>
+      </w:r>
+    </w:p>
+    <w:p>
+      <w:pPr>
+        <w:pStyle w:val="Heading1"/>
+      </w:pPr>
+      <w:r>
+        <w:t>What this means (honest verdict)</w:t>
+      </w:r>
+    </w:p>
+    <w:p>
+      <w:pPr>
+        <w:pStyle w:val="ListBullet"/>
+      </w:pPr>
+      <w:r>
+        <w:t xml:space="preserve">On </w:t>
+      </w:r>
+      <w:r>
+        <w:rPr>
+          <w:b/>
+        </w:rPr>
+        <w:t>additive-fluorophore synthetic data</w:t>
+      </w:r>
+      <w:r>
+        <w:t xml:space="preserve">, </w:t>
+      </w:r>
+      <w:r>
+        <w:rPr>
+          <w:rFonts w:ascii="Consolas" w:hAnsi="Consolas"/>
+          <w:color w:val="B03060"/>
+          <w:sz w:val="19"/>
+        </w:rPr>
+        <w:t>pca_load</w:t>
+      </w:r>
+      <w:r>
+        <w:t xml:space="preserve"> is a remarkably </w:t>
+      </w:r>
+      <w:r>
+        <w:rPr>
+          <w:b/>
+        </w:rPr>
+        <w:t>strong and robust</w:t>
+      </w:r>
+      <w:r>
+        <w:t xml:space="preserve"> baseline.</w:t>
+      </w:r>
+    </w:p>
+    <w:p>
+      <w:r>
+        <w:t xml:space="preserve">Both PCA and a reconstruction-AE are fundamentally </w:t>
+      </w:r>
+      <w:r>
+        <w:rPr>
+          <w:b/>
+        </w:rPr>
+        <w:t>variance-driven</w:t>
+      </w:r>
+      <w:r>
+        <w:t>, and PCA selects the</w:t>
+      </w:r>
+    </w:p>
+    <w:p>
+      <w:r>
+        <w:t>spectrally-prominent informative bands near-optimally; a destructive nonlinearity hurts the</w:t>
+      </w:r>
+    </w:p>
+    <w:p>
+      <w:r>
+        <w:t>variance-following AE *more*, not less.</w:t>
+      </w:r>
+    </w:p>
+    <w:p>
+      <w:pPr>
+        <w:pStyle w:val="ListBullet"/>
+      </w:pPr>
+      <w:r>
+        <w:t xml:space="preserve">A fair test of the nonlinear hypothesis needs a generator where nonlinear mixing </w:t>
+      </w:r>
+      <w:r>
+        <w:rPr>
+          <w:b/>
+        </w:rPr>
+        <w:t>relocates</w:t>
+      </w:r>
+    </w:p>
+    <w:p>
+      <w:r>
+        <w:t xml:space="preserve">discriminative information into band *shape/ratios* while </w:t>
+      </w:r>
+      <w:r>
+        <w:rPr>
+          <w:b/>
+        </w:rPr>
+        <w:t>preserving</w:t>
+      </w:r>
+      <w:r>
+        <w:t xml:space="preserve"> total information (so that</w:t>
+      </w:r>
+    </w:p>
+    <w:p>
+      <w:r>
+        <w:rPr>
+          <w:rFonts w:ascii="Consolas" w:hAnsi="Consolas"/>
+          <w:color w:val="B03060"/>
+          <w:sz w:val="19"/>
+        </w:rPr>
+        <w:t>mutual_info</w:t>
+      </w:r>
+      <w:r>
+        <w:t xml:space="preserve"> oracle &gt; </w:t>
+      </w:r>
+      <w:r>
+        <w:rPr>
+          <w:rFonts w:ascii="Consolas" w:hAnsi="Consolas"/>
+          <w:color w:val="B03060"/>
+          <w:sz w:val="19"/>
+        </w:rPr>
+        <w:t>f_classif</w:t>
+      </w:r>
+      <w:r>
+        <w:t xml:space="preserve"> oracle). That requires changes </w:t>
+      </w:r>
+      <w:r>
+        <w:rPr>
+          <w:b/>
+        </w:rPr>
+        <w:t>inside the renderer</w:t>
+      </w:r>
+    </w:p>
+    <w:p>
+      <w:r>
+        <w:t>(concentration-dependent reabsorption / self-absorption that reshapes emission bands), not a</w:t>
+      </w:r>
+    </w:p>
+    <w:p>
+      <w:r>
+        <w:t>post-hoc multiply on the cube. That is the correct next experiment if we pursue this further — but it</w:t>
+      </w:r>
+    </w:p>
+    <w:p>
+      <w:r>
+        <w:t>is a generator change, not a quick sweep.</w:t>
+      </w:r>
+    </w:p>
+    <w:p>
+      <w:pPr>
+        <w:pStyle w:val="ListBullet"/>
+      </w:pPr>
+      <w:r>
+        <w:rPr>
+          <w:b/>
+        </w:rPr>
+        <w:t>The defensible, evidence-backed claims remain:</w:t>
+      </w:r>
+      <w:r>
+        <w:t xml:space="preserve"> the fixed AE+perturbation **matches </w:t>
+      </w:r>
+      <w:r>
+        <w:rPr>
+          <w:rFonts w:ascii="Consolas" w:hAnsi="Consolas"/>
+          <w:color w:val="B03060"/>
+          <w:sz w:val="19"/>
+        </w:rPr>
+        <w:t>pca_load</w:t>
+      </w:r>
+    </w:p>
+    <w:p>
+      <w:r>
+        <w:t>across regimes and exceeds it on clean data</w:t>
+      </w:r>
+      <w:r>
+        <w:rPr>
+          <w:b/>
+        </w:rPr>
+        <w:t xml:space="preserve">; "exceeding by far more" is </w:t>
+      </w:r>
+      <w:r>
+        <w:t>not** supported by the</w:t>
+      </w:r>
+    </w:p>
+    <w:p>
+      <w:r>
+        <w:t>synthetic evidence, and chasing it with post-hoc synthetic nonlinearities is not rigorous.</w:t>
+      </w:r>
+    </w:p>
+    <w:p>
+      <w:pPr>
+        <w:pStyle w:val="Heading1"/>
+      </w:pPr>
+      <w:r>
+        <w:t>Recommendation</w:t>
+      </w:r>
+    </w:p>
+    <w:p>
+      <w:r>
+        <w:t>The synthetic benchmark has been pushed to its honest ceiling. The decisive lever now is **real-data</w:t>
+      </w:r>
+    </w:p>
+    <w:p>
+      <w:r>
+        <w:t>validation (Lichens / Collagen)**, where the true task, real nonlinear photophysics, and real nuisance</w:t>
+      </w:r>
+    </w:p>
+    <w:p>
+      <w:r>
+        <w:t>structure may favor the nonlinear model in ways a fair synthetic proxy has not. If we do want one more</w:t>
+      </w:r>
+    </w:p>
+    <w:p>
+      <w:r>
+        <w:t xml:space="preserve">synthetic push, the *only* principled version is a </w:t>
+      </w:r>
+      <w:r>
+        <w:rPr>
+          <w:b/>
+        </w:rPr>
+        <w:t>reabsorption-reshaping renderer</w:t>
+      </w:r>
+      <w:r>
+        <w:t xml:space="preserve"> (above) — happy</w:t>
+      </w:r>
+    </w:p>
+    <w:p>
+      <w:r>
+        <w:t>to implement it, but it is a modelling change, not another sweep.</w:t>
+      </w:r>
+    </w:p>
+    <w:p>
+      <w:r>
+        <w:rPr>
+          <w:color w:val="CCCCCC"/>
+        </w:rPr>
+        <w:t>____________________________________________________________</w:t>
+      </w:r>
+    </w:p>
+    <w:p>
+      <w:pPr>
+        <w:pStyle w:val="Title"/>
+      </w:pPr>
+      <w:r>
         <w:t>SpectraForge — Autoencoder + Latent-Perturbation Band Selection for Multi-Excitation Hyperspectral Imaging</w:t>
       </w:r>
     </w:p>
@@ -31383,7 +32110,7 @@
         <w:pStyle w:val="Heading1"/>
       </w:pPr>
       <w:r>
-        <w:t>12. Future work — how to exceed the alternatives by *far* more</w:t>
+        <w:t>12. Trying to exceed by *far* more — the nonlinear test, and the honest ceiling</w:t>
       </w:r>
     </w:p>
     <w:p>
@@ -31411,12 +32138,74 @@
         <w:t>nonlinear</w:t>
       </w:r>
       <w:r>
-        <w:t xml:space="preserve"> — and</w:t>
-      </w:r>
-    </w:p>
-    <w:p>
-      <w:r>
-        <w:t>the photophysics gives us exactly such a regime:</w:t>
+        <w:t xml:space="preserve"> — the</w:t>
+      </w:r>
+    </w:p>
+    <w:p>
+      <w:r>
+        <w:t xml:space="preserve">inner-filter / reabsorption / quenching photophysics. </w:t>
+      </w:r>
+      <w:r>
+        <w:rPr>
+          <w:b/>
+        </w:rPr>
+        <w:t>We tested this hypothesis directly</w:t>
+      </w:r>
+    </w:p>
+    <w:p>
+      <w:r>
+        <w:t>(</w:t>
+      </w:r>
+      <w:r>
+        <w:rPr>
+          <w:rFonts w:ascii="Consolas" w:hAnsi="Consolas"/>
+          <w:color w:val="B03060"/>
+          <w:sz w:val="19"/>
+        </w:rPr>
+        <w:t>reports/nonlinear_regime.py</w:t>
+      </w:r>
+      <w:r>
+        <w:t>, doc 15): render the realistic scene, apply per-pixel inner-filter</w:t>
+      </w:r>
+    </w:p>
+    <w:p>
+      <w:r>
+        <w:t>attenuation + a saturating quench, and compare blind selectors against both a linear (</w:t>
+      </w:r>
+      <w:r>
+        <w:rPr>
+          <w:rFonts w:ascii="Consolas" w:hAnsi="Consolas"/>
+          <w:color w:val="B03060"/>
+          <w:sz w:val="19"/>
+        </w:rPr>
+        <w:t>f_classif</w:t>
+      </w:r>
+      <w:r>
+        <w:t>) and</w:t>
+      </w:r>
+    </w:p>
+    <w:p>
+      <w:r>
+        <w:t>a nonlinear (</w:t>
+      </w:r>
+      <w:r>
+        <w:rPr>
+          <w:rFonts w:ascii="Consolas" w:hAnsi="Consolas"/>
+          <w:color w:val="B03060"/>
+          <w:sz w:val="19"/>
+        </w:rPr>
+        <w:t>mutual_info_classif</w:t>
+      </w:r>
+      <w:r>
+        <w:t>) oracle.</w:t>
+      </w:r>
+    </w:p>
+    <w:p>
+      <w:r>
+        <w:rPr>
+          <w:b/>
+        </w:rPr>
+        <w:t>The hypothesis was not supported, and the result is diagnostic:</w:t>
       </w:r>
     </w:p>
     <w:p>
@@ -31425,41 +32214,6 @@
       </w:pPr>
       <w:r>
         <w:rPr>
-          <w:b/>
-        </w:rPr>
-        <w:t>Inner-filter / reabsorption / concentration-quenching regime.</w:t>
-      </w:r>
-      <w:r>
-        <w:t xml:space="preserve"> When excitation light is attenuated</w:t>
-      </w:r>
-    </w:p>
-    <w:p>
-      <w:r>
-        <w:t xml:space="preserve">before reaching the emitter and emission is reabsorbed, the measured signal is a </w:t>
-      </w:r>
-      <w:r>
-        <w:rPr>
-          <w:b/>
-        </w:rPr>
-        <w:t>nonlinear</w:t>
-      </w:r>
-    </w:p>
-    <w:p>
-      <w:r>
-        <w:t>function of concentration. PCA loadings (a linear basis) must degrade here; a nonlinear autoencoder</w:t>
-      </w:r>
-    </w:p>
-    <w:p>
-      <w:r>
-        <w:t>can model the manifold. **Hypothesis: on a strongly nonlinear EEM regime, the AE + perturbation will</w:t>
-      </w:r>
-    </w:p>
-    <w:p>
-      <w:r>
-        <w:t xml:space="preserve">exceed </w:t>
-      </w:r>
-      <w:r>
-        <w:rPr>
           <w:rFonts w:ascii="Consolas" w:hAnsi="Consolas"/>
           <w:color w:val="B03060"/>
           <w:sz w:val="19"/>
@@ -31467,7 +32221,35 @@
         <w:t>pca_load</w:t>
       </w:r>
       <w:r>
-        <w:t xml:space="preserve"> by a wide margin** — this is the next experiment.</w:t>
+        <w:t xml:space="preserve"> </w:t>
+      </w:r>
+      <w:r>
+        <w:rPr>
+          <w:b/>
+        </w:rPr>
+        <w:t>remained the strongest blind method even under the nonlinearity</w:t>
+      </w:r>
+      <w:r>
+        <w:t xml:space="preserve"> (0.460), degrading</w:t>
+      </w:r>
+    </w:p>
+    <w:p>
+      <w:r>
+        <w:t xml:space="preserve">gracefully; the </w:t>
+      </w:r>
+      <w:r>
+        <w:rPr>
+          <w:b/>
+        </w:rPr>
+        <w:t>AE+perturbation collapsed harder</w:t>
+      </w:r>
+      <w:r>
+        <w:t xml:space="preserve"> (0.461 → 0.368), its discriminative-band</w:t>
+      </w:r>
+    </w:p>
+    <w:p>
+      <w:r>
+        <w:t>hit-rate falling to 22%.</w:t>
       </w:r>
     </w:p>
     <w:p>
@@ -31475,18 +32257,91 @@
         <w:pStyle w:val="ListBullet"/>
       </w:pPr>
       <w:r>
+        <w:t>Both oracles *dropped* and the nonlinear MI-oracle stayed *below* the linear one — so the transform</w:t>
+      </w:r>
+    </w:p>
+    <w:p>
+      <w:r>
+        <w:t xml:space="preserve">mostly </w:t>
+      </w:r>
+      <w:r>
         <w:rPr>
           <w:b/>
         </w:rPr>
-        <w:t>Trilinear-breaking mixtures / FRET.</w:t>
-      </w:r>
-      <w:r>
-        <w:t xml:space="preserve"> Energy transfer between fluorophores breaks the simple</w:t>
-      </w:r>
-    </w:p>
-    <w:p>
-      <w:r>
-        <w:t>trilinear EEM model in a structured, nonlinear way — another regime favouring the AE.</w:t>
+        <w:t>destroyed</w:t>
+      </w:r>
+      <w:r>
+        <w:t xml:space="preserve"> information rather than relocating it into nonlinear structure. It is therefore</w:t>
+      </w:r>
+    </w:p>
+    <w:p>
+      <w:r>
+        <w:t>not a fair test, and the AE's collapse exposes a real weakness: the perturbation ranks bands by</w:t>
+      </w:r>
+    </w:p>
+    <w:p>
+      <w:r>
+        <w:rPr>
+          <w:b/>
+        </w:rPr>
+        <w:t>reconstruction influence</w:t>
+      </w:r>
+      <w:r>
+        <w:t>, which a bright-nuisance-driven attenuation pattern dominates, so the</w:t>
+      </w:r>
+    </w:p>
+    <w:p>
+      <w:r>
+        <w:t xml:space="preserve">selector follows the nuisances. </w:t>
+      </w:r>
+      <w:r>
+        <w:rPr>
+          <w:b/>
+        </w:rPr>
+        <w:t>The perturbation method is *more* nuisance-sensitive than PCA.</w:t>
+      </w:r>
+    </w:p>
+    <w:p>
+      <w:r>
+        <w:rPr>
+          <w:b/>
+        </w:rPr>
+        <w:t>Honest conclusion:</w:t>
+      </w:r>
+      <w:r>
+        <w:t xml:space="preserve"> on additive-fluorophore synthetic data both PCA and a reconstruction-AE are</w:t>
+      </w:r>
+    </w:p>
+    <w:p>
+      <w:r>
+        <w:t>variance-driven, and PCA selects the spectrally-prominent informative bands near-optimally. "Exceeding</w:t>
+      </w:r>
+    </w:p>
+    <w:p>
+      <w:r>
+        <w:rPr>
+          <w:rFonts w:ascii="Consolas" w:hAnsi="Consolas"/>
+          <w:color w:val="B03060"/>
+          <w:sz w:val="19"/>
+        </w:rPr>
+        <w:t>pca_load</w:t>
+      </w:r>
+      <w:r>
+        <w:t xml:space="preserve"> by far more" is </w:t>
+      </w:r>
+      <w:r>
+        <w:rPr>
+          <w:b/>
+        </w:rPr>
+        <w:t>not supported by the synthetic evidence</w:t>
+      </w:r>
+      <w:r>
+        <w:t>, and post-hoc synthetic</w:t>
+      </w:r>
+    </w:p>
+    <w:p>
+      <w:r>
+        <w:t>nonlinearities do not test it rigorously. The remaining principled directions:</w:t>
       </w:r>
     </w:p>
     <w:p>
@@ -31497,21 +32352,59 @@
         <w:rPr>
           <w:b/>
         </w:rPr>
-        <w:t>Real-data validation (the outstanding gate).</w:t>
-      </w:r>
-      <w:r>
-        <w:t xml:space="preserve"> Validate the winning config on the actual</w:t>
-      </w:r>
-    </w:p>
-    <w:p>
+        <w:t>A reabsorption-reshaping renderer</w:t>
+      </w:r>
+      <w:r>
+        <w:t xml:space="preserve"> — concentration-dependent self-absorption that relocates</w:t>
+      </w:r>
+    </w:p>
+    <w:p>
+      <w:r>
+        <w:t>discriminative information into band *shape/ratios* while *preserving* total information (so that the</w:t>
+      </w:r>
+    </w:p>
+    <w:p>
+      <w:r>
+        <w:t xml:space="preserve">nonlinear oracle genuinely exceeds the linear one). This is a </w:t>
+      </w:r>
       <w:r>
         <w:rPr>
           <w:b/>
         </w:rPr>
+        <w:t>generator change</w:t>
+      </w:r>
+      <w:r>
+        <w:t>, not a sweep, and</w:t>
+      </w:r>
+    </w:p>
+    <w:p>
+      <w:r>
+        <w:t>is the only rigorous way to give the nonlinear hypothesis a fair test.</w:t>
+      </w:r>
+    </w:p>
+    <w:p>
+      <w:pPr>
+        <w:pStyle w:val="ListBullet"/>
+      </w:pPr>
+      <w:r>
+        <w:rPr>
+          <w:b/>
+        </w:rPr>
+        <w:t>Real-data validation (the decisive gate).</w:t>
+      </w:r>
+      <w:r>
+        <w:t xml:space="preserve"> Validate the winning config on the actual </w:t>
+      </w:r>
+      <w:r>
+        <w:rPr>
+          <w:b/>
+        </w:rPr>
         <w:t>Lichens</w:t>
       </w:r>
-      <w:r>
-        <w:t xml:space="preserve"> and </w:t>
+    </w:p>
+    <w:p>
+      <w:r>
+        <w:t xml:space="preserve">and </w:t>
       </w:r>
       <w:r>
         <w:rPr>
@@ -31520,7 +32413,12 @@
         <w:t>Collagen</w:t>
       </w:r>
       <w:r>
-        <w:t xml:space="preserve"> cubes (data not present on this machine). This is the decisive test.</w:t>
+        <w:t xml:space="preserve"> cubes (data not present on this machine), where the true task and real nonlinear</w:t>
+      </w:r>
+    </w:p>
+    <w:p>
+      <w:r>
+        <w:t>photophysics may favour the nonlinear model in ways a fair synthetic proxy has not.</w:t>
       </w:r>
     </w:p>
     <w:p>

</xml_diff>

<commit_message>
feat: fair nonlinear evaluation + reabsorption results (doc 16); refresh report/dossier
Honest nonlinear finding: under a CORRECT metric (classifier panel + nonlinear-only gap, CV) the
AE+perturbation overtakes pca_load on the reabsorption regime (best-NL 0.467 vs 0.438; nonlinear gap
+0.030 vs -0.021) -- the user's intuition confirmed directionally and made visible by the right metric.
But the margin is small/within seed noise; 'by far more' is not supported synthetically (first-order
reabsorption is largely linear). The evaluation methodology is the lasting contribution. Adds
disc_extinction knob + reabsorption_clean.py (4-seed significance check).

Co-Authored-By: Claude Opus 4.8 (1M context) <noreply@anthropic.com>
</commit_message>
<xml_diff>
--- a/docs/spectraforge/COMPLETE-DOSSIER.docx
+++ b/docs/spectraforge/COMPLETE-DOSSIER.docx
@@ -28168,6 +28168,789 @@
         <w:pStyle w:val="Title"/>
       </w:pPr>
       <w:r>
+        <w:t>16 — A fair nonlinear regime (reabsorption) and how to evaluate selection correctly</w:t>
+      </w:r>
+    </w:p>
+    <w:p>
+      <w:r>
+        <w:t>This doc answers a question that turned out to be deeper than the modelling: **on nonlinear data, how</w:t>
+      </w:r>
+    </w:p>
+    <w:p>
+      <w:r>
+        <w:t>do you define and quantify whether a band selection is "good", and is the measurement correct?** It</w:t>
+      </w:r>
+    </w:p>
+    <w:p>
+      <w:r>
+        <w:t>also reports the honest result of giving the AE its fairest nonlinear shot.</w:t>
+      </w:r>
+    </w:p>
+    <w:p>
+      <w:pPr>
+        <w:pStyle w:val="Heading1"/>
+      </w:pPr>
+      <w:r>
+        <w:t>1. Why the usual metric is wrong for nonlinear data</w:t>
+      </w:r>
+    </w:p>
+    <w:p>
+      <w:r>
+        <w:t xml:space="preserve">In the </w:t>
+      </w:r>
+      <w:r>
+        <w:rPr>
+          <w:b/>
+        </w:rPr>
+        <w:t>linear</w:t>
+      </w:r>
+      <w:r>
+        <w:t xml:space="preserve"> regime, "informative" is robust — variance, ANOVA-F (</w:t>
+      </w:r>
+      <w:r>
+        <w:rPr>
+          <w:rFonts w:ascii="Consolas" w:hAnsi="Consolas"/>
+          <w:color w:val="B03060"/>
+          <w:sz w:val="19"/>
+        </w:rPr>
+        <w:t>f_classif</w:t>
+      </w:r>
+      <w:r>
+        <w:t>), PCA-loadings, and</w:t>
+      </w:r>
+    </w:p>
+    <w:p>
+      <w:r>
+        <w:t xml:space="preserve">KNN-on-standardized-bands all roughly agree. That is exactly why </w:t>
+      </w:r>
+      <w:r>
+        <w:rPr>
+          <w:rFonts w:ascii="Consolas" w:hAnsi="Consolas"/>
+          <w:color w:val="B03060"/>
+          <w:sz w:val="19"/>
+        </w:rPr>
+        <w:t>pca_load</w:t>
+      </w:r>
+      <w:r>
+        <w:t xml:space="preserve"> looked unbeatable: the</w:t>
+      </w:r>
+    </w:p>
+    <w:p>
+      <w:r>
+        <w:t>metric and the method share a *linear* notion of information.</w:t>
+      </w:r>
+    </w:p>
+    <w:p>
+      <w:r>
+        <w:t xml:space="preserve">In a </w:t>
+      </w:r>
+      <w:r>
+        <w:rPr>
+          <w:b/>
+        </w:rPr>
+        <w:t>nonlinear</w:t>
+      </w:r>
+      <w:r>
+        <w:t xml:space="preserve"> regime that agreement breaks in two places, and **both must be fixed or the result</w:t>
+      </w:r>
+    </w:p>
+    <w:p>
+      <w:r>
+        <w:t>is meaningless**:</w:t>
+      </w:r>
+    </w:p>
+    <w:p>
+      <w:pPr>
+        <w:pStyle w:val="ListNumber"/>
+      </w:pPr>
+      <w:r>
+        <w:rPr>
+          <w:b/>
+        </w:rPr>
+        <w:t>The oracle is linear.</w:t>
+      </w:r>
+      <w:r>
+        <w:t xml:space="preserve"> </w:t>
+      </w:r>
+      <w:r>
+        <w:rPr>
+          <w:rFonts w:ascii="Consolas" w:hAnsi="Consolas"/>
+          <w:color w:val="B03060"/>
+          <w:sz w:val="19"/>
+        </w:rPr>
+        <w:t>f_classif</w:t>
+      </w:r>
+      <w:r>
+        <w:t xml:space="preserve"> is a linear ANOVA F-test. If information moves into a band</w:t>
+      </w:r>
+    </w:p>
+    <w:p>
+      <w:r>
+        <w:t xml:space="preserve">*ratio* or *shape* (informative only jointly/nonlinearly), </w:t>
+      </w:r>
+      <w:r>
+        <w:rPr>
+          <w:rFonts w:ascii="Consolas" w:hAnsi="Consolas"/>
+          <w:color w:val="B03060"/>
+          <w:sz w:val="19"/>
+        </w:rPr>
+        <w:t>f_classif</w:t>
+      </w:r>
+      <w:r>
+        <w:t xml:space="preserve"> scores those bands ~0 and</w:t>
+      </w:r>
+    </w:p>
+    <w:p>
+      <w:r>
+        <w:t>calls them useless. So the "oracle ceiling" we used (~0.49) is a *linear* ceiling; on nonlinear data</w:t>
+      </w:r>
+    </w:p>
+    <w:p>
+      <w:r>
+        <w:t>it understates what is achievable, and a correct nonlinear selection looks like a failure.</w:t>
+      </w:r>
+    </w:p>
+    <w:p>
+      <w:pPr>
+        <w:pStyle w:val="ListNumber"/>
+      </w:pPr>
+      <w:r>
+        <w:rPr>
+          <w:b/>
+        </w:rPr>
+        <w:t>The evaluator has an inductive bias.</w:t>
+      </w:r>
+      <w:r>
+        <w:t xml:space="preserve"> A single KNN measures "information *KNN* can use", not</w:t>
+      </w:r>
+    </w:p>
+    <w:p>
+      <w:r>
+        <w:t>"information in the bands". Scoring a genuinely-informative nonlinear subset with a model that can't</w:t>
+      </w:r>
+    </w:p>
+    <w:p>
+      <w:r>
+        <w:t>represent the nonlinearity measures the *model's* blindness, not the selection.</w:t>
+      </w:r>
+    </w:p>
+    <w:p>
+      <w:pPr>
+        <w:pStyle w:val="Heading1"/>
+      </w:pPr>
+      <w:r>
+        <w:t xml:space="preserve">2. The correct evaluation (what we built — </w:t>
+      </w:r>
+      <w:r>
+        <w:rPr>
+          <w:rFonts w:ascii="Consolas" w:hAnsi="Consolas"/>
+          <w:color w:val="B03060"/>
+          <w:sz w:val="19"/>
+        </w:rPr>
+        <w:t>reports/reabsorption_eval.py</w:t>
+      </w:r>
+      <w:r>
+        <w:t>)</w:t>
+      </w:r>
+    </w:p>
+    <w:p>
+      <w:r>
+        <w:t>The operational definition of a good selection: **the subset retains the information needed to predict</w:t>
+      </w:r>
+    </w:p>
+    <w:p>
+      <w:r>
+        <w:t>the label**, measured by a *sufficiently expressive* estimator, cross-validated, everything else held</w:t>
+      </w:r>
+    </w:p>
+    <w:p>
+      <w:r>
+        <w:t>equal. For each method's 12 bands we report:</w:t>
+      </w:r>
+    </w:p>
+    <w:p>
+      <w:pPr>
+        <w:pStyle w:val="ListBullet"/>
+      </w:pPr>
+      <w:r>
+        <w:rPr>
+          <w:b/>
+        </w:rPr>
+        <w:t>`linear`</w:t>
+      </w:r>
+      <w:r>
+        <w:t xml:space="preserve"> — LogisticRegression macro-F1 (what a linear model / PCA-aligned eval can extract);</w:t>
+      </w:r>
+    </w:p>
+    <w:p>
+      <w:pPr>
+        <w:pStyle w:val="ListBullet"/>
+      </w:pPr>
+      <w:r>
+        <w:rPr>
+          <w:b/>
+        </w:rPr>
+        <w:t>`best-NL`</w:t>
+      </w:r>
+      <w:r>
+        <w:t xml:space="preserve"> — max(KNN, RandomForest, MLP) macro-F1 (what an expressive model can extract = the</w:t>
+      </w:r>
+    </w:p>
+    <w:p>
+      <w:r>
+        <w:t xml:space="preserve">actual information content) — the </w:t>
+      </w:r>
+      <w:r>
+        <w:rPr>
+          <w:b/>
+        </w:rPr>
+        <w:t>headline</w:t>
+      </w:r>
+      <w:r>
+        <w:t xml:space="preserve"> for the nonlinear case;</w:t>
+      </w:r>
+    </w:p>
+    <w:p>
+      <w:pPr>
+        <w:pStyle w:val="ListBullet"/>
+      </w:pPr>
+      <w:r>
+        <w:rPr>
+          <w:b/>
+        </w:rPr>
+        <w:t>`gap = best-NL − linear`</w:t>
+      </w:r>
+      <w:r>
+        <w:t xml:space="preserve"> — the </w:t>
+      </w:r>
+      <w:r>
+        <w:rPr>
+          <w:b/>
+        </w:rPr>
+        <w:t>attribution</w:t>
+      </w:r>
+      <w:r>
+        <w:t>: information that is *only* nonlinearly accessible.</w:t>
+      </w:r>
+    </w:p>
+    <w:p>
+      <w:r>
+        <w:t xml:space="preserve">All on standardized features, </w:t>
+      </w:r>
+      <w:r>
+        <w:rPr>
+          <w:rFonts w:ascii="Consolas" w:hAnsi="Consolas"/>
+          <w:color w:val="B03060"/>
+          <w:sz w:val="19"/>
+        </w:rPr>
+        <w:t>StratifiedKFold</w:t>
+      </w:r>
+      <w:r>
+        <w:t xml:space="preserve"> CV, multiple seeds, identical budget. Guard rails to</w:t>
+      </w:r>
+    </w:p>
+    <w:p>
+      <w:r>
+        <w:t xml:space="preserve">avoid fooling ourselves: (a) the regime is only a *fair* nonlinear test if the </w:t>
+      </w:r>
+      <w:r>
+        <w:rPr>
+          <w:b/>
+        </w:rPr>
+        <w:t>all-bands `gap` &gt; 0</w:t>
+      </w:r>
+    </w:p>
+    <w:p>
+      <w:r>
+        <w:t xml:space="preserve">(nonlinear info genuinely exists); (b) </w:t>
+      </w:r>
+      <w:r>
+        <w:rPr>
+          <w:rFonts w:ascii="Consolas" w:hAnsi="Consolas"/>
+          <w:color w:val="B03060"/>
+          <w:sz w:val="19"/>
+        </w:rPr>
+        <w:t>best-NL</w:t>
+      </w:r>
+      <w:r>
+        <w:t xml:space="preserve"> takes a max over 3 models, so only the </w:t>
+      </w:r>
+      <w:r>
+        <w:rPr>
+          <w:b/>
+        </w:rPr>
+        <w:t>relative</w:t>
+      </w:r>
+    </w:p>
+    <w:p>
+      <w:r>
+        <w:t>comparison across selection methods (same panel/folds) is trustworthy, not the absolute number.</w:t>
+      </w:r>
+    </w:p>
+    <w:p>
+      <w:pPr>
+        <w:pStyle w:val="Heading1"/>
+      </w:pPr>
+      <w:r>
+        <w:t>3. A fair nonlinear regime: renderer reabsorption (secondary inner-filter)</w:t>
+      </w:r>
+    </w:p>
+    <w:p>
+      <w:r>
+        <w:t>Earlier attempts to make a nonlinear regime by post-multiplying the cube (doc 15) *destroyed*</w:t>
+      </w:r>
+    </w:p>
+    <w:p>
+      <w:r>
+        <w:t xml:space="preserve">information instead of relocating it. The physically-correct way is </w:t>
+      </w:r>
+      <w:r>
+        <w:rPr>
+          <w:b/>
+        </w:rPr>
+        <w:t>self-absorption</w:t>
+      </w:r>
+      <w:r>
+        <w:t xml:space="preserve"> in the</w:t>
+      </w:r>
+    </w:p>
+    <w:p>
+      <w:r>
+        <w:t>renderer (</w:t>
+      </w:r>
+      <w:r>
+        <w:rPr>
+          <w:rFonts w:ascii="Consolas" w:hAnsi="Consolas"/>
+          <w:color w:val="B03060"/>
+          <w:sz w:val="19"/>
+        </w:rPr>
+        <w:t>PhysicsConfig.reabsorption</w:t>
+      </w:r>
+      <w:r>
+        <w:t xml:space="preserve">): emitted light is reabsorbed by </w:t>
+      </w:r>
+      <w:r>
+        <w:rPr>
+          <w:rFonts w:ascii="Consolas" w:hAnsi="Consolas"/>
+          <w:color w:val="B03060"/>
+          <w:sz w:val="19"/>
+        </w:rPr>
+        <w:t>exp(-s·A_em(λ))</w:t>
+      </w:r>
+      <w:r>
+        <w:t>, where</w:t>
+      </w:r>
+    </w:p>
+    <w:p>
+      <w:r>
+        <w:rPr>
+          <w:rFonts w:ascii="Consolas" w:hAnsi="Consolas"/>
+          <w:color w:val="B03060"/>
+          <w:sz w:val="19"/>
+        </w:rPr>
+        <w:t>A_em(λ)=Σ_k ε_k c_k·absorption_k(λ)</w:t>
+      </w:r>
+      <w:r>
+        <w:t xml:space="preserve"> is the per-pixel, per-emission-wavelength absorbance. Because</w:t>
+      </w:r>
+    </w:p>
+    <w:p>
+      <w:r>
+        <w:t>absorption overlaps the blue edge of emission, this **suppresses the blue edge and red-shifts the peak</w:t>
+      </w:r>
+    </w:p>
+    <w:p>
+      <w:r>
+        <w:t>as a function of concentration** — a concentration-dependent *reshaping* that moves discriminative</w:t>
+      </w:r>
+    </w:p>
+    <w:p>
+      <w:r>
+        <w:t xml:space="preserve">information into band shape/ratios. Verified fair: turning it on drops </w:t>
+      </w:r>
+      <w:r>
+        <w:rPr>
+          <w:rFonts w:ascii="Consolas" w:hAnsi="Consolas"/>
+          <w:color w:val="B03060"/>
+          <w:sz w:val="19"/>
+        </w:rPr>
+        <w:t>linear</w:t>
+      </w:r>
+      <w:r>
+        <w:t xml:space="preserve"> accuracy (0.62→0.49)</w:t>
+      </w:r>
+    </w:p>
+    <w:p>
+      <w:r>
+        <w:t>while *widening* the nonlinear gap — info relocated, not destroyed.</w:t>
+      </w:r>
+    </w:p>
+    <w:p>
+      <w:pPr>
+        <w:pStyle w:val="Heading1"/>
+      </w:pPr>
+      <w:r>
+        <w:t>4. Results (honest)</w:t>
+      </w:r>
+    </w:p>
+    <w:p>
+      <w:r>
+        <w:rPr>
+          <w:b/>
+        </w:rPr>
+        <w:t>Single point (`reabsorption_eval.py`, s=2.5):</w:t>
+      </w:r>
+      <w:r>
+        <w:t xml:space="preserve"> under reabsorption the AE+perturbation **beat</w:t>
+      </w:r>
+    </w:p>
+    <w:p>
+      <w:r>
+        <w:rPr>
+          <w:rFonts w:ascii="Consolas" w:hAnsi="Consolas"/>
+          <w:color w:val="B03060"/>
+          <w:sz w:val="19"/>
+        </w:rPr>
+        <w:t>pca_load</w:t>
+      </w:r>
+      <w:r>
+        <w:rPr>
+          <w:b/>
+        </w:rPr>
+        <w:t xml:space="preserve"> — best-NL </w:t>
+      </w:r>
+      <w:r>
+        <w:t>0.467 vs 0.438** — and, crucially, its subset carried nonlinear-only</w:t>
+      </w:r>
+    </w:p>
+    <w:p>
+      <w:r>
+        <w:t>information (</w:t>
+      </w:r>
+      <w:r>
+        <w:rPr>
+          <w:b/>
+        </w:rPr>
+        <w:t>gap +0.030 vs −0.021</w:t>
+      </w:r>
+      <w:r>
+        <w:t>) ≈ the mutual-info oracle's (+0.035). The AE even selected bands</w:t>
+      </w:r>
+    </w:p>
+    <w:p>
+      <w:r>
+        <w:t xml:space="preserve">*outside* the nominal discriminative window (its </w:t>
+      </w:r>
+      <w:r>
+        <w:rPr>
+          <w:rFonts w:ascii="Consolas" w:hAnsi="Consolas"/>
+          <w:color w:val="B03060"/>
+          <w:sz w:val="19"/>
+        </w:rPr>
+        <w:t>%disc</w:t>
+      </w:r>
+      <w:r>
+        <w:t xml:space="preserve"> fell to 25%) yet scored higher — concrete</w:t>
+      </w:r>
+    </w:p>
+    <w:p>
+      <w:r>
+        <w:t xml:space="preserve">proof that the old </w:t>
+      </w:r>
+      <w:r>
+        <w:rPr>
+          <w:rFonts w:ascii="Consolas" w:hAnsi="Consolas"/>
+          <w:color w:val="B03060"/>
+          <w:sz w:val="19"/>
+        </w:rPr>
+        <w:t>%disc-window</w:t>
+      </w:r>
+      <w:r>
+        <w:t xml:space="preserve"> notion of "good" is itself a linear artifact.</w:t>
+      </w:r>
+    </w:p>
+    <w:p>
+      <w:r>
+        <w:rPr>
+          <w:b/>
+        </w:rPr>
+        <w:t>Strength sweep (`reabsorption_sweep.py`):</w:t>
+      </w:r>
+      <w:r>
+        <w:t xml:space="preserve"> the AE→pca </w:t>
+      </w:r>
+      <w:r>
+        <w:rPr>
+          <w:b/>
+        </w:rPr>
+        <w:t>margin crosses from negative to positive</w:t>
+      </w:r>
+    </w:p>
+    <w:p>
+      <w:r>
+        <w:t xml:space="preserve">as the regime becomes nonlinear (margin −0.013 at s=0 → </w:t>
+      </w:r>
+      <w:r>
+        <w:rPr>
+          <w:b/>
+        </w:rPr>
+        <w:t>+0.016 at s=5</w:t>
+      </w:r>
+      <w:r>
+        <w:t>, where the all-bands gap is</w:t>
+      </w:r>
+    </w:p>
+    <w:p>
+      <w:r>
+        <w:t xml:space="preserve">positive). </w:t>
+      </w:r>
+      <w:r>
+        <w:rPr>
+          <w:b/>
+        </w:rPr>
+        <w:t>Direction of the hypothesis confirmed.</w:t>
+      </w:r>
+      <w:r>
+        <w:t xml:space="preserve"> But the margin is </w:t>
+      </w:r>
+      <w:r>
+        <w:rPr>
+          <w:b/>
+        </w:rPr>
+        <w:t>small and non-monotonic</w:t>
+      </w:r>
+    </w:p>
+    <w:p>
+      <w:r>
+        <w:t>(at s=8 the AE loses again), and total information falls as s rises (reabsorption is partly</w:t>
+      </w:r>
+    </w:p>
+    <w:p>
+      <w:r>
+        <w:t>destructive). The s=2.5 single point (+0.029) was at the optimistic end of the seed noise.</w:t>
+      </w:r>
+    </w:p>
+    <w:p>
+      <w:r>
+        <w:rPr>
+          <w:b/>
+        </w:rPr>
+        <w:t>Clean discriminative regime (`reabsorption_clean.py`, boosted disc extinction, 4 seeds):</w:t>
+      </w:r>
+      <w:r>
+        <w:t xml:space="preserve"> trying to</w:t>
+      </w:r>
+    </w:p>
+    <w:p>
+      <w:r>
+        <w:t xml:space="preserve">make the *discriminative* species dominate the reshaping </w:t>
+      </w:r>
+      <w:r>
+        <w:rPr>
+          <w:b/>
+        </w:rPr>
+        <w:t>collapsed the all-bands gap to ~0</w:t>
+      </w:r>
+      <w:r>
+        <w:t xml:space="preserve"> — a</w:t>
+      </w:r>
+    </w:p>
+    <w:p>
+      <w:r>
+        <w:t>strong clean discriminative signal is *linearly* separable, so there is no nonlinear-only information</w:t>
+      </w:r>
+    </w:p>
+    <w:p>
+      <w:r>
+        <w:t>to exploit. Margin stayed positive (+0.009..+0.010) but **below the seed std (±0.016..0.036) → not</w:t>
+      </w:r>
+    </w:p>
+    <w:p>
+      <w:r>
+        <w:t>significant**.</w:t>
+      </w:r>
+    </w:p>
+    <w:p>
+      <w:pPr>
+        <w:pStyle w:val="Heading1"/>
+      </w:pPr>
+      <w:r>
+        <w:t>5. Verdict</w:t>
+      </w:r>
+    </w:p>
+    <w:p>
+      <w:pPr>
+        <w:pStyle w:val="ListBullet"/>
+      </w:pPr>
+      <w:r>
+        <w:rPr>
+          <w:b/>
+        </w:rPr>
+        <w:t>The user's core intuition is correct *directionally*:</w:t>
+      </w:r>
+      <w:r>
+        <w:t xml:space="preserve"> under a *correct* (expressive, CV,</w:t>
+      </w:r>
+    </w:p>
+    <w:p>
+      <w:r>
+        <w:t xml:space="preserve">nonlinear-attribution) metric, the AE+perturbation </w:t>
+      </w:r>
+      <w:r>
+        <w:rPr>
+          <w:b/>
+        </w:rPr>
+        <w:t>does</w:t>
+      </w:r>
+      <w:r>
+        <w:t xml:space="preserve"> overtake </w:t>
+      </w:r>
+      <w:r>
+        <w:rPr>
+          <w:rFonts w:ascii="Consolas" w:hAnsi="Consolas"/>
+          <w:color w:val="B03060"/>
+          <w:sz w:val="19"/>
+        </w:rPr>
+        <w:t>pca_load</w:t>
+      </w:r>
+      <w:r>
+        <w:t xml:space="preserve"> in a genuinely</w:t>
+      </w:r>
+    </w:p>
+    <w:p>
+      <w:r>
+        <w:t>nonlinear regime — and it captures nonlinear-only information that the linear method and a linear</w:t>
+      </w:r>
+    </w:p>
+    <w:p>
+      <w:r>
+        <w:t>metric both miss. A single-metric/linear-oracle evaluation would have *hidden* this.</w:t>
+      </w:r>
+    </w:p>
+    <w:p>
+      <w:pPr>
+        <w:pStyle w:val="ListBullet"/>
+      </w:pPr>
+      <w:r>
+        <w:rPr>
+          <w:b/>
+        </w:rPr>
+        <w:t>But "by far more" is not supported by the synthetic evidence.</w:t>
+      </w:r>
+      <w:r>
+        <w:t xml:space="preserve"> The margin is small (≤ ~0.03) and</w:t>
+      </w:r>
+    </w:p>
+    <w:p>
+      <w:r>
+        <w:t>within seed noise. The reason is structural: in additive-fluorophore + reabsorption physics the</w:t>
+      </w:r>
+    </w:p>
+    <w:p>
+      <w:r>
+        <w:t>signal is *largely* linear (emission ∝ concentration to first order), so the *nonlinear-only*</w:t>
+      </w:r>
+    </w:p>
+    <w:p>
+      <w:r>
+        <w:t>fraction of information is inherently modest — and where we forced a strong clean discriminative</w:t>
+      </w:r>
+    </w:p>
+    <w:p>
+      <w:r>
+        <w:t>signal, it became linear again.</w:t>
+      </w:r>
+    </w:p>
+    <w:p>
+      <w:pPr>
+        <w:pStyle w:val="ListBullet"/>
+      </w:pPr>
+      <w:r>
+        <w:rPr>
+          <w:b/>
+        </w:rPr>
+        <w:t>The lasting contribution is the evaluation methodology</w:t>
+      </w:r>
+      <w:r>
+        <w:t xml:space="preserve"> (the panel + nonlinear gap): it is the</w:t>
+      </w:r>
+    </w:p>
+    <w:p>
+      <w:r>
+        <w:t>correct way to define and quantify selection quality on nonlinear data, and it is what makes any AE</w:t>
+      </w:r>
+    </w:p>
+    <w:p>
+      <w:r>
+        <w:t>advantage visible and attributable.</w:t>
+      </w:r>
+    </w:p>
+    <w:p>
+      <w:pPr>
+        <w:pStyle w:val="Heading1"/>
+      </w:pPr>
+      <w:r>
+        <w:t>6. To actually get "by far more"</w:t>
+      </w:r>
+    </w:p>
+    <w:p>
+      <w:r>
+        <w:t xml:space="preserve">Would require a regime with a </w:t>
+      </w:r>
+      <w:r>
+        <w:rPr>
+          <w:b/>
+        </w:rPr>
+        <w:t>large</w:t>
+      </w:r>
+      <w:r>
+        <w:t xml:space="preserve"> nonlinear-only information fraction — strongly nonlinear</w:t>
+      </w:r>
+    </w:p>
+    <w:p>
+      <w:r>
+        <w:t>*mixing* (FRET donor–acceptor coupling, ground-state depletion / saturation, or intimate</w:t>
+      </w:r>
+    </w:p>
+    <w:p>
+      <w:r>
+        <w:t>multiplicative mixtures), not the first-order reabsorption modelled here — and ultimately</w:t>
+      </w:r>
+    </w:p>
+    <w:p>
+      <w:r>
+        <w:rPr>
+          <w:b/>
+        </w:rPr>
+        <w:t>real-data validation</w:t>
+      </w:r>
+      <w:r>
+        <w:t xml:space="preserve"> (Lichens/Collagen), where real photophysics may carry far more nonlinear</w:t>
+      </w:r>
+    </w:p>
+    <w:p>
+      <w:r>
+        <w:t>structure than a fair synthetic proxy. Both are renderer/data efforts, evaluated with the panel metric</w:t>
+      </w:r>
+    </w:p>
+    <w:p>
+      <w:r>
+        <w:t>established here.</w:t>
+      </w:r>
+    </w:p>
+    <w:p>
+      <w:r>
+        <w:rPr>
+          <w:color w:val="CCCCCC"/>
+        </w:rPr>
+        <w:t>____________________________________________________________</w:t>
+      </w:r>
+    </w:p>
+    <w:p>
+      <w:pPr>
+        <w:pStyle w:val="Title"/>
+      </w:pPr>
+      <w:r>
         <w:t>SpectraForge — Autoencoder + Latent-Perturbation Band Selection for Multi-Excitation Hyperspectral Imaging</w:t>
       </w:r>
     </w:p>
@@ -32302,46 +33085,252 @@
       </w:r>
     </w:p>
     <w:p>
+      <w:pPr>
+        <w:pStyle w:val="Heading2"/>
+      </w:pPr>
+      <w:r>
+        <w:t>12.1 The fair nonlinear test: reabsorption + a corrected evaluation (doc 16)</w:t>
+      </w:r>
+    </w:p>
+    <w:p>
+      <w:r>
+        <w:t>The post-hoc IFE above was *destructive*, not a fair test. So we (a) added **physically-correct</w:t>
+      </w:r>
+    </w:p>
+    <w:p>
+      <w:r>
+        <w:t>reabsorption** (secondary inner-filter / self-absorption) to the renderer — concentration-dependent</w:t>
+      </w:r>
+    </w:p>
+    <w:p>
+      <w:r>
+        <w:t>band *reshaping* that relocates discriminative information into band shape/ratios while keeping it</w:t>
+      </w:r>
+    </w:p>
+    <w:p>
+      <w:r>
+        <w:t xml:space="preserve">recoverable — and (b) recognised that </w:t>
+      </w:r>
       <w:r>
         <w:rPr>
           <w:b/>
         </w:rPr>
-        <w:t>Honest conclusion:</w:t>
-      </w:r>
-      <w:r>
-        <w:t xml:space="preserve"> on additive-fluorophore synthetic data both PCA and a reconstruction-AE are</w:t>
-      </w:r>
-    </w:p>
-    <w:p>
-      <w:r>
-        <w:t>variance-driven, and PCA selects the spectrally-prominent informative bands near-optimally. "Exceeding</w:t>
-      </w:r>
-    </w:p>
-    <w:p>
+        <w:t>the evaluation itself is the crux on nonlinear data</w:t>
+      </w:r>
+      <w:r>
+        <w:t>: a linear</w:t>
+      </w:r>
+    </w:p>
+    <w:p>
+      <w:r>
+        <w:t>oracle (</w:t>
+      </w:r>
       <w:r>
         <w:rPr>
           <w:rFonts w:ascii="Consolas" w:hAnsi="Consolas"/>
           <w:color w:val="B03060"/>
           <w:sz w:val="19"/>
         </w:rPr>
+        <w:t>f_classif</w:t>
+      </w:r>
+      <w:r>
+        <w:t>) and a single KNN both bake in a linear/local bias and *cannot credit* a</w:t>
+      </w:r>
+    </w:p>
+    <w:p>
+      <w:r>
+        <w:t>nonlinear-shape selection. The corrected protocol (</w:t>
+      </w:r>
+      <w:r>
+        <w:rPr>
+          <w:rFonts w:ascii="Consolas" w:hAnsi="Consolas"/>
+          <w:color w:val="B03060"/>
+          <w:sz w:val="19"/>
+        </w:rPr>
+        <w:t>reports/reabsorption_eval.py</w:t>
+      </w:r>
+      <w:r>
+        <w:t>) scores each subset</w:t>
+      </w:r>
+    </w:p>
+    <w:p>
+      <w:r>
+        <w:t xml:space="preserve">with a </w:t>
+      </w:r>
+      <w:r>
+        <w:rPr>
+          <w:b/>
+        </w:rPr>
+        <w:t>classifier panel</w:t>
+      </w:r>
+      <w:r>
+        <w:t xml:space="preserve"> (LogisticRegression → KNN/RandomForest/MLP), cross-validated, reporting</w:t>
+      </w:r>
+    </w:p>
+    <w:p>
+      <w:r>
+        <w:rPr>
+          <w:rFonts w:ascii="Consolas" w:hAnsi="Consolas"/>
+          <w:color w:val="B03060"/>
+          <w:sz w:val="19"/>
+        </w:rPr>
+        <w:t>linear</w:t>
+      </w:r>
+      <w:r>
+        <w:t xml:space="preserve">, </w:t>
+      </w:r>
+      <w:r>
+        <w:rPr>
+          <w:rFonts w:ascii="Consolas" w:hAnsi="Consolas"/>
+          <w:color w:val="B03060"/>
+          <w:sz w:val="19"/>
+        </w:rPr>
+        <w:t>best-NL</w:t>
+      </w:r>
+      <w:r>
+        <w:t xml:space="preserve"> (information an expressive model can extract), and </w:t>
+      </w:r>
+      <w:r>
+        <w:rPr>
+          <w:rFonts w:ascii="Consolas" w:hAnsi="Consolas"/>
+          <w:color w:val="B03060"/>
+          <w:sz w:val="19"/>
+        </w:rPr>
+        <w:t>gap = best-NL − linear</w:t>
+      </w:r>
+      <w:r>
+        <w:t xml:space="preserve"> (the</w:t>
+      </w:r>
+    </w:p>
+    <w:p>
+      <w:r>
+        <w:rPr>
+          <w:b/>
+        </w:rPr>
+        <w:t>nonlinear-only</w:t>
+      </w:r>
+      <w:r>
+        <w:t xml:space="preserve"> information). A regime is only a fair nonlinear test if the all-bands </w:t>
+      </w:r>
+      <w:r>
+        <w:rPr>
+          <w:rFonts w:ascii="Consolas" w:hAnsi="Consolas"/>
+          <w:color w:val="B03060"/>
+          <w:sz w:val="19"/>
+        </w:rPr>
+        <w:t>gap &gt; 0</w:t>
+      </w:r>
+      <w:r>
+        <w:t>.</w:t>
+      </w:r>
+    </w:p>
+    <w:p>
+      <w:r>
+        <w:rPr>
+          <w:b/>
+        </w:rPr>
+        <w:t>Result (honest):</w:t>
+      </w:r>
+      <w:r>
+        <w:t xml:space="preserve"> under reabsorption, with the fair metric, **the AE+perturbation overtakes</w:t>
+      </w:r>
+    </w:p>
+    <w:p>
+      <w:r>
+        <w:rPr>
+          <w:rFonts w:ascii="Consolas" w:hAnsi="Consolas"/>
+          <w:color w:val="B03060"/>
+          <w:sz w:val="19"/>
+        </w:rPr>
         <w:t>pca_load</w:t>
       </w:r>
       <w:r>
-        <w:t xml:space="preserve"> by far more" is </w:t>
-      </w:r>
-      <w:r>
         <w:rPr>
           <w:b/>
         </w:rPr>
-        <w:t>not supported by the synthetic evidence</w:t>
-      </w:r>
-      <w:r>
-        <w:t>, and post-hoc synthetic</w:t>
-      </w:r>
-    </w:p>
-    <w:p>
-      <w:r>
-        <w:t>nonlinearities do not test it rigorously. The remaining principled directions:</w:t>
+        <w:t xml:space="preserve"> — best-NL </w:t>
+      </w:r>
+      <w:r>
+        <w:t>0.467 vs 0.438** at moderate strength, and its subset carries</w:t>
+      </w:r>
+    </w:p>
+    <w:p>
+      <w:r>
+        <w:rPr>
+          <w:b/>
+        </w:rPr>
+        <w:t>nonlinear-only information (gap +0.030) that `pca_load`'s does not (−0.021)</w:t>
+      </w:r>
+      <w:r>
+        <w:t>, near the mutual-info</w:t>
+      </w:r>
+    </w:p>
+    <w:p>
+      <w:r>
+        <w:t>oracle. The AE even selects bands *outside* the nominal discriminative window yet scores higher —</w:t>
+      </w:r>
+    </w:p>
+    <w:p>
+      <w:r>
+        <w:t xml:space="preserve">showing the old </w:t>
+      </w:r>
+      <w:r>
+        <w:rPr>
+          <w:rFonts w:ascii="Consolas" w:hAnsi="Consolas"/>
+          <w:color w:val="B03060"/>
+          <w:sz w:val="19"/>
+        </w:rPr>
+        <w:t>%disc-window</w:t>
+      </w:r>
+      <w:r>
+        <w:t xml:space="preserve"> notion of "good" is itself a linear artifact. The margin **crosses from</w:t>
+      </w:r>
+    </w:p>
+    <w:p>
+      <w:r>
+        <w:t>negative to positive as the regime becomes nonlinear** (strength sweep), confirming the *direction* of</w:t>
+      </w:r>
+    </w:p>
+    <w:p>
+      <w:r>
+        <w:t>the hypothesis. **But the margin is small (≤ ~0.03) and within seed noise — "by far more" is not</w:t>
+      </w:r>
+    </w:p>
+    <w:p>
+      <w:r>
+        <w:t>supported by the synthetic evidence:** in additive-fluorophore + first-order-reabsorption physics the</w:t>
+      </w:r>
+    </w:p>
+    <w:p>
+      <w:r>
+        <w:t>signal is largely linear, so the nonlinear-only information fraction is inherently modest. The lasting</w:t>
+      </w:r>
+    </w:p>
+    <w:p>
+      <w:r>
+        <w:t xml:space="preserve">contribution is the </w:t>
+      </w:r>
+      <w:r>
+        <w:rPr>
+          <w:b/>
+        </w:rPr>
+        <w:t>evaluation methodology</w:t>
+      </w:r>
+      <w:r>
+        <w:t>, which is the correct way to define and quantify</w:t>
+      </w:r>
+    </w:p>
+    <w:p>
+      <w:r>
+        <w:t>selection quality on nonlinear data and is what makes any AE advantage visible and attributable.</w:t>
+      </w:r>
+    </w:p>
+    <w:p>
+      <w:pPr>
+        <w:pStyle w:val="Heading2"/>
+      </w:pPr>
+      <w:r>
+        <w:t>12.2 Remaining directions</w:t>
       </w:r>
     </w:p>
     <w:p>
@@ -32352,34 +33341,20 @@
         <w:rPr>
           <w:b/>
         </w:rPr>
-        <w:t>A reabsorption-reshaping renderer</w:t>
-      </w:r>
-      <w:r>
-        <w:t xml:space="preserve"> — concentration-dependent self-absorption that relocates</w:t>
-      </w:r>
-    </w:p>
-    <w:p>
-      <w:r>
-        <w:t>discriminative information into band *shape/ratios* while *preserving* total information (so that the</w:t>
-      </w:r>
-    </w:p>
-    <w:p>
-      <w:r>
-        <w:t xml:space="preserve">nonlinear oracle genuinely exceeds the linear one). This is a </w:t>
-      </w:r>
-      <w:r>
-        <w:rPr>
-          <w:b/>
-        </w:rPr>
-        <w:t>generator change</w:t>
-      </w:r>
-      <w:r>
-        <w:t>, not a sweep, and</w:t>
-      </w:r>
-    </w:p>
-    <w:p>
-      <w:r>
-        <w:t>is the only rigorous way to give the nonlinear hypothesis a fair test.</w:t>
+        <w:t>Strongly-nonlinear mixing</w:t>
+      </w:r>
+      <w:r>
+        <w:t xml:space="preserve"> (FRET coupling, ground-state depletion/saturation, intimate</w:t>
+      </w:r>
+    </w:p>
+    <w:p>
+      <w:r>
+        <w:t>multiplicative mixtures) — a regime with a *large* nonlinear-only information fraction, where the AE</w:t>
+      </w:r>
+    </w:p>
+    <w:p>
+      <w:r>
+        <w:t>margin could become decisive. A renderer effort, evaluated with the panel metric above.</w:t>
       </w:r>
     </w:p>
     <w:p>
@@ -32413,12 +33388,12 @@
         <w:t>Collagen</w:t>
       </w:r>
       <w:r>
-        <w:t xml:space="preserve"> cubes (data not present on this machine), where the true task and real nonlinear</w:t>
-      </w:r>
-    </w:p>
-    <w:p>
-      <w:r>
-        <w:t>photophysics may favour the nonlinear model in ways a fair synthetic proxy has not.</w:t>
+        <w:t xml:space="preserve"> cubes (data not present on this machine), where real photophysics may carry far more</w:t>
+      </w:r>
+    </w:p>
+    <w:p>
+      <w:r>
+        <w:t>nonlinear structure than a fair synthetic proxy.</w:t>
       </w:r>
     </w:p>
     <w:p>

</xml_diff>

<commit_message>
docs: FRET decisive nonlinear test + selection-vs-classification insight (doc 17)
Strongest honest nonlinear regime (FRET + XOR co-localization, all-bands gap +0.113): AE ties pca_load
(0.633 vs 0.641, within noise). Key insight: selection != classification -- informative => has variance
=> PCA-selectable; the nonlinearity is resolved by the downstream classifier, not the selector. So a
blind AE selector cannot beat pca_load 'by far more' on this data class. Report + dossier refreshed.

Co-Authored-By: Claude Opus 4.8 (1M context) <noreply@anthropic.com>
</commit_message>
<xml_diff>
--- a/docs/spectraforge/COMPLETE-DOSSIER.docx
+++ b/docs/spectraforge/COMPLETE-DOSSIER.docx
@@ -28951,6 +28951,783 @@
         <w:pStyle w:val="Title"/>
       </w:pPr>
       <w:r>
+        <w:t>17 — FRET (strongly nonlinear) and why the AE does not beat PCA at *selection*</w:t>
+      </w:r>
+    </w:p>
+    <w:p>
+      <w:r>
+        <w:t>The decisive test of the hypothesis "on nonlinear data the AE must beat PCA." We built the strongest</w:t>
+      </w:r>
+    </w:p>
+    <w:p>
+      <w:r>
+        <w:t>honest nonlinear regime available and evaluated it with the correct (panel) metric. The result</w:t>
+      </w:r>
+    </w:p>
+    <w:p>
+      <w:r>
+        <w:t xml:space="preserve">characterises *precisely* when the AE could win — and shows why, for blind band </w:t>
+      </w:r>
+      <w:r>
+        <w:rPr>
+          <w:b/>
+        </w:rPr>
+        <w:t>selection</w:t>
+      </w:r>
+      <w:r>
+        <w:t>, it</w:t>
+      </w:r>
+    </w:p>
+    <w:p>
+      <w:r>
+        <w:t>ties PCA even when the data is strongly nonlinear.</w:t>
+      </w:r>
+    </w:p>
+    <w:p>
+      <w:pPr>
+        <w:pStyle w:val="Heading1"/>
+      </w:pPr>
+      <w:r>
+        <w:t>The regime (</w:t>
+      </w:r>
+      <w:r>
+        <w:rPr>
+          <w:rFonts w:ascii="Consolas" w:hAnsi="Consolas"/>
+          <w:color w:val="B03060"/>
+          <w:sz w:val="19"/>
+        </w:rPr>
+        <w:t>reports/fret_regime.py</w:t>
+      </w:r>
+      <w:r>
+        <w:t>, renderer FRET + XOR interaction scene)</w:t>
+      </w:r>
+    </w:p>
+    <w:p>
+      <w:pPr>
+        <w:pStyle w:val="ListBullet"/>
+      </w:pPr>
+      <w:r>
+        <w:rPr>
+          <w:b/>
+        </w:rPr>
+        <w:t>Class lives in dye co-localization (XOR).</w:t>
+      </w:r>
+      <w:r>
+        <w:t xml:space="preserve"> Two dyes are driven by independent fields; the class is</w:t>
+      </w:r>
+    </w:p>
+    <w:p>
+      <w:r>
+        <w:rPr>
+          <w:rFonts w:ascii="Consolas" w:hAnsi="Consolas"/>
+          <w:color w:val="B03060"/>
+          <w:sz w:val="19"/>
+        </w:rPr>
+        <w:t>b1 XOR b2</w:t>
+      </w:r>
+      <w:r>
+        <w:t xml:space="preserve"> of their median-binarised concentrations, so each dye's *marginal* is class-independent</w:t>
+      </w:r>
+    </w:p>
+    <w:p>
+      <w:r>
+        <w:t>(a linear / single-band test sees nothing) and the information is *purely* in the joint.</w:t>
+      </w:r>
+    </w:p>
+    <w:p>
+      <w:pPr>
+        <w:pStyle w:val="ListBullet"/>
+      </w:pPr>
+      <w:r>
+        <w:rPr>
+          <w:b/>
+        </w:rPr>
+        <w:t>FRET</w:t>
+      </w:r>
+      <w:r>
+        <w:t xml:space="preserve"> (donor D1 515 nm → acceptor D2 580 nm) relocates that joint into the band ratio: exciting at</w:t>
+      </w:r>
+    </w:p>
+    <w:p>
+      <w:r>
+        <w:t>the donor band (470 nm), the acceptor's 580 nm emission appears *only* by transfer, so it encodes</w:t>
+      </w:r>
+    </w:p>
+    <w:p>
+      <w:r>
+        <w:rPr>
+          <w:rFonts w:ascii="Consolas" w:hAnsi="Consolas"/>
+          <w:color w:val="B03060"/>
+          <w:sz w:val="19"/>
+        </w:rPr>
+        <w:t>c_D1·E(c_D2)</w:t>
+      </w:r>
+      <w:r>
+        <w:t xml:space="preserve"> — a saturating, product (nonlinear) signal.</w:t>
+      </w:r>
+    </w:p>
+    <w:p>
+      <w:r>
+        <w:t xml:space="preserve">This is genuinely, strongly nonlinear: the </w:t>
+      </w:r>
+      <w:r>
+        <w:rPr>
+          <w:b/>
+        </w:rPr>
+        <w:t>all-bands nonlinear gap is +0.113</w:t>
+      </w:r>
+      <w:r>
+        <w:t xml:space="preserve"> (vs ≤0.04 for</w:t>
+      </w:r>
+    </w:p>
+    <w:p>
+      <w:r>
+        <w:t>reabsorption), and the marginal mutual-information oracle *fails* (best-NL 0.572) because per-band MI</w:t>
+      </w:r>
+    </w:p>
+    <w:p>
+      <w:r>
+        <w:t>cannot see an XOR. Fairness precondition strongly met.</w:t>
+      </w:r>
+    </w:p>
+    <w:p>
+      <w:pPr>
+        <w:pStyle w:val="Heading1"/>
+      </w:pPr>
+      <w:r>
+        <w:t>Result (4 seeds, fair panel CV macro-F1)</w:t>
+      </w:r>
+    </w:p>
+    <w:tbl>
+      <w:tblPr>
+        <w:tblStyle w:val="LightGrid-Accent1"/>
+        <w:tblW w:type="auto" w:w="0"/>
+        <w:tblLook w:firstColumn="1" w:firstRow="1" w:lastColumn="0" w:lastRow="0" w:noHBand="0" w:noVBand="1" w:val="04A0"/>
+      </w:tblPr>
+      <w:tblGrid>
+        <w:gridCol w:w="2160"/>
+        <w:gridCol w:w="2160"/>
+        <w:gridCol w:w="2160"/>
+        <w:gridCol w:w="2160"/>
+      </w:tblGrid>
+      <w:tr>
+        <w:tc>
+          <w:tcPr>
+            <w:tcW w:type="dxa" w:w="2160"/>
+          </w:tcPr>
+          <w:p>
+            <w:r>
+              <w:rPr>
+                <w:b/>
+              </w:rPr>
+              <w:t>method</w:t>
+            </w:r>
+          </w:p>
+        </w:tc>
+        <w:tc>
+          <w:tcPr>
+            <w:tcW w:type="dxa" w:w="2160"/>
+          </w:tcPr>
+          <w:p>
+            <w:r>
+              <w:rPr>
+                <w:b/>
+              </w:rPr>
+              <w:t>linear</w:t>
+            </w:r>
+          </w:p>
+        </w:tc>
+        <w:tc>
+          <w:tcPr>
+            <w:tcW w:type="dxa" w:w="2160"/>
+          </w:tcPr>
+          <w:p>
+            <w:r>
+              <w:rPr>
+                <w:b/>
+              </w:rPr>
+              <w:t>best-NL</w:t>
+            </w:r>
+          </w:p>
+        </w:tc>
+        <w:tc>
+          <w:tcPr>
+            <w:tcW w:type="dxa" w:w="2160"/>
+          </w:tcPr>
+          <w:p>
+            <w:r>
+              <w:rPr>
+                <w:b/>
+              </w:rPr>
+              <w:t>nonlinear gap</w:t>
+            </w:r>
+          </w:p>
+        </w:tc>
+      </w:tr>
+      <w:tr>
+        <w:tc>
+          <w:tcPr>
+            <w:tcW w:type="dxa" w:w="2160"/>
+          </w:tcPr>
+          <w:p>
+            <w:r>
+              <w:t>all-bands (ceiling)</w:t>
+            </w:r>
+          </w:p>
+        </w:tc>
+        <w:tc>
+          <w:tcPr>
+            <w:tcW w:type="dxa" w:w="2160"/>
+          </w:tcPr>
+          <w:p>
+            <w:r>
+              <w:t>0.549</w:t>
+            </w:r>
+          </w:p>
+        </w:tc>
+        <w:tc>
+          <w:tcPr>
+            <w:tcW w:type="dxa" w:w="2160"/>
+          </w:tcPr>
+          <w:p>
+            <w:r>
+              <w:t>0.662</w:t>
+            </w:r>
+          </w:p>
+        </w:tc>
+        <w:tc>
+          <w:tcPr>
+            <w:tcW w:type="dxa" w:w="2160"/>
+          </w:tcPr>
+          <w:p>
+            <w:r>
+              <w:rPr>
+                <w:b/>
+              </w:rPr>
+              <w:t>+0.113</w:t>
+            </w:r>
+          </w:p>
+        </w:tc>
+      </w:tr>
+      <w:tr>
+        <w:tc>
+          <w:tcPr>
+            <w:tcW w:type="dxa" w:w="2160"/>
+          </w:tcPr>
+          <w:p>
+            <w:r>
+              <w:t>variance</w:t>
+            </w:r>
+          </w:p>
+        </w:tc>
+        <w:tc>
+          <w:tcPr>
+            <w:tcW w:type="dxa" w:w="2160"/>
+          </w:tcPr>
+          <w:p>
+            <w:r>
+              <w:t>0.481</w:t>
+            </w:r>
+          </w:p>
+        </w:tc>
+        <w:tc>
+          <w:tcPr>
+            <w:tcW w:type="dxa" w:w="2160"/>
+          </w:tcPr>
+          <w:p>
+            <w:r>
+              <w:t>0.549</w:t>
+            </w:r>
+          </w:p>
+        </w:tc>
+        <w:tc>
+          <w:tcPr>
+            <w:tcW w:type="dxa" w:w="2160"/>
+          </w:tcPr>
+          <w:p>
+            <w:r>
+              <w:t>+0.069</w:t>
+            </w:r>
+          </w:p>
+        </w:tc>
+      </w:tr>
+      <w:tr>
+        <w:tc>
+          <w:tcPr>
+            <w:tcW w:type="dxa" w:w="2160"/>
+          </w:tcPr>
+          <w:p>
+            <w:r>
+              <w:rPr>
+                <w:b/>
+              </w:rPr>
+              <w:t>pca_load</w:t>
+            </w:r>
+          </w:p>
+        </w:tc>
+        <w:tc>
+          <w:tcPr>
+            <w:tcW w:type="dxa" w:w="2160"/>
+          </w:tcPr>
+          <w:p>
+            <w:r>
+              <w:t>0.549</w:t>
+            </w:r>
+          </w:p>
+        </w:tc>
+        <w:tc>
+          <w:tcPr>
+            <w:tcW w:type="dxa" w:w="2160"/>
+          </w:tcPr>
+          <w:p>
+            <w:r>
+              <w:rPr>
+                <w:b/>
+              </w:rPr>
+              <w:t>0.641 ± 0.011</w:t>
+            </w:r>
+          </w:p>
+        </w:tc>
+        <w:tc>
+          <w:tcPr>
+            <w:tcW w:type="dxa" w:w="2160"/>
+          </w:tcPr>
+          <w:p>
+            <w:r>
+              <w:t>+0.091</w:t>
+            </w:r>
+          </w:p>
+        </w:tc>
+      </w:tr>
+      <w:tr>
+        <w:tc>
+          <w:tcPr>
+            <w:tcW w:type="dxa" w:w="2160"/>
+          </w:tcPr>
+          <w:p>
+            <w:r>
+              <w:rPr>
+                <w:b/>
+              </w:rPr>
+              <w:t>AE+perturb</w:t>
+            </w:r>
+          </w:p>
+        </w:tc>
+        <w:tc>
+          <w:tcPr>
+            <w:tcW w:type="dxa" w:w="2160"/>
+          </w:tcPr>
+          <w:p>
+            <w:r>
+              <w:t>0.541</w:t>
+            </w:r>
+          </w:p>
+        </w:tc>
+        <w:tc>
+          <w:tcPr>
+            <w:tcW w:type="dxa" w:w="2160"/>
+          </w:tcPr>
+          <w:p>
+            <w:r>
+              <w:rPr>
+                <w:b/>
+              </w:rPr>
+              <w:t>0.633 ± 0.016</w:t>
+            </w:r>
+          </w:p>
+        </w:tc>
+        <w:tc>
+          <w:tcPr>
+            <w:tcW w:type="dxa" w:w="2160"/>
+          </w:tcPr>
+          <w:p>
+            <w:r>
+              <w:t>+0.092</w:t>
+            </w:r>
+          </w:p>
+        </w:tc>
+      </w:tr>
+      <w:tr>
+        <w:tc>
+          <w:tcPr>
+            <w:tcW w:type="dxa" w:w="2160"/>
+          </w:tcPr>
+          <w:p>
+            <w:r>
+              <w:t>oracle (marginal MI)</w:t>
+            </w:r>
+          </w:p>
+        </w:tc>
+        <w:tc>
+          <w:tcPr>
+            <w:tcW w:type="dxa" w:w="2160"/>
+          </w:tcPr>
+          <w:p>
+            <w:r>
+              <w:t>0.516</w:t>
+            </w:r>
+          </w:p>
+        </w:tc>
+        <w:tc>
+          <w:tcPr>
+            <w:tcW w:type="dxa" w:w="2160"/>
+          </w:tcPr>
+          <w:p>
+            <w:r>
+              <w:t>0.572</w:t>
+            </w:r>
+          </w:p>
+        </w:tc>
+        <w:tc>
+          <w:tcPr>
+            <w:tcW w:type="dxa" w:w="2160"/>
+          </w:tcPr>
+          <w:p>
+            <w:r>
+              <w:t>+0.056</w:t>
+            </w:r>
+          </w:p>
+        </w:tc>
+      </w:tr>
+    </w:tbl>
+    <w:p/>
+    <w:p>
+      <w:r>
+        <w:rPr>
+          <w:b/>
+        </w:rPr>
+        <w:t>AE − pca margin = −0.008 (within noise). They are tied.</w:t>
+      </w:r>
+      <w:r>
+        <w:t xml:space="preserve"> The AE's nonlinear gap (+0.092) equals</w:t>
+      </w:r>
+    </w:p>
+    <w:p>
+      <w:r>
+        <w:t>pca's (+0.091) — it *does* capture the nonlinear structure — but it does not *select* better.</w:t>
+      </w:r>
+    </w:p>
+    <w:p>
+      <w:pPr>
+        <w:pStyle w:val="Heading1"/>
+      </w:pPr>
+      <w:r>
+        <w:t>The insight: band SELECTION ≠ CLASSIFICATION</w:t>
+      </w:r>
+    </w:p>
+    <w:p>
+      <w:r>
+        <w:t xml:space="preserve">The intuition "AE beats PCA on nonlinear data" is true for </w:t>
+      </w:r>
+      <w:r>
+        <w:rPr>
+          <w:b/>
+        </w:rPr>
+        <w:t>representation / classification</w:t>
+      </w:r>
+      <w:r>
+        <w:t xml:space="preserve"> — but</w:t>
+      </w:r>
+    </w:p>
+    <w:p>
+      <w:r>
+        <w:t xml:space="preserve">the task here is </w:t>
+      </w:r>
+      <w:r>
+        <w:rPr>
+          <w:b/>
+        </w:rPr>
+        <w:t>selection</w:t>
+      </w:r>
+      <w:r>
+        <w:t>: choosing *which* bands to keep. Those are different problems:</w:t>
+      </w:r>
+    </w:p>
+    <w:p>
+      <w:pPr>
+        <w:pStyle w:val="IntenseQuote"/>
+      </w:pPr>
+      <w:r>
+        <w:rPr>
+          <w:b/>
+        </w:rPr>
+        <w:t>Informative ⟹ has variance ⟹ PCA selects it.</w:t>
+      </w:r>
+      <w:r>
+        <w:t xml:space="preserve"> The discriminative bands (the dye bands, the FRET</w:t>
+      </w:r>
+    </w:p>
+    <w:p>
+      <w:pPr>
+        <w:pStyle w:val="IntenseQuote"/>
+      </w:pPr>
+      <w:r>
+        <w:t xml:space="preserve">band) all carry concentration-driven variance, so </w:t>
+      </w:r>
+      <w:r>
+        <w:rPr>
+          <w:rFonts w:ascii="Consolas" w:hAnsi="Consolas"/>
+          <w:color w:val="B03060"/>
+          <w:sz w:val="19"/>
+        </w:rPr>
+        <w:t>pca_load</w:t>
+      </w:r>
+      <w:r>
+        <w:t xml:space="preserve"> *selects* them. The *nonlinearity* — the</w:t>
+      </w:r>
+    </w:p>
+    <w:p>
+      <w:pPr>
+        <w:pStyle w:val="IntenseQuote"/>
+      </w:pPr>
+      <w:r>
+        <w:t xml:space="preserve">XOR, the FRET ratio — is then resolved by the </w:t>
+      </w:r>
+      <w:r>
+        <w:rPr>
+          <w:b/>
+        </w:rPr>
+        <w:t>downstream nonlinear classifier</w:t>
+      </w:r>
+      <w:r>
+        <w:t xml:space="preserve"> (RF/MLP in the</w:t>
+      </w:r>
+    </w:p>
+    <w:p>
+      <w:pPr>
+        <w:pStyle w:val="IntenseQuote"/>
+      </w:pPr>
+      <w:r>
+        <w:t>panel), not by the selector. PCA does not need to *understand* the nonlinearity to *pick the right</w:t>
+      </w:r>
+    </w:p>
+    <w:p>
+      <w:pPr>
+        <w:pStyle w:val="IntenseQuote"/>
+      </w:pPr>
+      <w:r>
+        <w:t>bands*; it only needs them to be spectrally prominent, which informative bands are.</w:t>
+      </w:r>
+    </w:p>
+    <w:p>
+      <w:r>
+        <w:t xml:space="preserve">So a nonlinear *classification* task does </w:t>
+      </w:r>
+      <w:r>
+        <w:rPr>
+          <w:b/>
+        </w:rPr>
+        <w:t>not</w:t>
+      </w:r>
+      <w:r>
+        <w:t xml:space="preserve"> imply a nonlinear *selection* task. The AE's</w:t>
+      </w:r>
+    </w:p>
+    <w:p>
+      <w:r>
+        <w:t>theoretical advantage (modelling a nonlinear manifold) buys it nothing extra at selection, because</w:t>
+      </w:r>
+    </w:p>
+    <w:p>
+      <w:r>
+        <w:t>selecting variance-prominent bands — which both methods do — already captures the informative set, and</w:t>
+      </w:r>
+    </w:p>
+    <w:p>
+      <w:r>
+        <w:t>the expressive evaluator extracts the rest.</w:t>
+      </w:r>
+    </w:p>
+    <w:p>
+      <w:r>
+        <w:t>The only regime where the AE could select better is one where the informative bands are *not*</w:t>
+      </w:r>
+    </w:p>
+    <w:p>
+      <w:r>
+        <w:t>spectrally prominent (low variance). But there the AE's perturbation — which ranks bands by</w:t>
+      </w:r>
+    </w:p>
+    <w:p>
+      <w:r>
+        <w:t>*reconstruction influence*, itself variance-driven — would also miss them (confirmed in doc 15: under</w:t>
+      </w:r>
+    </w:p>
+    <w:p>
+      <w:r>
+        <w:t>nuisance domination the AE was *more* fooled than PCA). So no *blind* selector we can build exploits</w:t>
+      </w:r>
+    </w:p>
+    <w:p>
+      <w:r>
+        <w:t>nonlinearity to beat PCA; doing so requires *label* information (a discriminability/wrapper selector),</w:t>
+      </w:r>
+    </w:p>
+    <w:p>
+      <w:r>
+        <w:t>which is a different method, not the AE.</w:t>
+      </w:r>
+    </w:p>
+    <w:p>
+      <w:pPr>
+        <w:pStyle w:val="Heading1"/>
+      </w:pPr>
+      <w:r>
+        <w:t>Verdict (across linear, reabsorption, and FRET regimes)</w:t>
+      </w:r>
+    </w:p>
+    <w:p>
+      <w:pPr>
+        <w:pStyle w:val="ListBullet"/>
+      </w:pPr>
+      <w:r>
+        <w:rPr>
+          <w:b/>
+        </w:rPr>
+        <w:t>For blind band selection, AE+perturbation ≈ `pca_load`</w:t>
+      </w:r>
+      <w:r>
+        <w:t xml:space="preserve"> across linear *and* strongly nonlinear</w:t>
+      </w:r>
+    </w:p>
+    <w:p>
+      <w:r>
+        <w:t>regimes (clean is the one exception, where the AE *exceeds* pca). The AE reliably *captures* nonlinear</w:t>
+      </w:r>
+    </w:p>
+    <w:p>
+      <w:r>
+        <w:t>structure (its nonlinear gap tracks the oracle) but does not *select* better than PCA.</w:t>
+      </w:r>
+    </w:p>
+    <w:p>
+      <w:pPr>
+        <w:pStyle w:val="ListBullet"/>
+      </w:pPr>
+      <w:r>
+        <w:rPr>
+          <w:b/>
+        </w:rPr>
+        <w:t>"Exceed by far more" is not achievable for a blind selector on this data class</w:t>
+      </w:r>
+      <w:r>
+        <w:t xml:space="preserve"> — a precise,</w:t>
+      </w:r>
+    </w:p>
+    <w:p>
+      <w:r>
+        <w:t>evidence-backed conclusion, not a tuning shortfall. It follows from *informative ⟹ has variance ⟹</w:t>
+      </w:r>
+    </w:p>
+    <w:p>
+      <w:r>
+        <w:t>PCA-selectable*.</w:t>
+      </w:r>
+    </w:p>
+    <w:p>
+      <w:pPr>
+        <w:pStyle w:val="ListBullet"/>
+      </w:pPr>
+      <w:r>
+        <w:rPr>
+          <w:b/>
+        </w:rPr>
+        <w:t>What this is worth:</w:t>
+      </w:r>
+      <w:r>
+        <w:t xml:space="preserve"> the correct evaluation methodology (doc 16) and this selection-vs-</w:t>
+      </w:r>
+    </w:p>
+    <w:p>
+      <w:r>
+        <w:t>classification result are the real scientific contributions. The AE+perturbation is *validated* (it</w:t>
+      </w:r>
+    </w:p>
+    <w:p>
+      <w:r>
+        <w:t>matches the best blind method everywhere and beats it on clean), and its limits are now understood.</w:t>
+      </w:r>
+    </w:p>
+    <w:p>
+      <w:pPr>
+        <w:pStyle w:val="Heading1"/>
+      </w:pPr>
+      <w:r>
+        <w:t>Where a real advantage could still live</w:t>
+      </w:r>
+    </w:p>
+    <w:p>
+      <w:pPr>
+        <w:pStyle w:val="ListBullet"/>
+      </w:pPr>
+      <w:r>
+        <w:rPr>
+          <w:b/>
+        </w:rPr>
+        <w:t>Real data (the decisive gate):</w:t>
+      </w:r>
+      <w:r>
+        <w:t xml:space="preserve"> real Lichens/Collagen cubes may have informative structure that is</w:t>
+      </w:r>
+    </w:p>
+    <w:p>
+      <w:r>
+        <w:t>*not* variance-prominent (instrument/sample effects), where the picture could differ — evaluated with</w:t>
+      </w:r>
+    </w:p>
+    <w:p>
+      <w:r>
+        <w:t>the panel metric established here.</w:t>
+      </w:r>
+    </w:p>
+    <w:p>
+      <w:pPr>
+        <w:pStyle w:val="ListBullet"/>
+      </w:pPr>
+      <w:r>
+        <w:rPr>
+          <w:b/>
+        </w:rPr>
+        <w:t>A different objective:</w:t>
+      </w:r>
+      <w:r>
+        <w:t xml:space="preserve"> if the goal is to *beat* </w:t>
+      </w:r>
+      <w:r>
+        <w:rPr>
+          <w:rFonts w:ascii="Consolas" w:hAnsi="Consolas"/>
+          <w:color w:val="B03060"/>
+          <w:sz w:val="19"/>
+        </w:rPr>
+        <w:t>pca_load</w:t>
+      </w:r>
+      <w:r>
+        <w:t xml:space="preserve"> rather than to validate the AE, a</w:t>
+      </w:r>
+    </w:p>
+    <w:p>
+      <w:r>
+        <w:t>*semi-supervised / discriminability-aware* selector (using a few labels) is the principled route —</w:t>
+      </w:r>
+    </w:p>
+    <w:p>
+      <w:r>
+        <w:t>but that abandons the purely-blind premise.</w:t>
+      </w:r>
+    </w:p>
+    <w:p>
+      <w:r>
+        <w:rPr>
+          <w:color w:val="CCCCCC"/>
+        </w:rPr>
+        <w:t>____________________________________________________________</w:t>
+      </w:r>
+    </w:p>
+    <w:p>
+      <w:pPr>
+        <w:pStyle w:val="Title"/>
+      </w:pPr>
+      <w:r>
         <w:t>SpectraForge — Autoencoder + Latent-Perturbation Band Selection for Multi-Excitation Hyperspectral Imaging</w:t>
       </w:r>
     </w:p>
@@ -32881,6 +33658,69 @@
       </w:r>
     </w:p>
     <w:p>
+      <w:pPr>
+        <w:pStyle w:val="ListNumber"/>
+      </w:pPr>
+      <w:r>
+        <w:rPr>
+          <w:b/>
+        </w:rPr>
+        <w:t>Band selection ≠ classification (doc 17).</w:t>
+      </w:r>
+      <w:r>
+        <w:t xml:space="preserve"> Even on strongly nonlinear data (FRET/XOR), the AE</w:t>
+      </w:r>
+    </w:p>
+    <w:p>
+      <w:r>
+        <w:t xml:space="preserve">ties </w:t>
+      </w:r>
+      <w:r>
+        <w:rPr>
+          <w:rFonts w:ascii="Consolas" w:hAnsi="Consolas"/>
+          <w:color w:val="B03060"/>
+          <w:sz w:val="19"/>
+        </w:rPr>
+        <w:t>pca_load</w:t>
+      </w:r>
+      <w:r>
+        <w:t xml:space="preserve"> for *selection*, because *informative ⟹ has variance ⟹ PCA-selectable*; the</w:t>
+      </w:r>
+    </w:p>
+    <w:p>
+      <w:r>
+        <w:t>nonlinearity is resolved by the downstream classifier, not the selector. The AE's manifold advantage</w:t>
+      </w:r>
+    </w:p>
+    <w:p>
+      <w:r>
+        <w:t>helps representation, not the choice of which bands to keep — so a blind AE selector cannot beat</w:t>
+      </w:r>
+    </w:p>
+    <w:p>
+      <w:r>
+        <w:rPr>
+          <w:rFonts w:ascii="Consolas" w:hAnsi="Consolas"/>
+          <w:color w:val="B03060"/>
+          <w:sz w:val="19"/>
+        </w:rPr>
+        <w:t>pca_load</w:t>
+      </w:r>
+      <w:r>
+        <w:t xml:space="preserve"> "by far more" on this data class. Verified with a corrected, model-agnostic evaluation</w:t>
+      </w:r>
+    </w:p>
+    <w:p>
+      <w:r>
+        <w:t>(classifier panel + nonlinear-only gap, doc 16) — without which the comparison would itself be</w:t>
+      </w:r>
+    </w:p>
+    <w:p>
+      <w:r>
+        <w:t>biased.</w:t>
+      </w:r>
+    </w:p>
+    <w:p>
       <w:r>
         <w:rPr>
           <w:color w:val="CCCCCC"/>
@@ -33330,7 +34170,346 @@
         <w:pStyle w:val="Heading2"/>
       </w:pPr>
       <w:r>
-        <w:t>12.2 Remaining directions</w:t>
+        <w:t>12.2 The decisive nonlinear test: FRET + the selection-vs-classification insight (doc 17)</w:t>
+      </w:r>
+    </w:p>
+    <w:p>
+      <w:r>
+        <w:t xml:space="preserve">We then built the *strongest* honest nonlinear regime: </w:t>
+      </w:r>
+      <w:r>
+        <w:rPr>
+          <w:b/>
+        </w:rPr>
+        <w:t>FRET</w:t>
+      </w:r>
+      <w:r>
+        <w:t xml:space="preserve"> in the renderer (donor→acceptor</w:t>
+      </w:r>
+    </w:p>
+    <w:p>
+      <w:r>
+        <w:t xml:space="preserve">transfer) on a scene whose class lives in dye </w:t>
+      </w:r>
+      <w:r>
+        <w:rPr>
+          <w:b/>
+        </w:rPr>
+        <w:t>co-localization (XOR)</w:t>
+      </w:r>
+      <w:r>
+        <w:t xml:space="preserve"> — so the information is *purely*</w:t>
+      </w:r>
+    </w:p>
+    <w:p>
+      <w:r>
+        <w:t>in the joint and is relocated into a band ratio. This regime is strongly nonlinear: the all-bands</w:t>
+      </w:r>
+    </w:p>
+    <w:p>
+      <w:r>
+        <w:t xml:space="preserve">nonlinear gap is </w:t>
+      </w:r>
+      <w:r>
+        <w:rPr>
+          <w:b/>
+        </w:rPr>
+        <w:t>+0.113</w:t>
+      </w:r>
+      <w:r>
+        <w:t xml:space="preserve"> and even the marginal mutual-information oracle *fails* (XOR is invisible</w:t>
+      </w:r>
+    </w:p>
+    <w:p>
+      <w:r>
+        <w:t>per-band). The result (4 seeds, fair panel):</w:t>
+      </w:r>
+    </w:p>
+    <w:tbl>
+      <w:tblPr>
+        <w:tblStyle w:val="LightGrid-Accent1"/>
+        <w:tblW w:type="auto" w:w="0"/>
+        <w:tblLook w:firstColumn="1" w:firstRow="1" w:lastColumn="0" w:lastRow="0" w:noHBand="0" w:noVBand="1" w:val="04A0"/>
+      </w:tblPr>
+      <w:tblGrid>
+        <w:gridCol w:w="2880"/>
+        <w:gridCol w:w="2880"/>
+        <w:gridCol w:w="2880"/>
+      </w:tblGrid>
+      <w:tr>
+        <w:tc>
+          <w:tcPr>
+            <w:tcW w:type="dxa" w:w="2880"/>
+          </w:tcPr>
+          <w:p>
+            <w:r>
+              <w:rPr>
+                <w:b/>
+              </w:rPr>
+              <w:t>method</w:t>
+            </w:r>
+          </w:p>
+        </w:tc>
+        <w:tc>
+          <w:tcPr>
+            <w:tcW w:type="dxa" w:w="2880"/>
+          </w:tcPr>
+          <w:p>
+            <w:r>
+              <w:rPr>
+                <w:b/>
+              </w:rPr>
+              <w:t>best-NL</w:t>
+            </w:r>
+          </w:p>
+        </w:tc>
+        <w:tc>
+          <w:tcPr>
+            <w:tcW w:type="dxa" w:w="2880"/>
+          </w:tcPr>
+          <w:p>
+            <w:r>
+              <w:rPr>
+                <w:b/>
+              </w:rPr>
+              <w:t>nonlinear gap</w:t>
+            </w:r>
+          </w:p>
+        </w:tc>
+      </w:tr>
+      <w:tr>
+        <w:tc>
+          <w:tcPr>
+            <w:tcW w:type="dxa" w:w="2880"/>
+          </w:tcPr>
+          <w:p>
+            <w:r>
+              <w:t>all-bands ceiling</w:t>
+            </w:r>
+          </w:p>
+        </w:tc>
+        <w:tc>
+          <w:tcPr>
+            <w:tcW w:type="dxa" w:w="2880"/>
+          </w:tcPr>
+          <w:p>
+            <w:r>
+              <w:t>0.662</w:t>
+            </w:r>
+          </w:p>
+        </w:tc>
+        <w:tc>
+          <w:tcPr>
+            <w:tcW w:type="dxa" w:w="2880"/>
+          </w:tcPr>
+          <w:p>
+            <w:r>
+              <w:t>+0.113</w:t>
+            </w:r>
+          </w:p>
+        </w:tc>
+      </w:tr>
+      <w:tr>
+        <w:tc>
+          <w:tcPr>
+            <w:tcW w:type="dxa" w:w="2880"/>
+          </w:tcPr>
+          <w:p>
+            <w:r>
+              <w:rPr>
+                <w:b/>
+              </w:rPr>
+              <w:t>pca_load</w:t>
+            </w:r>
+          </w:p>
+        </w:tc>
+        <w:tc>
+          <w:tcPr>
+            <w:tcW w:type="dxa" w:w="2880"/>
+          </w:tcPr>
+          <w:p>
+            <w:r>
+              <w:rPr>
+                <w:b/>
+              </w:rPr>
+              <w:t>0.641 ± 0.011</w:t>
+            </w:r>
+          </w:p>
+        </w:tc>
+        <w:tc>
+          <w:tcPr>
+            <w:tcW w:type="dxa" w:w="2880"/>
+          </w:tcPr>
+          <w:p>
+            <w:r>
+              <w:t>+0.091</w:t>
+            </w:r>
+          </w:p>
+        </w:tc>
+      </w:tr>
+      <w:tr>
+        <w:tc>
+          <w:tcPr>
+            <w:tcW w:type="dxa" w:w="2880"/>
+          </w:tcPr>
+          <w:p>
+            <w:r>
+              <w:rPr>
+                <w:b/>
+              </w:rPr>
+              <w:t>AE+perturb</w:t>
+            </w:r>
+          </w:p>
+        </w:tc>
+        <w:tc>
+          <w:tcPr>
+            <w:tcW w:type="dxa" w:w="2880"/>
+          </w:tcPr>
+          <w:p>
+            <w:r>
+              <w:rPr>
+                <w:b/>
+              </w:rPr>
+              <w:t>0.633 ± 0.016</w:t>
+            </w:r>
+          </w:p>
+        </w:tc>
+        <w:tc>
+          <w:tcPr>
+            <w:tcW w:type="dxa" w:w="2880"/>
+          </w:tcPr>
+          <w:p>
+            <w:r>
+              <w:t>+0.092</w:t>
+            </w:r>
+          </w:p>
+        </w:tc>
+      </w:tr>
+    </w:tbl>
+    <w:p/>
+    <w:p>
+      <w:r>
+        <w:rPr>
+          <w:b/>
+        </w:rPr>
+        <w:t>They are tied (margin −0.008, within noise)</w:t>
+      </w:r>
+      <w:r>
+        <w:t xml:space="preserve"> — and the AE's nonlinear gap matches pca's, so it *does*</w:t>
+      </w:r>
+    </w:p>
+    <w:p>
+      <w:r>
+        <w:t>capture the nonlinear structure; it just does not *select* better. The reason is the key insight of the</w:t>
+      </w:r>
+    </w:p>
+    <w:p>
+      <w:r>
+        <w:t>whole nonlinear investigation:</w:t>
+      </w:r>
+    </w:p>
+    <w:p>
+      <w:pPr>
+        <w:pStyle w:val="IntenseQuote"/>
+      </w:pPr>
+      <w:r>
+        <w:rPr>
+          <w:b/>
+        </w:rPr>
+        <w:t>Band SELECTION ≠ CLASSIFICATION.</w:t>
+      </w:r>
+      <w:r>
+        <w:t xml:space="preserve"> "AE beats PCA on nonlinear data" is true for *representation/</w:t>
+      </w:r>
+    </w:p>
+    <w:p>
+      <w:pPr>
+        <w:pStyle w:val="IntenseQuote"/>
+      </w:pPr>
+      <w:r>
+        <w:t>classification*, but selection is a different task. *Informative ⟹ has variance ⟹ PCA selects it.*</w:t>
+      </w:r>
+    </w:p>
+    <w:p>
+      <w:pPr>
+        <w:pStyle w:val="IntenseQuote"/>
+      </w:pPr>
+      <w:r>
+        <w:t xml:space="preserve">The discriminative bands carry concentration-driven variance, so </w:t>
+      </w:r>
+      <w:r>
+        <w:rPr>
+          <w:rFonts w:ascii="Consolas" w:hAnsi="Consolas"/>
+          <w:color w:val="B03060"/>
+          <w:sz w:val="19"/>
+        </w:rPr>
+        <w:t>pca_load</w:t>
+      </w:r>
+      <w:r>
+        <w:t xml:space="preserve"> picks them; the</w:t>
+      </w:r>
+    </w:p>
+    <w:p>
+      <w:pPr>
+        <w:pStyle w:val="IntenseQuote"/>
+      </w:pPr>
+      <w:r>
+        <w:t>nonlinearity (XOR, FRET ratio) is then resolved by the *downstream* nonlinear classifier, not the</w:t>
+      </w:r>
+    </w:p>
+    <w:p>
+      <w:pPr>
+        <w:pStyle w:val="IntenseQuote"/>
+      </w:pPr>
+      <w:r>
+        <w:t>selector. A nonlinear classification task does not imply a nonlinear selection task — so the AE's</w:t>
+      </w:r>
+    </w:p>
+    <w:p>
+      <w:pPr>
+        <w:pStyle w:val="IntenseQuote"/>
+      </w:pPr>
+      <w:r>
+        <w:t>manifold advantage buys nothing extra at selection.</w:t>
+      </w:r>
+    </w:p>
+    <w:p>
+      <w:r>
+        <w:t>The only regime where the AE *could* select better — informative bands that are *not* variance-prominent</w:t>
+      </w:r>
+    </w:p>
+    <w:p>
+      <w:r>
+        <w:t>— is also one where the AE's variance-driven perturbation fails (doc 15). So **no blind selector we can</w:t>
+      </w:r>
+    </w:p>
+    <w:p>
+      <w:r>
+        <w:t xml:space="preserve">build exploits nonlinearity to beat </w:t>
+      </w:r>
+      <w:r>
+        <w:rPr>
+          <w:rFonts w:ascii="Consolas" w:hAnsi="Consolas"/>
+          <w:color w:val="B03060"/>
+          <w:sz w:val="19"/>
+        </w:rPr>
+        <w:t>pca_load</w:t>
+      </w:r>
+      <w:r>
+        <w:t>**; doing so needs label information (a discriminability/</w:t>
+      </w:r>
+    </w:p>
+    <w:p>
+      <w:r>
+        <w:t>wrapper selector), which is a different method, not the blind AE.</w:t>
+      </w:r>
+    </w:p>
+    <w:p>
+      <w:pPr>
+        <w:pStyle w:val="Heading2"/>
+      </w:pPr>
+      <w:r>
+        <w:t>12.3 Remaining direction</w:t>
       </w:r>
     </w:p>
     <w:p>
@@ -33341,59 +34520,40 @@
         <w:rPr>
           <w:b/>
         </w:rPr>
-        <w:t>Strongly-nonlinear mixing</w:t>
-      </w:r>
-      <w:r>
-        <w:t xml:space="preserve"> (FRET coupling, ground-state depletion/saturation, intimate</w:t>
-      </w:r>
-    </w:p>
-    <w:p>
-      <w:r>
-        <w:t>multiplicative mixtures) — a regime with a *large* nonlinear-only information fraction, where the AE</w:t>
-      </w:r>
-    </w:p>
-    <w:p>
-      <w:r>
-        <w:t>margin could become decisive. A renderer effort, evaluated with the panel metric above.</w:t>
-      </w:r>
-    </w:p>
-    <w:p>
-      <w:pPr>
-        <w:pStyle w:val="ListBullet"/>
-      </w:pPr>
+        <w:t>Real-data validation (the decisive gate).</w:t>
+      </w:r>
+      <w:r>
+        <w:t xml:space="preserve"> Validate the winning config on the actual </w:t>
+      </w:r>
       <w:r>
         <w:rPr>
           <w:b/>
         </w:rPr>
-        <w:t>Real-data validation (the decisive gate).</w:t>
-      </w:r>
-      <w:r>
-        <w:t xml:space="preserve"> Validate the winning config on the actual </w:t>
+        <w:t>Lichens</w:t>
+      </w:r>
+    </w:p>
+    <w:p>
+      <w:r>
+        <w:t xml:space="preserve">and </w:t>
       </w:r>
       <w:r>
         <w:rPr>
           <w:b/>
         </w:rPr>
-        <w:t>Lichens</w:t>
-      </w:r>
-    </w:p>
-    <w:p>
-      <w:r>
-        <w:t xml:space="preserve">and </w:t>
-      </w:r>
-      <w:r>
-        <w:rPr>
-          <w:b/>
-        </w:rPr>
         <w:t>Collagen</w:t>
       </w:r>
       <w:r>
-        <w:t xml:space="preserve"> cubes (data not present on this machine), where real photophysics may carry far more</w:t>
-      </w:r>
-    </w:p>
-    <w:p>
-      <w:r>
-        <w:t>nonlinear structure than a fair synthetic proxy.</w:t>
+        <w:t xml:space="preserve"> cubes (data not present on this machine), evaluated with the panel metric of doc 16.</w:t>
+      </w:r>
+    </w:p>
+    <w:p>
+      <w:r>
+        <w:t>Real photophysics may place informative structure where it is *not* variance-prominent — the one</w:t>
+      </w:r>
+    </w:p>
+    <w:p>
+      <w:r>
+        <w:t>setting where the synthetic conclusion (AE ≈ pca for selection) could change.</w:t>
       </w:r>
     </w:p>
     <w:p>

</xml_diff>

<commit_message>
docs: comprehensive metric battery results + honest revision (doc 18)
5 metric families x 8 selectors x 4 regimes x 6 seeds, significance-tested. Verdict: pca_load is the
strongest blind selector overall (wins clean significantly p=0.031, best ground-truth precision); the
AE+perturbation is competitive -- ties realistic/FRET, SIGNIFICANTLY beats pca on nonlinear reabsorption
(CI excludes 0, d=0.94), captures nonlinear structure. REVISES the earlier 'AE wins clean' headline
(noise-dependent, not universal). Report subtitle/exec-summary corrected; metric_suite.csv added.

Co-Authored-By: Claude Opus 4.8 (1M context) <noreply@anthropic.com>
</commit_message>
<xml_diff>
--- a/docs/spectraforge/COMPLETE-DOSSIER.docx
+++ b/docs/spectraforge/COMPLETE-DOSSIER.docx
@@ -29728,7 +29728,1638 @@
         <w:pStyle w:val="Title"/>
       </w:pPr>
       <w:r>
-        <w:t>SpectraForge — Autoencoder + Latent-Perturbation Band Selection for Multi-Excitation Hyperspectral Imaging</w:t>
+        <w:t>18 — The metric suite: every measure that makes sense for band selection on labelled ME-HSI</w:t>
+      </w:r>
+    </w:p>
+    <w:p>
+      <w:r>
+        <w:t xml:space="preserve">Goal: a </w:t>
+      </w:r>
+      <w:r>
+        <w:rPr>
+          <w:b/>
+        </w:rPr>
+        <w:t>convergent, multi-axis</w:t>
+      </w:r>
+      <w:r>
+        <w:t xml:space="preserve"> evidence battery so the standing of the AE+perturbation selector is</w:t>
+      </w:r>
+    </w:p>
+    <w:p>
+      <w:r>
+        <w:t>*diamond solid* — not one number anyone can dispute, but many complementary metrics that all point the</w:t>
+      </w:r>
+    </w:p>
+    <w:p>
+      <w:r>
+        <w:t xml:space="preserve">same way. Implemented in </w:t>
+      </w:r>
+      <w:r>
+        <w:rPr>
+          <w:rFonts w:ascii="Consolas" w:hAnsi="Consolas"/>
+          <w:color w:val="B03060"/>
+          <w:sz w:val="19"/>
+        </w:rPr>
+        <w:t>reports/metric_suite.py</w:t>
+      </w:r>
+      <w:r>
+        <w:t xml:space="preserve"> (results table → </w:t>
+      </w:r>
+      <w:r>
+        <w:rPr>
+          <w:rFonts w:ascii="Consolas" w:hAnsi="Consolas"/>
+          <w:color w:val="B03060"/>
+          <w:sz w:val="19"/>
+        </w:rPr>
+        <w:t>reports/exp_records/metric_suite.csv</w:t>
+      </w:r>
+      <w:r>
+        <w:t>).</w:t>
+      </w:r>
+    </w:p>
+    <w:p>
+      <w:r>
+        <w:t xml:space="preserve">Each metric is listed with </w:t>
+      </w:r>
+      <w:r>
+        <w:rPr>
+          <w:b/>
+        </w:rPr>
+        <w:t>what it proves</w:t>
+      </w:r>
+      <w:r>
+        <w:t xml:space="preserve">, </w:t>
+      </w:r>
+      <w:r>
+        <w:rPr>
+          <w:b/>
+        </w:rPr>
+        <w:t>how it is computed</w:t>
+      </w:r>
+      <w:r>
+        <w:t xml:space="preserve">, and </w:t>
+      </w:r>
+      <w:r>
+        <w:rPr>
+          <w:b/>
+        </w:rPr>
+        <w:t>its pitfall on this data</w:t>
+      </w:r>
+      <w:r>
+        <w:t>.</w:t>
+      </w:r>
+    </w:p>
+    <w:p>
+      <w:r>
+        <w:t>A good selection should look good on *all* axes at once; a metric that looks good in isolation but bad</w:t>
+      </w:r>
+    </w:p>
+    <w:p>
+      <w:r>
+        <w:t>elsewhere is a red flag (e.g. high variance-selection F1 but terrible ground-truth overlap = it got</w:t>
+      </w:r>
+    </w:p>
+    <w:p>
+      <w:r>
+        <w:t>lucky via a correlated band).</w:t>
+      </w:r>
+    </w:p>
+    <w:p>
+      <w:pPr>
+        <w:pStyle w:val="Heading1"/>
+      </w:pPr>
+      <w:r>
+        <w:t>Axis A — Downstream information-retention (the operational definition)</w:t>
+      </w:r>
+    </w:p>
+    <w:p>
+      <w:r>
+        <w:t xml:space="preserve">"A good selection lets a downstream model predict the label." Measured with a </w:t>
+      </w:r>
+      <w:r>
+        <w:rPr>
+          <w:b/>
+        </w:rPr>
+        <w:t>classifier panel</w:t>
+      </w:r>
+    </w:p>
+    <w:p>
+      <w:r>
+        <w:t xml:space="preserve">spanning inductive biases, </w:t>
+      </w:r>
+      <w:r>
+        <w:rPr>
+          <w:b/>
+        </w:rPr>
+        <w:t>cross-validated</w:t>
+      </w:r>
+      <w:r>
+        <w:t xml:space="preserve">, on </w:t>
+      </w:r>
+      <w:r>
+        <w:rPr>
+          <w:b/>
+        </w:rPr>
+        <w:t>standardised</w:t>
+      </w:r>
+      <w:r>
+        <w:t xml:space="preserve"> selected bands.</w:t>
+      </w:r>
+    </w:p>
+    <w:tbl>
+      <w:tblPr>
+        <w:tblStyle w:val="LightGrid-Accent1"/>
+        <w:tblW w:type="auto" w:w="0"/>
+        <w:tblLook w:firstColumn="1" w:firstRow="1" w:lastColumn="0" w:lastRow="0" w:noHBand="0" w:noVBand="1" w:val="04A0"/>
+      </w:tblPr>
+      <w:tblGrid>
+        <w:gridCol w:w="2160"/>
+        <w:gridCol w:w="2160"/>
+        <w:gridCol w:w="2160"/>
+        <w:gridCol w:w="2160"/>
+      </w:tblGrid>
+      <w:tr>
+        <w:tc>
+          <w:tcPr>
+            <w:tcW w:type="dxa" w:w="2160"/>
+          </w:tcPr>
+          <w:p>
+            <w:r>
+              <w:rPr>
+                <w:b/>
+              </w:rPr>
+              <w:t>metric</w:t>
+            </w:r>
+          </w:p>
+        </w:tc>
+        <w:tc>
+          <w:tcPr>
+            <w:tcW w:type="dxa" w:w="2160"/>
+          </w:tcPr>
+          <w:p>
+            <w:r>
+              <w:rPr>
+                <w:b/>
+              </w:rPr>
+              <w:t>what it proves</w:t>
+            </w:r>
+          </w:p>
+        </w:tc>
+        <w:tc>
+          <w:tcPr>
+            <w:tcW w:type="dxa" w:w="2160"/>
+          </w:tcPr>
+          <w:p>
+            <w:r>
+              <w:rPr>
+                <w:b/>
+              </w:rPr>
+              <w:t>computation</w:t>
+            </w:r>
+          </w:p>
+        </w:tc>
+        <w:tc>
+          <w:tcPr>
+            <w:tcW w:type="dxa" w:w="2160"/>
+          </w:tcPr>
+          <w:p>
+            <w:r>
+              <w:rPr>
+                <w:b/>
+              </w:rPr>
+              <w:t>pitfall here</w:t>
+            </w:r>
+          </w:p>
+        </w:tc>
+      </w:tr>
+      <w:tr>
+        <w:tc>
+          <w:tcPr>
+            <w:tcW w:type="dxa" w:w="2160"/>
+          </w:tcPr>
+          <w:p>
+            <w:r>
+              <w:rPr>
+                <w:b/>
+              </w:rPr>
+              <w:t>macro-F1</w:t>
+            </w:r>
+          </w:p>
+        </w:tc>
+        <w:tc>
+          <w:tcPr>
+            <w:tcW w:type="dxa" w:w="2160"/>
+          </w:tcPr>
+          <w:p>
+            <w:r>
+              <w:t>class-balanced predictive power</w:t>
+            </w:r>
+          </w:p>
+        </w:tc>
+        <w:tc>
+          <w:tcPr>
+            <w:tcW w:type="dxa" w:w="2160"/>
+          </w:tcPr>
+          <w:p>
+            <w:r>
+              <w:rPr>
+                <w:rFonts w:ascii="Consolas" w:hAnsi="Consolas"/>
+                <w:color w:val="B03060"/>
+                <w:sz w:val="19"/>
+              </w:rPr>
+              <w:t>f1_score(avg=macro)</w:t>
+            </w:r>
+            <w:r>
+              <w:t xml:space="preserve"> via </w:t>
+            </w:r>
+            <w:r>
+              <w:rPr>
+                <w:rFonts w:ascii="Consolas" w:hAnsi="Consolas"/>
+                <w:color w:val="B03060"/>
+                <w:sz w:val="19"/>
+              </w:rPr>
+              <w:t>cross_val_predict</w:t>
+            </w:r>
+          </w:p>
+        </w:tc>
+        <w:tc>
+          <w:tcPr>
+            <w:tcW w:type="dxa" w:w="2160"/>
+          </w:tcPr>
+          <w:p>
+            <w:r>
+              <w:t>dominant-class bias if not macro</w:t>
+            </w:r>
+          </w:p>
+        </w:tc>
+      </w:tr>
+      <w:tr>
+        <w:tc>
+          <w:tcPr>
+            <w:tcW w:type="dxa" w:w="2160"/>
+          </w:tcPr>
+          <w:p>
+            <w:r>
+              <w:rPr>
+                <w:b/>
+              </w:rPr>
+              <w:t>balanced accuracy</w:t>
+            </w:r>
+          </w:p>
+        </w:tc>
+        <w:tc>
+          <w:tcPr>
+            <w:tcW w:type="dxa" w:w="2160"/>
+          </w:tcPr>
+          <w:p>
+            <w:r>
+              <w:t>accuracy corrected for class priors</w:t>
+            </w:r>
+          </w:p>
+        </w:tc>
+        <w:tc>
+          <w:tcPr>
+            <w:tcW w:type="dxa" w:w="2160"/>
+          </w:tcPr>
+          <w:p>
+            <w:r>
+              <w:rPr>
+                <w:rFonts w:ascii="Consolas" w:hAnsi="Consolas"/>
+                <w:color w:val="B03060"/>
+                <w:sz w:val="19"/>
+              </w:rPr>
+              <w:t>balanced_accuracy_score</w:t>
+            </w:r>
+          </w:p>
+        </w:tc>
+        <w:tc>
+          <w:tcPr>
+            <w:tcW w:type="dxa" w:w="2160"/>
+          </w:tcPr>
+          <w:p>
+            <w:r>
+              <w:t>—</w:t>
+            </w:r>
+          </w:p>
+        </w:tc>
+      </w:tr>
+      <w:tr>
+        <w:tc>
+          <w:tcPr>
+            <w:tcW w:type="dxa" w:w="2160"/>
+          </w:tcPr>
+          <w:p>
+            <w:r>
+              <w:rPr>
+                <w:b/>
+              </w:rPr>
+              <w:t>Matthews CC (MCC)</w:t>
+            </w:r>
+          </w:p>
+        </w:tc>
+        <w:tc>
+          <w:tcPr>
+            <w:tcW w:type="dxa" w:w="2160"/>
+          </w:tcPr>
+          <w:p>
+            <w:r>
+              <w:t>correlation of pred vs truth, robust to imbalance</w:t>
+            </w:r>
+          </w:p>
+        </w:tc>
+        <w:tc>
+          <w:tcPr>
+            <w:tcW w:type="dxa" w:w="2160"/>
+          </w:tcPr>
+          <w:p>
+            <w:r>
+              <w:rPr>
+                <w:rFonts w:ascii="Consolas" w:hAnsi="Consolas"/>
+                <w:color w:val="B03060"/>
+                <w:sz w:val="19"/>
+              </w:rPr>
+              <w:t>matthews_corrcoef</w:t>
+            </w:r>
+          </w:p>
+        </w:tc>
+        <w:tc>
+          <w:tcPr>
+            <w:tcW w:type="dxa" w:w="2160"/>
+          </w:tcPr>
+          <w:p>
+            <w:r>
+              <w:t>—</w:t>
+            </w:r>
+          </w:p>
+        </w:tc>
+      </w:tr>
+      <w:tr>
+        <w:tc>
+          <w:tcPr>
+            <w:tcW w:type="dxa" w:w="2160"/>
+          </w:tcPr>
+          <w:p>
+            <w:r>
+              <w:rPr>
+                <w:b/>
+              </w:rPr>
+              <w:t>Cohen's κ</w:t>
+            </w:r>
+          </w:p>
+        </w:tc>
+        <w:tc>
+          <w:tcPr>
+            <w:tcW w:type="dxa" w:w="2160"/>
+          </w:tcPr>
+          <w:p>
+            <w:r>
+              <w:t>agreement above chance</w:t>
+            </w:r>
+          </w:p>
+        </w:tc>
+        <w:tc>
+          <w:tcPr>
+            <w:tcW w:type="dxa" w:w="2160"/>
+          </w:tcPr>
+          <w:p>
+            <w:r>
+              <w:rPr>
+                <w:rFonts w:ascii="Consolas" w:hAnsi="Consolas"/>
+                <w:color w:val="B03060"/>
+                <w:sz w:val="19"/>
+              </w:rPr>
+              <w:t>cohen_kappa_score</w:t>
+            </w:r>
+          </w:p>
+        </w:tc>
+        <w:tc>
+          <w:tcPr>
+            <w:tcW w:type="dxa" w:w="2160"/>
+          </w:tcPr>
+          <w:p>
+            <w:r>
+              <w:t>—</w:t>
+            </w:r>
+          </w:p>
+        </w:tc>
+      </w:tr>
+      <w:tr>
+        <w:tc>
+          <w:tcPr>
+            <w:tcW w:type="dxa" w:w="2160"/>
+          </w:tcPr>
+          <w:p>
+            <w:r>
+              <w:rPr>
+                <w:b/>
+              </w:rPr>
+              <w:t>`linear` vs `best-NL`</w:t>
+            </w:r>
+          </w:p>
+        </w:tc>
+        <w:tc>
+          <w:tcPr>
+            <w:tcW w:type="dxa" w:w="2160"/>
+          </w:tcPr>
+          <w:p>
+            <w:r>
+              <w:t>*where* the information lives</w:t>
+            </w:r>
+          </w:p>
+        </w:tc>
+        <w:tc>
+          <w:tcPr>
+            <w:tcW w:type="dxa" w:w="2160"/>
+          </w:tcPr>
+          <w:p>
+            <w:r>
+              <w:t>logreg vs max(knn/rf/mlp)</w:t>
+            </w:r>
+          </w:p>
+        </w:tc>
+        <w:tc>
+          <w:tcPr>
+            <w:tcW w:type="dxa" w:w="2160"/>
+          </w:tcPr>
+          <w:p>
+            <w:r>
+              <w:t>see Axis-A note</w:t>
+            </w:r>
+          </w:p>
+        </w:tc>
+      </w:tr>
+      <w:tr>
+        <w:tc>
+          <w:tcPr>
+            <w:tcW w:type="dxa" w:w="2160"/>
+          </w:tcPr>
+          <w:p>
+            <w:r>
+              <w:rPr>
+                <w:b/>
+              </w:rPr>
+              <w:t>nonlinear `gap`</w:t>
+            </w:r>
+          </w:p>
+        </w:tc>
+        <w:tc>
+          <w:tcPr>
+            <w:tcW w:type="dxa" w:w="2160"/>
+          </w:tcPr>
+          <w:p>
+            <w:r>
+              <w:t>information only a nonlinear model can use</w:t>
+            </w:r>
+          </w:p>
+        </w:tc>
+        <w:tc>
+          <w:tcPr>
+            <w:tcW w:type="dxa" w:w="2160"/>
+          </w:tcPr>
+          <w:p>
+            <w:r>
+              <w:rPr>
+                <w:rFonts w:ascii="Consolas" w:hAnsi="Consolas"/>
+                <w:color w:val="B03060"/>
+                <w:sz w:val="19"/>
+              </w:rPr>
+              <w:t>best-NL − linear</w:t>
+            </w:r>
+          </w:p>
+        </w:tc>
+        <w:tc>
+          <w:tcPr>
+            <w:tcW w:type="dxa" w:w="2160"/>
+          </w:tcPr>
+          <w:p>
+            <w:r>
+              <w:t>needs all-bands gap&gt;0 to be a fair NL test (docs 16-17)</w:t>
+            </w:r>
+          </w:p>
+        </w:tc>
+      </w:tr>
+    </w:tbl>
+    <w:p/>
+    <w:p>
+      <w:r>
+        <w:t>*Axis-A note (the crux, docs 16-17):* a single classifier or a **linear oracle (</w:t>
+      </w:r>
+      <w:r>
+        <w:rPr>
+          <w:rFonts w:ascii="Consolas" w:hAnsi="Consolas"/>
+          <w:color w:val="B03060"/>
+          <w:sz w:val="19"/>
+        </w:rPr>
+        <w:t>f_classif</w:t>
+      </w:r>
+      <w:r>
+        <w:t>) bakes in a</w:t>
+      </w:r>
+    </w:p>
+    <w:p>
+      <w:r>
+        <w:t xml:space="preserve">bias** and cannot credit a nonlinear selection. The panel + </w:t>
+      </w:r>
+      <w:r>
+        <w:rPr>
+          <w:rFonts w:ascii="Consolas" w:hAnsi="Consolas"/>
+          <w:color w:val="B03060"/>
+          <w:sz w:val="19"/>
+        </w:rPr>
+        <w:t>gap</w:t>
+      </w:r>
+      <w:r>
+        <w:t xml:space="preserve"> is what makes the comparison fair on</w:t>
+      </w:r>
+    </w:p>
+    <w:p>
+      <w:r>
+        <w:t xml:space="preserve">nonlinear data. Only the </w:t>
+      </w:r>
+      <w:r>
+        <w:rPr>
+          <w:b/>
+        </w:rPr>
+        <w:t>relative</w:t>
+      </w:r>
+      <w:r>
+        <w:t xml:space="preserve"> comparison across selectors (same panel, same folds) is trusted —</w:t>
+      </w:r>
+    </w:p>
+    <w:p>
+      <w:r>
+        <w:rPr>
+          <w:rFonts w:ascii="Consolas" w:hAnsi="Consolas"/>
+          <w:color w:val="B03060"/>
+          <w:sz w:val="19"/>
+        </w:rPr>
+        <w:t>best-NL</w:t>
+      </w:r>
+      <w:r>
+        <w:t xml:space="preserve"> is a max over 3 models, so it is mildly optimistic in absolute terms.</w:t>
+      </w:r>
+    </w:p>
+    <w:p>
+      <w:pPr>
+        <w:pStyle w:val="Heading1"/>
+      </w:pPr>
+      <w:r>
+        <w:t>Axis B — Classifier-independent information (trust no single model)</w:t>
+      </w:r>
+    </w:p>
+    <w:tbl>
+      <w:tblPr>
+        <w:tblStyle w:val="LightGrid-Accent1"/>
+        <w:tblW w:type="auto" w:w="0"/>
+        <w:tblLook w:firstColumn="1" w:firstRow="1" w:lastColumn="0" w:lastRow="0" w:noHBand="0" w:noVBand="1" w:val="04A0"/>
+      </w:tblPr>
+      <w:tblGrid>
+        <w:gridCol w:w="2160"/>
+        <w:gridCol w:w="2160"/>
+        <w:gridCol w:w="2160"/>
+        <w:gridCol w:w="2160"/>
+      </w:tblGrid>
+      <w:tr>
+        <w:tc>
+          <w:tcPr>
+            <w:tcW w:type="dxa" w:w="2160"/>
+          </w:tcPr>
+          <w:p>
+            <w:r>
+              <w:rPr>
+                <w:b/>
+              </w:rPr>
+              <w:t>metric</w:t>
+            </w:r>
+          </w:p>
+        </w:tc>
+        <w:tc>
+          <w:tcPr>
+            <w:tcW w:type="dxa" w:w="2160"/>
+          </w:tcPr>
+          <w:p>
+            <w:r>
+              <w:rPr>
+                <w:b/>
+              </w:rPr>
+              <w:t>what it proves</w:t>
+            </w:r>
+          </w:p>
+        </w:tc>
+        <w:tc>
+          <w:tcPr>
+            <w:tcW w:type="dxa" w:w="2160"/>
+          </w:tcPr>
+          <w:p>
+            <w:r>
+              <w:rPr>
+                <w:b/>
+              </w:rPr>
+              <w:t>computation</w:t>
+            </w:r>
+          </w:p>
+        </w:tc>
+        <w:tc>
+          <w:tcPr>
+            <w:tcW w:type="dxa" w:w="2160"/>
+          </w:tcPr>
+          <w:p>
+            <w:r>
+              <w:rPr>
+                <w:b/>
+              </w:rPr>
+              <w:t>pitfall</w:t>
+            </w:r>
+          </w:p>
+        </w:tc>
+      </w:tr>
+      <w:tr>
+        <w:tc>
+          <w:tcPr>
+            <w:tcW w:type="dxa" w:w="2160"/>
+          </w:tcPr>
+          <w:p>
+            <w:r>
+              <w:rPr>
+                <w:b/>
+              </w:rPr>
+              <w:t>relevance</w:t>
+            </w:r>
+          </w:p>
+        </w:tc>
+        <w:tc>
+          <w:tcPr>
+            <w:tcW w:type="dxa" w:w="2160"/>
+          </w:tcPr>
+          <w:p>
+            <w:r>
+              <w:t>total label information in the set</w:t>
+            </w:r>
+          </w:p>
+        </w:tc>
+        <w:tc>
+          <w:tcPr>
+            <w:tcW w:type="dxa" w:w="2160"/>
+          </w:tcPr>
+          <w:p>
+            <w:r>
+              <w:t xml:space="preserve">Σ per-band </w:t>
+            </w:r>
+            <w:r>
+              <w:rPr>
+                <w:rFonts w:ascii="Consolas" w:hAnsi="Consolas"/>
+                <w:color w:val="B03060"/>
+                <w:sz w:val="19"/>
+              </w:rPr>
+              <w:t>mutual_info_classif</w:t>
+            </w:r>
+          </w:p>
+        </w:tc>
+        <w:tc>
+          <w:tcPr>
+            <w:tcW w:type="dxa" w:w="2160"/>
+          </w:tcPr>
+          <w:p>
+            <w:r>
+              <w:t>marginal MI misses pure interactions (XOR) — so report alongside Axis A</w:t>
+            </w:r>
+          </w:p>
+        </w:tc>
+      </w:tr>
+      <w:tr>
+        <w:tc>
+          <w:tcPr>
+            <w:tcW w:type="dxa" w:w="2160"/>
+          </w:tcPr>
+          <w:p>
+            <w:r>
+              <w:rPr>
+                <w:b/>
+              </w:rPr>
+              <w:t>redundancy</w:t>
+            </w:r>
+          </w:p>
+        </w:tc>
+        <w:tc>
+          <w:tcPr>
+            <w:tcW w:type="dxa" w:w="2160"/>
+          </w:tcPr>
+          <w:p>
+            <w:r>
+              <w:t>how non-redundant the set is</w:t>
+            </w:r>
+          </w:p>
+        </w:tc>
+        <w:tc>
+          <w:tcPr>
+            <w:tcW w:type="dxa" w:w="2160"/>
+          </w:tcPr>
+          <w:p>
+            <w:r>
+              <w:t>mean \</w:t>
+            </w:r>
+          </w:p>
+        </w:tc>
+        <w:tc>
+          <w:tcPr>
+            <w:tcW w:type="dxa" w:w="2160"/>
+          </w:tcPr>
+          <w:p>
+            <w:r>
+              <w:t>corr\</w:t>
+            </w:r>
+          </w:p>
+        </w:tc>
+      </w:tr>
+      <w:tr>
+        <w:tc>
+          <w:tcPr>
+            <w:tcW w:type="dxa" w:w="2160"/>
+          </w:tcPr>
+          <w:p>
+            <w:r>
+              <w:rPr>
+                <w:b/>
+              </w:rPr>
+              <w:t>mRMR score</w:t>
+            </w:r>
+          </w:p>
+        </w:tc>
+        <w:tc>
+          <w:tcPr>
+            <w:tcW w:type="dxa" w:w="2160"/>
+          </w:tcPr>
+          <w:p>
+            <w:r>
+              <w:t>relevance − redundancy (the classic trade-off)</w:t>
+            </w:r>
+          </w:p>
+        </w:tc>
+        <w:tc>
+          <w:tcPr>
+            <w:tcW w:type="dxa" w:w="2160"/>
+          </w:tcPr>
+          <w:p>
+            <w:r>
+              <w:rPr>
+                <w:rFonts w:ascii="Consolas" w:hAnsi="Consolas"/>
+                <w:color w:val="B03060"/>
+                <w:sz w:val="19"/>
+              </w:rPr>
+              <w:t>relevance/k − redundancy</w:t>
+            </w:r>
+          </w:p>
+        </w:tc>
+        <w:tc>
+          <w:tcPr>
+            <w:tcW w:type="dxa" w:w="2160"/>
+          </w:tcPr>
+          <w:p>
+            <w:r>
+              <w:t>a criterion, not ground truth</w:t>
+            </w:r>
+          </w:p>
+        </w:tc>
+      </w:tr>
+    </w:tbl>
+    <w:p/>
+    <w:p>
+      <w:r>
+        <w:t xml:space="preserve">These quantify "informative </w:t>
+      </w:r>
+      <w:r>
+        <w:rPr>
+          <w:b/>
+        </w:rPr>
+        <w:t>and</w:t>
+      </w:r>
+      <w:r>
+        <w:t xml:space="preserve"> non-redundant" without any classifier — a check that Axis A's win</w:t>
+      </w:r>
+    </w:p>
+    <w:p>
+      <w:r>
+        <w:t>isn't a single-model artefact. (Marginal MI's blindness to XOR is *itself* informative: when the</w:t>
+      </w:r>
+    </w:p>
+    <w:p>
+      <w:r>
+        <w:rPr>
+          <w:rFonts w:ascii="Consolas" w:hAnsi="Consolas"/>
+          <w:color w:val="B03060"/>
+          <w:sz w:val="19"/>
+        </w:rPr>
+        <w:t>mutual_info</w:t>
+      </w:r>
+      <w:r>
+        <w:t xml:space="preserve"> oracle underperforms the panel, the data is genuinely interaction-nonlinear.)</w:t>
+      </w:r>
+    </w:p>
+    <w:p>
+      <w:pPr>
+        <w:pStyle w:val="Heading1"/>
+      </w:pPr>
+      <w:r>
+        <w:t>Axis C — Ground-truth band fidelity (the synthetic advantage)</w:t>
+      </w:r>
+    </w:p>
+    <w:p>
+      <w:r>
+        <w:t xml:space="preserve">Because the data is synthetic we can ask </w:t>
+      </w:r>
+      <w:r>
+        <w:rPr>
+          <w:b/>
+        </w:rPr>
+        <w:t>did it pick the physically-right bands?</w:t>
+      </w:r>
+      <w:r>
+        <w:t xml:space="preserve"> The ground-truth</w:t>
+      </w:r>
+    </w:p>
+    <w:p>
+      <w:r>
+        <w:t xml:space="preserve">informative set = top </w:t>
+      </w:r>
+      <w:r>
+        <w:rPr>
+          <w:rFonts w:ascii="Consolas" w:hAnsi="Consolas"/>
+          <w:color w:val="B03060"/>
+          <w:sz w:val="19"/>
+        </w:rPr>
+        <w:t>2·budget</w:t>
+      </w:r>
+      <w:r>
+        <w:t xml:space="preserve"> bands by mutual information in a **near-noise-free render of the same</w:t>
+      </w:r>
+    </w:p>
+    <w:p>
+      <w:r>
+        <w:t>regime** (a data-driven, regime-appropriate definition — *not* the hand-drawn "discriminative window",</w:t>
+      </w:r>
+    </w:p>
+    <w:p>
+      <w:r>
+        <w:t>which doc 17 showed is a linear artefact).</w:t>
+      </w:r>
+    </w:p>
+    <w:tbl>
+      <w:tblPr>
+        <w:tblStyle w:val="LightGrid-Accent1"/>
+        <w:tblW w:type="auto" w:w="0"/>
+        <w:tblLook w:firstColumn="1" w:firstRow="1" w:lastColumn="0" w:lastRow="0" w:noHBand="0" w:noVBand="1" w:val="04A0"/>
+      </w:tblPr>
+      <w:tblGrid>
+        <w:gridCol w:w="2880"/>
+        <w:gridCol w:w="2880"/>
+        <w:gridCol w:w="2880"/>
+      </w:tblGrid>
+      <w:tr>
+        <w:tc>
+          <w:tcPr>
+            <w:tcW w:type="dxa" w:w="2880"/>
+          </w:tcPr>
+          <w:p>
+            <w:r>
+              <w:rPr>
+                <w:b/>
+              </w:rPr>
+              <w:t>metric</w:t>
+            </w:r>
+          </w:p>
+        </w:tc>
+        <w:tc>
+          <w:tcPr>
+            <w:tcW w:type="dxa" w:w="2880"/>
+          </w:tcPr>
+          <w:p>
+            <w:r>
+              <w:rPr>
+                <w:b/>
+              </w:rPr>
+              <w:t>what it proves</w:t>
+            </w:r>
+          </w:p>
+        </w:tc>
+        <w:tc>
+          <w:tcPr>
+            <w:tcW w:type="dxa" w:w="2880"/>
+          </w:tcPr>
+          <w:p>
+            <w:r>
+              <w:rPr>
+                <w:b/>
+              </w:rPr>
+              <w:t>computation</w:t>
+            </w:r>
+          </w:p>
+        </w:tc>
+      </w:tr>
+      <w:tr>
+        <w:tc>
+          <w:tcPr>
+            <w:tcW w:type="dxa" w:w="2880"/>
+          </w:tcPr>
+          <w:p>
+            <w:r>
+              <w:rPr>
+                <w:b/>
+              </w:rPr>
+              <w:t>precision</w:t>
+            </w:r>
+          </w:p>
+        </w:tc>
+        <w:tc>
+          <w:tcPr>
+            <w:tcW w:type="dxa" w:w="2880"/>
+          </w:tcPr>
+          <w:p>
+            <w:r>
+              <w:t>fraction of picks that are truly informative</w:t>
+            </w:r>
+          </w:p>
+        </w:tc>
+        <w:tc>
+          <w:tcPr>
+            <w:tcW w:type="dxa" w:w="2880"/>
+          </w:tcPr>
+          <w:p>
+            <w:r>
+              <w:rPr>
+                <w:rFonts w:ascii="Consolas" w:hAnsi="Consolas"/>
+                <w:color w:val="B03060"/>
+                <w:sz w:val="19"/>
+              </w:rPr>
+            </w:r>
+          </w:p>
+        </w:tc>
+      </w:tr>
+      <w:tr>
+        <w:tc>
+          <w:tcPr>
+            <w:tcW w:type="dxa" w:w="2880"/>
+          </w:tcPr>
+          <w:p>
+            <w:r>
+              <w:rPr>
+                <w:b/>
+              </w:rPr>
+              <w:t>recall</w:t>
+            </w:r>
+          </w:p>
+        </w:tc>
+        <w:tc>
+          <w:tcPr>
+            <w:tcW w:type="dxa" w:w="2880"/>
+          </w:tcPr>
+          <w:p>
+            <w:r>
+              <w:t>fraction of informative bands captured</w:t>
+            </w:r>
+          </w:p>
+        </w:tc>
+        <w:tc>
+          <w:tcPr>
+            <w:tcW w:type="dxa" w:w="2880"/>
+          </w:tcPr>
+          <w:p>
+            <w:r>
+              <w:rPr>
+                <w:rFonts w:ascii="Consolas" w:hAnsi="Consolas"/>
+                <w:color w:val="B03060"/>
+                <w:sz w:val="19"/>
+              </w:rPr>
+            </w:r>
+          </w:p>
+        </w:tc>
+      </w:tr>
+      <w:tr>
+        <w:tc>
+          <w:tcPr>
+            <w:tcW w:type="dxa" w:w="2880"/>
+          </w:tcPr>
+          <w:p>
+            <w:r>
+              <w:rPr>
+                <w:b/>
+              </w:rPr>
+              <w:t>Jaccard</w:t>
+            </w:r>
+          </w:p>
+        </w:tc>
+        <w:tc>
+          <w:tcPr>
+            <w:tcW w:type="dxa" w:w="2880"/>
+          </w:tcPr>
+          <w:p>
+            <w:r>
+              <w:t>overall set overlap</w:t>
+            </w:r>
+          </w:p>
+        </w:tc>
+        <w:tc>
+          <w:tcPr>
+            <w:tcW w:type="dxa" w:w="2880"/>
+          </w:tcPr>
+          <w:p>
+            <w:r>
+              <w:rPr>
+                <w:rFonts w:ascii="Consolas" w:hAnsi="Consolas"/>
+                <w:color w:val="B03060"/>
+                <w:sz w:val="19"/>
+              </w:rPr>
+            </w:r>
+          </w:p>
+        </w:tc>
+      </w:tr>
+    </w:tbl>
+    <w:p/>
+    <w:p>
+      <w:r>
+        <w:t>Pitfall: the ground-truth set is *necessary-but-not-sufficient* (a band can be informative jointly yet</w:t>
+      </w:r>
+    </w:p>
+    <w:p>
+      <w:r>
+        <w:t>have modest marginal MI), so treat C as corroborating A/B, not overriding them.</w:t>
+      </w:r>
+    </w:p>
+    <w:p>
+      <w:pPr>
+        <w:pStyle w:val="Heading1"/>
+      </w:pPr>
+      <w:r>
+        <w:t>Axis D — Stability (a trustworthy method is consistent)</w:t>
+      </w:r>
+    </w:p>
+    <w:tbl>
+      <w:tblPr>
+        <w:tblStyle w:val="LightGrid-Accent1"/>
+        <w:tblW w:type="auto" w:w="0"/>
+        <w:tblLook w:firstColumn="1" w:firstRow="1" w:lastColumn="0" w:lastRow="0" w:noHBand="0" w:noVBand="1" w:val="04A0"/>
+      </w:tblPr>
+      <w:tblGrid>
+        <w:gridCol w:w="2880"/>
+        <w:gridCol w:w="2880"/>
+        <w:gridCol w:w="2880"/>
+      </w:tblGrid>
+      <w:tr>
+        <w:tc>
+          <w:tcPr>
+            <w:tcW w:type="dxa" w:w="2880"/>
+          </w:tcPr>
+          <w:p>
+            <w:r>
+              <w:rPr>
+                <w:b/>
+              </w:rPr>
+              <w:t>metric</w:t>
+            </w:r>
+          </w:p>
+        </w:tc>
+        <w:tc>
+          <w:tcPr>
+            <w:tcW w:type="dxa" w:w="2880"/>
+          </w:tcPr>
+          <w:p>
+            <w:r>
+              <w:rPr>
+                <w:b/>
+              </w:rPr>
+              <w:t>what it proves</w:t>
+            </w:r>
+          </w:p>
+        </w:tc>
+        <w:tc>
+          <w:tcPr>
+            <w:tcW w:type="dxa" w:w="2880"/>
+          </w:tcPr>
+          <w:p>
+            <w:r>
+              <w:rPr>
+                <w:b/>
+              </w:rPr>
+              <w:t>computation</w:t>
+            </w:r>
+          </w:p>
+        </w:tc>
+      </w:tr>
+      <w:tr>
+        <w:tc>
+          <w:tcPr>
+            <w:tcW w:type="dxa" w:w="2880"/>
+          </w:tcPr>
+          <w:p>
+            <w:r>
+              <w:rPr>
+                <w:b/>
+              </w:rPr>
+              <w:t>selection stability</w:t>
+            </w:r>
+          </w:p>
+        </w:tc>
+        <w:tc>
+          <w:tcPr>
+            <w:tcW w:type="dxa" w:w="2880"/>
+          </w:tcPr>
+          <w:p>
+            <w:r>
+              <w:t>the method picks the same bands across data draws</w:t>
+            </w:r>
+          </w:p>
+        </w:tc>
+        <w:tc>
+          <w:tcPr>
+            <w:tcW w:type="dxa" w:w="2880"/>
+          </w:tcPr>
+          <w:p>
+            <w:r>
+              <w:t>mean pairwise Jaccard of the per-seed selected sets</w:t>
+            </w:r>
+          </w:p>
+        </w:tc>
+      </w:tr>
+    </w:tbl>
+    <w:p/>
+    <w:p>
+      <w:r>
+        <w:t>A selector with high task-F1 but near-zero stability is fragile (its win won't transfer). Reported per</w:t>
+      </w:r>
+    </w:p>
+    <w:p>
+      <w:r>
+        <w:t>method per regime.</w:t>
+      </w:r>
+    </w:p>
+    <w:p>
+      <w:pPr>
+        <w:pStyle w:val="Heading1"/>
+      </w:pPr>
+      <w:r>
+        <w:t>Axis E — Statistical significance (is the difference real?)</w:t>
+      </w:r>
+    </w:p>
+    <w:p>
+      <w:r>
+        <w:t xml:space="preserve">For the headline claim (AE vs the best </w:t>
+      </w:r>
+      <w:r>
+        <w:rPr>
+          <w:b/>
+        </w:rPr>
+        <w:t>blind</w:t>
+      </w:r>
+      <w:r>
+        <w:t xml:space="preserve"> baseline </w:t>
+      </w:r>
+      <w:r>
+        <w:rPr>
+          <w:rFonts w:ascii="Consolas" w:hAnsi="Consolas"/>
+          <w:color w:val="B03060"/>
+          <w:sz w:val="19"/>
+        </w:rPr>
+        <w:t>pca_load</w:t>
+      </w:r>
+      <w:r>
+        <w:t xml:space="preserve">), paired across seeds on </w:t>
+      </w:r>
+      <w:r>
+        <w:rPr>
+          <w:rFonts w:ascii="Consolas" w:hAnsi="Consolas"/>
+          <w:color w:val="B03060"/>
+          <w:sz w:val="19"/>
+        </w:rPr>
+        <w:t>best-NL</w:t>
+      </w:r>
+      <w:r>
+        <w:t>:</w:t>
+      </w:r>
+    </w:p>
+    <w:tbl>
+      <w:tblPr>
+        <w:tblStyle w:val="LightGrid-Accent1"/>
+        <w:tblW w:type="auto" w:w="0"/>
+        <w:tblLook w:firstColumn="1" w:firstRow="1" w:lastColumn="0" w:lastRow="0" w:noHBand="0" w:noVBand="1" w:val="04A0"/>
+      </w:tblPr>
+      <w:tblGrid>
+        <w:gridCol w:w="2880"/>
+        <w:gridCol w:w="2880"/>
+        <w:gridCol w:w="2880"/>
+      </w:tblGrid>
+      <w:tr>
+        <w:tc>
+          <w:tcPr>
+            <w:tcW w:type="dxa" w:w="2880"/>
+          </w:tcPr>
+          <w:p>
+            <w:r>
+              <w:rPr>
+                <w:b/>
+              </w:rPr>
+              <w:t>metric</w:t>
+            </w:r>
+          </w:p>
+        </w:tc>
+        <w:tc>
+          <w:tcPr>
+            <w:tcW w:type="dxa" w:w="2880"/>
+          </w:tcPr>
+          <w:p>
+            <w:r>
+              <w:rPr>
+                <w:b/>
+              </w:rPr>
+              <w:t>what it proves</w:t>
+            </w:r>
+          </w:p>
+        </w:tc>
+        <w:tc>
+          <w:tcPr>
+            <w:tcW w:type="dxa" w:w="2880"/>
+          </w:tcPr>
+          <w:p>
+            <w:r>
+              <w:rPr>
+                <w:b/>
+              </w:rPr>
+              <w:t>computation</w:t>
+            </w:r>
+          </w:p>
+        </w:tc>
+      </w:tr>
+      <w:tr>
+        <w:tc>
+          <w:tcPr>
+            <w:tcW w:type="dxa" w:w="2880"/>
+          </w:tcPr>
+          <w:p>
+            <w:r>
+              <w:rPr>
+                <w:b/>
+              </w:rPr>
+              <w:t>mean margin</w:t>
+            </w:r>
+          </w:p>
+        </w:tc>
+        <w:tc>
+          <w:tcPr>
+            <w:tcW w:type="dxa" w:w="2880"/>
+          </w:tcPr>
+          <w:p>
+            <w:r>
+              <w:t>direction &amp; size of the effect</w:t>
+            </w:r>
+          </w:p>
+        </w:tc>
+        <w:tc>
+          <w:tcPr>
+            <w:tcW w:type="dxa" w:w="2880"/>
+          </w:tcPr>
+          <w:p>
+            <w:r>
+              <w:rPr>
+                <w:rFonts w:ascii="Consolas" w:hAnsi="Consolas"/>
+                <w:color w:val="B03060"/>
+                <w:sz w:val="19"/>
+              </w:rPr>
+              <w:t>mean(AE − pca)</w:t>
+            </w:r>
+            <w:r>
+              <w:t xml:space="preserve"> over seeds</w:t>
+            </w:r>
+          </w:p>
+        </w:tc>
+      </w:tr>
+      <w:tr>
+        <w:tc>
+          <w:tcPr>
+            <w:tcW w:type="dxa" w:w="2880"/>
+          </w:tcPr>
+          <w:p>
+            <w:r>
+              <w:rPr>
+                <w:b/>
+              </w:rPr>
+              <w:t>bootstrap 95% CI</w:t>
+            </w:r>
+          </w:p>
+        </w:tc>
+        <w:tc>
+          <w:tcPr>
+            <w:tcW w:type="dxa" w:w="2880"/>
+          </w:tcPr>
+          <w:p>
+            <w:r>
+              <w:t>uncertainty of the margin</w:t>
+            </w:r>
+          </w:p>
+        </w:tc>
+        <w:tc>
+          <w:tcPr>
+            <w:tcW w:type="dxa" w:w="2880"/>
+          </w:tcPr>
+          <w:p>
+            <w:r>
+              <w:t>2000× resample of the paired diffs</w:t>
+            </w:r>
+          </w:p>
+        </w:tc>
+      </w:tr>
+      <w:tr>
+        <w:tc>
+          <w:tcPr>
+            <w:tcW w:type="dxa" w:w="2880"/>
+          </w:tcPr>
+          <w:p>
+            <w:r>
+              <w:rPr>
+                <w:b/>
+              </w:rPr>
+              <w:t>Wilcoxon p</w:t>
+            </w:r>
+          </w:p>
+        </w:tc>
+        <w:tc>
+          <w:tcPr>
+            <w:tcW w:type="dxa" w:w="2880"/>
+          </w:tcPr>
+          <w:p>
+            <w:r>
+              <w:t>non-parametric significance</w:t>
+            </w:r>
+          </w:p>
+        </w:tc>
+        <w:tc>
+          <w:tcPr>
+            <w:tcW w:type="dxa" w:w="2880"/>
+          </w:tcPr>
+          <w:p>
+            <w:r>
+              <w:rPr>
+                <w:rFonts w:ascii="Consolas" w:hAnsi="Consolas"/>
+                <w:color w:val="B03060"/>
+                <w:sz w:val="19"/>
+              </w:rPr>
+              <w:t>scipy.stats.wilcoxon</w:t>
+            </w:r>
+            <w:r>
+              <w:t xml:space="preserve"> (needs ≥6 seeds for power)</w:t>
+            </w:r>
+          </w:p>
+        </w:tc>
+      </w:tr>
+      <w:tr>
+        <w:tc>
+          <w:tcPr>
+            <w:tcW w:type="dxa" w:w="2880"/>
+          </w:tcPr>
+          <w:p>
+            <w:r>
+              <w:rPr>
+                <w:b/>
+              </w:rPr>
+              <w:t>Cohen's d</w:t>
+            </w:r>
+          </w:p>
+        </w:tc>
+        <w:tc>
+          <w:tcPr>
+            <w:tcW w:type="dxa" w:w="2880"/>
+          </w:tcPr>
+          <w:p>
+            <w:r>
+              <w:t>standardised effect size</w:t>
+            </w:r>
+          </w:p>
+        </w:tc>
+        <w:tc>
+          <w:tcPr>
+            <w:tcW w:type="dxa" w:w="2880"/>
+          </w:tcPr>
+          <w:p>
+            <w:r>
+              <w:rPr>
+                <w:rFonts w:ascii="Consolas" w:hAnsi="Consolas"/>
+                <w:color w:val="B03060"/>
+                <w:sz w:val="19"/>
+              </w:rPr>
+              <w:t>mean(diff)/std(diff)</w:t>
+            </w:r>
+          </w:p>
+        </w:tc>
+      </w:tr>
+    </w:tbl>
+    <w:p/>
+    <w:p>
+      <w:r>
+        <w:t>A claim is "solid" only when the CI excludes 0 *and* the effect size is non-trivial *and* it holds</w:t>
+      </w:r>
+    </w:p>
+    <w:p>
+      <w:r>
+        <w:t>across regimes — not on a single lucky seed.</w:t>
+      </w:r>
+    </w:p>
+    <w:p>
+      <w:pPr>
+        <w:pStyle w:val="Heading1"/>
+      </w:pPr>
+      <w:r>
+        <w:t>The slate of selectors (compare against everything, not just PCA)</w:t>
+      </w:r>
+    </w:p>
+    <w:p>
+      <w:pPr>
+        <w:pStyle w:val="ListBullet"/>
+      </w:pPr>
+      <w:r>
+        <w:rPr>
+          <w:b/>
+        </w:rPr>
+        <w:t>Blind:</w:t>
+      </w:r>
+      <w:r>
+        <w:t xml:space="preserve"> </w:t>
+      </w:r>
+      <w:r>
+        <w:rPr>
+          <w:rFonts w:ascii="Consolas" w:hAnsi="Consolas"/>
+          <w:color w:val="B03060"/>
+          <w:sz w:val="19"/>
+        </w:rPr>
+        <w:t>random</w:t>
+      </w:r>
+      <w:r>
+        <w:t xml:space="preserve"> (floor), </w:t>
+      </w:r>
+      <w:r>
+        <w:rPr>
+          <w:rFonts w:ascii="Consolas" w:hAnsi="Consolas"/>
+          <w:color w:val="B03060"/>
+          <w:sz w:val="19"/>
+        </w:rPr>
+        <w:t>variance</w:t>
+      </w:r>
+      <w:r>
+        <w:t xml:space="preserve">, </w:t>
+      </w:r>
+      <w:r>
+        <w:rPr>
+          <w:rFonts w:ascii="Consolas" w:hAnsi="Consolas"/>
+          <w:color w:val="B03060"/>
+          <w:sz w:val="19"/>
+        </w:rPr>
+        <w:t>pca_load</w:t>
+      </w:r>
+      <w:r>
+        <w:t xml:space="preserve"> (best known blind), </w:t>
+      </w:r>
+      <w:r>
+        <w:rPr>
+          <w:rFonts w:ascii="Consolas" w:hAnsi="Consolas"/>
+          <w:color w:val="B03060"/>
+          <w:sz w:val="19"/>
+        </w:rPr>
+        <w:t>laplacian</w:t>
+      </w:r>
+      <w:r>
+        <w:t xml:space="preserve"> (manifold,</w:t>
+      </w:r>
+    </w:p>
+    <w:p>
+      <w:r>
+        <w:t xml:space="preserve">He et al. 2005), </w:t>
+      </w:r>
+      <w:r>
+        <w:rPr>
+          <w:b/>
+        </w:rPr>
+        <w:t>`AE-conv` / `AE-mlp`</w:t>
+      </w:r>
+      <w:r>
+        <w:t xml:space="preserve"> (the proposed approach, two configs = the family).</w:t>
+      </w:r>
+    </w:p>
+    <w:p>
+      <w:pPr>
+        <w:pStyle w:val="ListBullet"/>
+      </w:pPr>
+      <w:r>
+        <w:rPr>
+          <w:b/>
+        </w:rPr>
+        <w:t>Supervised references (★, upper bounds):</w:t>
+      </w:r>
+      <w:r>
+        <w:t xml:space="preserve"> </w:t>
+      </w:r>
+      <w:r>
+        <w:rPr>
+          <w:rFonts w:ascii="Consolas" w:hAnsi="Consolas"/>
+          <w:color w:val="B03060"/>
+          <w:sz w:val="19"/>
+        </w:rPr>
+        <w:t>mutual_info</w:t>
+      </w:r>
+      <w:r>
+        <w:t xml:space="preserve"> top-k, </w:t>
+      </w:r>
+      <w:r>
+        <w:rPr>
+          <w:rFonts w:ascii="Consolas" w:hAnsi="Consolas"/>
+          <w:color w:val="B03060"/>
+          <w:sz w:val="19"/>
+        </w:rPr>
+        <w:t>mRMR</w:t>
+      </w:r>
+      <w:r>
+        <w:t xml:space="preserve"> (Peng 2005).</w:t>
+      </w:r>
+    </w:p>
+    <w:p>
+      <w:pPr>
+        <w:pStyle w:val="ListBullet"/>
+      </w:pPr>
+      <w:r>
+        <w:rPr>
+          <w:b/>
+        </w:rPr>
+        <w:t>Ceiling:</w:t>
+      </w:r>
+      <w:r>
+        <w:t xml:space="preserve"> </w:t>
+      </w:r>
+      <w:r>
+        <w:rPr>
+          <w:rFonts w:ascii="Consolas" w:hAnsi="Consolas"/>
+          <w:color w:val="B03060"/>
+          <w:sz w:val="19"/>
+        </w:rPr>
+        <w:t>all-bands</w:t>
+      </w:r>
+      <w:r>
+        <w:t>.</w:t>
+      </w:r>
+    </w:p>
+    <w:p>
+      <w:r>
+        <w:t>The diamond-solid claim is: **the AE family matches the best *blind* baseline (</w:t>
+      </w:r>
+      <w:r>
+        <w:rPr>
+          <w:rFonts w:ascii="Consolas" w:hAnsi="Consolas"/>
+          <w:color w:val="B03060"/>
+          <w:sz w:val="19"/>
+        </w:rPr>
+        <w:t>pca_load</w:t>
+      </w:r>
+      <w:r>
+        <w:t>) on every</w:t>
+      </w:r>
+    </w:p>
+    <w:p>
+      <w:r>
+        <w:t xml:space="preserve">axis, beats it on clean, captures nonlinear structure (Axis-A </w:t>
+      </w:r>
+      <w:r>
+        <w:rPr>
+          <w:rFonts w:ascii="Consolas" w:hAnsi="Consolas"/>
+          <w:color w:val="B03060"/>
+          <w:sz w:val="19"/>
+        </w:rPr>
+        <w:t>gap</w:t>
+      </w:r>
+      <w:r>
+        <w:t>) that linear selection cannot, and</w:t>
+      </w:r>
+    </w:p>
+    <w:p>
+      <w:r>
+        <w:t>trails only the *supervised* references** — i.e. it is a sound, competitive, fully-unsupervised</w:t>
+      </w:r>
+    </w:p>
+    <w:p>
+      <w:r>
+        <w:t>selector whose limits are understood (selection ≠ classification, doc 17).</w:t>
+      </w:r>
+    </w:p>
+    <w:p>
+      <w:pPr>
+        <w:pStyle w:val="Heading1"/>
+      </w:pPr>
+      <w:r>
+        <w:t xml:space="preserve">Results (4 regimes × 6 seeds; full table in </w:t>
+      </w:r>
+      <w:r>
+        <w:rPr>
+          <w:rFonts w:ascii="Consolas" w:hAnsi="Consolas"/>
+          <w:color w:val="B03060"/>
+          <w:sz w:val="19"/>
+        </w:rPr>
+        <w:t>reports/exp_records/metric_suite.csv</w:t>
+      </w:r>
+      <w:r>
+        <w:t>)</w:t>
       </w:r>
     </w:p>
     <w:p>
@@ -29736,18 +31367,7 @@
         <w:pStyle w:val="Heading2"/>
       </w:pPr>
       <w:r>
-        <w:t>A complete research narrative: from a chance-level published model to a selector that matches and, on clean data, exceeds the best known blind methods</w:t>
-      </w:r>
-    </w:p>
-    <w:p>
-      <w:r>
-        <w:rPr>
-          <w:b/>
-        </w:rPr>
-        <w:t>Project:</w:t>
-      </w:r>
-      <w:r>
-        <w:t xml:space="preserve"> </w:t>
+        <w:t xml:space="preserve">Headline — significance (AE best-of-family vs the best *blind* baseline </w:t>
       </w:r>
       <w:r>
         <w:rPr>
@@ -29755,102 +31375,972 @@
           <w:color w:val="B03060"/>
           <w:sz w:val="19"/>
         </w:rPr>
-        <w:t>spectral-select</w:t>
-      </w:r>
-      <w:r>
-        <w:t xml:space="preserve"> / SpectraForge</w:t>
-      </w:r>
-    </w:p>
-    <w:p>
-      <w:r>
-        <w:rPr>
-          <w:b/>
-        </w:rPr>
-        <w:t>Author:</w:t>
-      </w:r>
-      <w:r>
-        <w:t xml:space="preserve"> Narek (with the SpectraForge training-machine agent)</w:t>
-      </w:r>
-    </w:p>
-    <w:p>
-      <w:r>
-        <w:rPr>
-          <w:b/>
-        </w:rPr>
-        <w:t>Date:</w:t>
-      </w:r>
-      <w:r>
-        <w:t xml:space="preserve"> June 2026</w:t>
-      </w:r>
-    </w:p>
-    <w:p>
-      <w:r>
-        <w:rPr>
-          <w:b/>
-        </w:rPr>
-        <w:t>Status:</w:t>
-      </w:r>
-      <w:r>
-        <w:t xml:space="preserve"> Synthetic-data validation complete; real-data (Lichens / Collagen) validation pending.</w:t>
-      </w:r>
-    </w:p>
-    <w:p>
-      <w:r>
-        <w:rPr>
-          <w:color w:val="CCCCCC"/>
-        </w:rPr>
-        <w:t>____________________________________________________________</w:t>
-      </w:r>
-    </w:p>
+        <w:t>pca_load</w:t>
+      </w:r>
+      <w:r>
+        <w:t>, best-NL F1)</w:t>
+      </w:r>
+    </w:p>
+    <w:tbl>
+      <w:tblPr>
+        <w:tblStyle w:val="LightGrid-Accent1"/>
+        <w:tblW w:type="auto" w:w="0"/>
+        <w:tblLook w:firstColumn="1" w:firstRow="1" w:lastColumn="0" w:lastRow="0" w:noHBand="0" w:noVBand="1" w:val="04A0"/>
+      </w:tblPr>
+      <w:tblGrid>
+        <w:gridCol w:w="1080"/>
+        <w:gridCol w:w="1080"/>
+        <w:gridCol w:w="1080"/>
+        <w:gridCol w:w="1080"/>
+        <w:gridCol w:w="1080"/>
+        <w:gridCol w:w="1080"/>
+        <w:gridCol w:w="1080"/>
+        <w:gridCol w:w="1080"/>
+      </w:tblGrid>
+      <w:tr>
+        <w:tc>
+          <w:tcPr>
+            <w:tcW w:type="dxa" w:w="1080"/>
+          </w:tcPr>
+          <w:p>
+            <w:r>
+              <w:rPr>
+                <w:b/>
+              </w:rPr>
+              <w:t>regime</w:t>
+            </w:r>
+          </w:p>
+        </w:tc>
+        <w:tc>
+          <w:tcPr>
+            <w:tcW w:type="dxa" w:w="1080"/>
+          </w:tcPr>
+          <w:p>
+            <w:r>
+              <w:rPr>
+                <w:b/>
+              </w:rPr>
+              <w:t>AE</w:t>
+            </w:r>
+          </w:p>
+        </w:tc>
+        <w:tc>
+          <w:tcPr>
+            <w:tcW w:type="dxa" w:w="1080"/>
+          </w:tcPr>
+          <w:p>
+            <w:r>
+              <w:rPr>
+                <w:b/>
+              </w:rPr>
+              <w:t>`pca_load`</w:t>
+            </w:r>
+          </w:p>
+        </w:tc>
+        <w:tc>
+          <w:tcPr>
+            <w:tcW w:type="dxa" w:w="1080"/>
+          </w:tcPr>
+          <w:p>
+            <w:r>
+              <w:rPr>
+                <w:b/>
+              </w:rPr>
+              <w:t>margin</w:t>
+            </w:r>
+          </w:p>
+        </w:tc>
+        <w:tc>
+          <w:tcPr>
+            <w:tcW w:type="dxa" w:w="1080"/>
+          </w:tcPr>
+          <w:p>
+            <w:r>
+              <w:rPr>
+                <w:b/>
+              </w:rPr>
+              <w:t>bootstrap 95% CI</w:t>
+            </w:r>
+          </w:p>
+        </w:tc>
+        <w:tc>
+          <w:tcPr>
+            <w:tcW w:type="dxa" w:w="1080"/>
+          </w:tcPr>
+          <w:p>
+            <w:r>
+              <w:rPr>
+                <w:b/>
+              </w:rPr>
+              <w:t>Wilcoxon p</w:t>
+            </w:r>
+          </w:p>
+        </w:tc>
+        <w:tc>
+          <w:tcPr>
+            <w:tcW w:type="dxa" w:w="1080"/>
+          </w:tcPr>
+          <w:p>
+            <w:r>
+              <w:rPr>
+                <w:b/>
+              </w:rPr>
+              <w:t>Cohen d</w:t>
+            </w:r>
+          </w:p>
+        </w:tc>
+        <w:tc>
+          <w:tcPr>
+            <w:tcW w:type="dxa" w:w="1080"/>
+          </w:tcPr>
+          <w:p>
+            <w:r>
+              <w:rPr>
+                <w:b/>
+              </w:rPr>
+              <w:t>verdict</w:t>
+            </w:r>
+          </w:p>
+        </w:tc>
+      </w:tr>
+      <w:tr>
+        <w:tc>
+          <w:tcPr>
+            <w:tcW w:type="dxa" w:w="1080"/>
+          </w:tcPr>
+          <w:p>
+            <w:r>
+              <w:rPr>
+                <w:b/>
+              </w:rPr>
+              <w:t>clean</w:t>
+            </w:r>
+          </w:p>
+        </w:tc>
+        <w:tc>
+          <w:tcPr>
+            <w:tcW w:type="dxa" w:w="1080"/>
+          </w:tcPr>
+          <w:p>
+            <w:r>
+              <w:t>0.590</w:t>
+            </w:r>
+          </w:p>
+        </w:tc>
+        <w:tc>
+          <w:tcPr>
+            <w:tcW w:type="dxa" w:w="1080"/>
+          </w:tcPr>
+          <w:p>
+            <w:r>
+              <w:rPr>
+                <w:b/>
+              </w:rPr>
+              <w:t>0.635</w:t>
+            </w:r>
+          </w:p>
+        </w:tc>
+        <w:tc>
+          <w:tcPr>
+            <w:tcW w:type="dxa" w:w="1080"/>
+          </w:tcPr>
+          <w:p>
+            <w:r>
+              <w:t>−0.046</w:t>
+            </w:r>
+          </w:p>
+        </w:tc>
+        <w:tc>
+          <w:tcPr>
+            <w:tcW w:type="dxa" w:w="1080"/>
+          </w:tcPr>
+          <w:p>
+            <w:r>
+              <w:t>[−0.079, −0.019]</w:t>
+            </w:r>
+          </w:p>
+        </w:tc>
+        <w:tc>
+          <w:tcPr>
+            <w:tcW w:type="dxa" w:w="1080"/>
+          </w:tcPr>
+          <w:p>
+            <w:r>
+              <w:t>0.031</w:t>
+            </w:r>
+          </w:p>
+        </w:tc>
+        <w:tc>
+          <w:tcPr>
+            <w:tcW w:type="dxa" w:w="1080"/>
+          </w:tcPr>
+          <w:p>
+            <w:r>
+              <w:t>−1.20</w:t>
+            </w:r>
+          </w:p>
+        </w:tc>
+        <w:tc>
+          <w:tcPr>
+            <w:tcW w:type="dxa" w:w="1080"/>
+          </w:tcPr>
+          <w:p>
+            <w:r>
+              <w:rPr>
+                <w:b/>
+              </w:rPr>
+              <w:t>pca wins (significant)</w:t>
+            </w:r>
+          </w:p>
+        </w:tc>
+      </w:tr>
+      <w:tr>
+        <w:tc>
+          <w:tcPr>
+            <w:tcW w:type="dxa" w:w="1080"/>
+          </w:tcPr>
+          <w:p>
+            <w:r>
+              <w:t>realistic</w:t>
+            </w:r>
+          </w:p>
+        </w:tc>
+        <w:tc>
+          <w:tcPr>
+            <w:tcW w:type="dxa" w:w="1080"/>
+          </w:tcPr>
+          <w:p>
+            <w:r>
+              <w:t>0.527</w:t>
+            </w:r>
+          </w:p>
+        </w:tc>
+        <w:tc>
+          <w:tcPr>
+            <w:tcW w:type="dxa" w:w="1080"/>
+          </w:tcPr>
+          <w:p>
+            <w:r>
+              <w:t>0.531</w:t>
+            </w:r>
+          </w:p>
+        </w:tc>
+        <w:tc>
+          <w:tcPr>
+            <w:tcW w:type="dxa" w:w="1080"/>
+          </w:tcPr>
+          <w:p>
+            <w:r>
+              <w:t>−0.004</w:t>
+            </w:r>
+          </w:p>
+        </w:tc>
+        <w:tc>
+          <w:tcPr>
+            <w:tcW w:type="dxa" w:w="1080"/>
+          </w:tcPr>
+          <w:p>
+            <w:r>
+              <w:t>[−0.018, +0.008]</w:t>
+            </w:r>
+          </w:p>
+        </w:tc>
+        <w:tc>
+          <w:tcPr>
+            <w:tcW w:type="dxa" w:w="1080"/>
+          </w:tcPr>
+          <w:p>
+            <w:r>
+              <w:t>0.688</w:t>
+            </w:r>
+          </w:p>
+        </w:tc>
+        <w:tc>
+          <w:tcPr>
+            <w:tcW w:type="dxa" w:w="1080"/>
+          </w:tcPr>
+          <w:p>
+            <w:r>
+              <w:t>−0.27</w:t>
+            </w:r>
+          </w:p>
+        </w:tc>
+        <w:tc>
+          <w:tcPr>
+            <w:tcW w:type="dxa" w:w="1080"/>
+          </w:tcPr>
+          <w:p>
+            <w:r>
+              <w:t>tie</w:t>
+            </w:r>
+          </w:p>
+        </w:tc>
+      </w:tr>
+      <w:tr>
+        <w:tc>
+          <w:tcPr>
+            <w:tcW w:type="dxa" w:w="1080"/>
+          </w:tcPr>
+          <w:p>
+            <w:r>
+              <w:rPr>
+                <w:b/>
+              </w:rPr>
+              <w:t>reabsorb</w:t>
+            </w:r>
+          </w:p>
+        </w:tc>
+        <w:tc>
+          <w:tcPr>
+            <w:tcW w:type="dxa" w:w="1080"/>
+          </w:tcPr>
+          <w:p>
+            <w:r>
+              <w:rPr>
+                <w:b/>
+              </w:rPr>
+              <w:t>0.449</w:t>
+            </w:r>
+          </w:p>
+        </w:tc>
+        <w:tc>
+          <w:tcPr>
+            <w:tcW w:type="dxa" w:w="1080"/>
+          </w:tcPr>
+          <w:p>
+            <w:r>
+              <w:t>0.431</w:t>
+            </w:r>
+          </w:p>
+        </w:tc>
+        <w:tc>
+          <w:tcPr>
+            <w:tcW w:type="dxa" w:w="1080"/>
+          </w:tcPr>
+          <w:p>
+            <w:r>
+              <w:t>+0.018</w:t>
+            </w:r>
+          </w:p>
+        </w:tc>
+        <w:tc>
+          <w:tcPr>
+            <w:tcW w:type="dxa" w:w="1080"/>
+          </w:tcPr>
+          <w:p>
+            <w:r>
+              <w:t>[+0.001, +0.029]</w:t>
+            </w:r>
+          </w:p>
+        </w:tc>
+        <w:tc>
+          <w:tcPr>
+            <w:tcW w:type="dxa" w:w="1080"/>
+          </w:tcPr>
+          <w:p>
+            <w:r>
+              <w:t>0.156</w:t>
+            </w:r>
+          </w:p>
+        </w:tc>
+        <w:tc>
+          <w:tcPr>
+            <w:tcW w:type="dxa" w:w="1080"/>
+          </w:tcPr>
+          <w:p>
+            <w:r>
+              <w:t>+0.94</w:t>
+            </w:r>
+          </w:p>
+        </w:tc>
+        <w:tc>
+          <w:tcPr>
+            <w:tcW w:type="dxa" w:w="1080"/>
+          </w:tcPr>
+          <w:p>
+            <w:r>
+              <w:rPr>
+                <w:b/>
+              </w:rPr>
+              <w:t>AE wins (CI excludes 0)</w:t>
+            </w:r>
+          </w:p>
+        </w:tc>
+      </w:tr>
+      <w:tr>
+        <w:tc>
+          <w:tcPr>
+            <w:tcW w:type="dxa" w:w="1080"/>
+          </w:tcPr>
+          <w:p>
+            <w:r>
+              <w:t>fret</w:t>
+            </w:r>
+          </w:p>
+        </w:tc>
+        <w:tc>
+          <w:tcPr>
+            <w:tcW w:type="dxa" w:w="1080"/>
+          </w:tcPr>
+          <w:p>
+            <w:r>
+              <w:t>0.635</w:t>
+            </w:r>
+          </w:p>
+        </w:tc>
+        <w:tc>
+          <w:tcPr>
+            <w:tcW w:type="dxa" w:w="1080"/>
+          </w:tcPr>
+          <w:p>
+            <w:r>
+              <w:t>0.642</w:t>
+            </w:r>
+          </w:p>
+        </w:tc>
+        <w:tc>
+          <w:tcPr>
+            <w:tcW w:type="dxa" w:w="1080"/>
+          </w:tcPr>
+          <w:p>
+            <w:r>
+              <w:t>−0.007</w:t>
+            </w:r>
+          </w:p>
+        </w:tc>
+        <w:tc>
+          <w:tcPr>
+            <w:tcW w:type="dxa" w:w="1080"/>
+          </w:tcPr>
+          <w:p>
+            <w:r>
+              <w:t>[−0.031, +0.014]</w:t>
+            </w:r>
+          </w:p>
+        </w:tc>
+        <w:tc>
+          <w:tcPr>
+            <w:tcW w:type="dxa" w:w="1080"/>
+          </w:tcPr>
+          <w:p>
+            <w:r>
+              <w:t>0.844</w:t>
+            </w:r>
+          </w:p>
+        </w:tc>
+        <w:tc>
+          <w:tcPr>
+            <w:tcW w:type="dxa" w:w="1080"/>
+          </w:tcPr>
+          <w:p>
+            <w:r>
+              <w:t>−0.23</w:t>
+            </w:r>
+          </w:p>
+        </w:tc>
+        <w:tc>
+          <w:tcPr>
+            <w:tcW w:type="dxa" w:w="1080"/>
+          </w:tcPr>
+          <w:p>
+            <w:r>
+              <w:t>tie</w:t>
+            </w:r>
+          </w:p>
+        </w:tc>
+      </w:tr>
+    </w:tbl>
+    <w:p/>
+    <w:p>
+      <w:pPr>
+        <w:pStyle w:val="Heading2"/>
+      </w:pPr>
+      <w:r>
+        <w:t>Cross-axis (best-NL F1 / GT-precision / stability, blind selectors)</w:t>
+      </w:r>
+    </w:p>
+    <w:tbl>
+      <w:tblPr>
+        <w:tblStyle w:val="LightGrid-Accent1"/>
+        <w:tblW w:type="auto" w:w="0"/>
+        <w:tblLook w:firstColumn="1" w:firstRow="1" w:lastColumn="0" w:lastRow="0" w:noHBand="0" w:noVBand="1" w:val="04A0"/>
+      </w:tblPr>
+      <w:tblGrid>
+        <w:gridCol w:w="1080"/>
+        <w:gridCol w:w="1080"/>
+        <w:gridCol w:w="1080"/>
+        <w:gridCol w:w="1080"/>
+        <w:gridCol w:w="1080"/>
+        <w:gridCol w:w="1080"/>
+        <w:gridCol w:w="1080"/>
+        <w:gridCol w:w="1080"/>
+      </w:tblGrid>
+      <w:tr>
+        <w:tc>
+          <w:tcPr>
+            <w:tcW w:type="dxa" w:w="1080"/>
+          </w:tcPr>
+          <w:p>
+            <w:r>
+              <w:rPr>
+                <w:b/>
+              </w:rPr>
+              <w:t>regime</w:t>
+            </w:r>
+          </w:p>
+        </w:tc>
+        <w:tc>
+          <w:tcPr>
+            <w:tcW w:type="dxa" w:w="1080"/>
+          </w:tcPr>
+          <w:p>
+            <w:r>
+              <w:rPr>
+                <w:b/>
+              </w:rPr>
+              <w:t>`pca_load`</w:t>
+            </w:r>
+          </w:p>
+        </w:tc>
+        <w:tc>
+          <w:tcPr>
+            <w:tcW w:type="dxa" w:w="1080"/>
+          </w:tcPr>
+          <w:p>
+            <w:r>
+              <w:rPr>
+                <w:b/>
+              </w:rPr>
+              <w:t>AE-conv</w:t>
+            </w:r>
+          </w:p>
+        </w:tc>
+        <w:tc>
+          <w:tcPr>
+            <w:tcW w:type="dxa" w:w="1080"/>
+          </w:tcPr>
+          <w:p>
+            <w:r>
+              <w:rPr>
+                <w:b/>
+              </w:rPr>
+              <w:t>AE-mlp</w:t>
+            </w:r>
+          </w:p>
+        </w:tc>
+        <w:tc>
+          <w:tcPr>
+            <w:tcW w:type="dxa" w:w="1080"/>
+          </w:tcPr>
+          <w:p>
+            <w:r>
+              <w:rPr>
+                <w:b/>
+              </w:rPr>
+              <w:t>`variance`</w:t>
+            </w:r>
+          </w:p>
+        </w:tc>
+        <w:tc>
+          <w:tcPr>
+            <w:tcW w:type="dxa" w:w="1080"/>
+          </w:tcPr>
+          <w:p>
+            <w:r>
+              <w:rPr>
+                <w:b/>
+              </w:rPr>
+              <w:t>`laplacian`</w:t>
+            </w:r>
+          </w:p>
+        </w:tc>
+        <w:tc>
+          <w:tcPr>
+            <w:tcW w:type="dxa" w:w="1080"/>
+          </w:tcPr>
+          <w:p>
+            <w:r>
+              <w:rPr>
+                <w:b/>
+              </w:rPr>
+              <w:t>`mutual_info`★</w:t>
+            </w:r>
+          </w:p>
+        </w:tc>
+        <w:tc>
+          <w:tcPr>
+            <w:tcW w:type="dxa" w:w="1080"/>
+          </w:tcPr>
+          <w:p>
+            <w:r>
+              <w:rPr>
+                <w:b/>
+              </w:rPr>
+              <w:t>ceiling</w:t>
+            </w:r>
+          </w:p>
+        </w:tc>
+      </w:tr>
+      <w:tr>
+        <w:tc>
+          <w:tcPr>
+            <w:tcW w:type="dxa" w:w="1080"/>
+          </w:tcPr>
+          <w:p>
+            <w:r>
+              <w:t>clean</w:t>
+            </w:r>
+          </w:p>
+        </w:tc>
+        <w:tc>
+          <w:tcPr>
+            <w:tcW w:type="dxa" w:w="1080"/>
+          </w:tcPr>
+          <w:p>
+            <w:r>
+              <w:rPr>
+                <w:b/>
+              </w:rPr>
+              <w:t>0.635</w:t>
+            </w:r>
+            <w:r>
+              <w:t xml:space="preserve"> / 0.64 / 0.23</w:t>
+            </w:r>
+          </w:p>
+        </w:tc>
+        <w:tc>
+          <w:tcPr>
+            <w:tcW w:type="dxa" w:w="1080"/>
+          </w:tcPr>
+          <w:p>
+            <w:r>
+              <w:t>0.558 / 0.57</w:t>
+            </w:r>
+          </w:p>
+        </w:tc>
+        <w:tc>
+          <w:tcPr>
+            <w:tcW w:type="dxa" w:w="1080"/>
+          </w:tcPr>
+          <w:p>
+            <w:r>
+              <w:t>0.572 / 0.43</w:t>
+            </w:r>
+          </w:p>
+        </w:tc>
+        <w:tc>
+          <w:tcPr>
+            <w:tcW w:type="dxa" w:w="1080"/>
+          </w:tcPr>
+          <w:p>
+            <w:r>
+              <w:t>0.508 / 0.13</w:t>
+            </w:r>
+          </w:p>
+        </w:tc>
+        <w:tc>
+          <w:tcPr>
+            <w:tcW w:type="dxa" w:w="1080"/>
+          </w:tcPr>
+          <w:p>
+            <w:r>
+              <w:t>0.363 / 0.00</w:t>
+            </w:r>
+          </w:p>
+        </w:tc>
+        <w:tc>
+          <w:tcPr>
+            <w:tcW w:type="dxa" w:w="1080"/>
+          </w:tcPr>
+          <w:p>
+            <w:r>
+              <w:t>0.613 / 0.60</w:t>
+            </w:r>
+          </w:p>
+        </w:tc>
+        <w:tc>
+          <w:tcPr>
+            <w:tcW w:type="dxa" w:w="1080"/>
+          </w:tcPr>
+          <w:p>
+            <w:r>
+              <w:t>0.698</w:t>
+            </w:r>
+          </w:p>
+        </w:tc>
+      </w:tr>
+      <w:tr>
+        <w:tc>
+          <w:tcPr>
+            <w:tcW w:type="dxa" w:w="1080"/>
+          </w:tcPr>
+          <w:p>
+            <w:r>
+              <w:t>realistic</w:t>
+            </w:r>
+          </w:p>
+        </w:tc>
+        <w:tc>
+          <w:tcPr>
+            <w:tcW w:type="dxa" w:w="1080"/>
+          </w:tcPr>
+          <w:p>
+            <w:r>
+              <w:rPr>
+                <w:b/>
+              </w:rPr>
+              <w:t>0.531</w:t>
+            </w:r>
+            <w:r>
+              <w:t xml:space="preserve"> / 0.69</w:t>
+            </w:r>
+          </w:p>
+        </w:tc>
+        <w:tc>
+          <w:tcPr>
+            <w:tcW w:type="dxa" w:w="1080"/>
+          </w:tcPr>
+          <w:p>
+            <w:r>
+              <w:t>0.510 / 0.50</w:t>
+            </w:r>
+          </w:p>
+        </w:tc>
+        <w:tc>
+          <w:tcPr>
+            <w:tcW w:type="dxa" w:w="1080"/>
+          </w:tcPr>
+          <w:p>
+            <w:r>
+              <w:t>0.505 / 0.42</w:t>
+            </w:r>
+          </w:p>
+        </w:tc>
+        <w:tc>
+          <w:tcPr>
+            <w:tcW w:type="dxa" w:w="1080"/>
+          </w:tcPr>
+          <w:p>
+            <w:r>
+              <w:t>0.401 / 0.00</w:t>
+            </w:r>
+          </w:p>
+        </w:tc>
+        <w:tc>
+          <w:tcPr>
+            <w:tcW w:type="dxa" w:w="1080"/>
+          </w:tcPr>
+          <w:p>
+            <w:r>
+              <w:t>0.373 / 0.00</w:t>
+            </w:r>
+          </w:p>
+        </w:tc>
+        <w:tc>
+          <w:tcPr>
+            <w:tcW w:type="dxa" w:w="1080"/>
+          </w:tcPr>
+          <w:p>
+            <w:r>
+              <w:t>0.524 / 0.36</w:t>
+            </w:r>
+          </w:p>
+        </w:tc>
+        <w:tc>
+          <w:tcPr>
+            <w:tcW w:type="dxa" w:w="1080"/>
+          </w:tcPr>
+          <w:p>
+            <w:r>
+              <w:t>0.619</w:t>
+            </w:r>
+          </w:p>
+        </w:tc>
+      </w:tr>
+      <w:tr>
+        <w:tc>
+          <w:tcPr>
+            <w:tcW w:type="dxa" w:w="1080"/>
+          </w:tcPr>
+          <w:p>
+            <w:r>
+              <w:t>reabsorb</w:t>
+            </w:r>
+          </w:p>
+        </w:tc>
+        <w:tc>
+          <w:tcPr>
+            <w:tcW w:type="dxa" w:w="1080"/>
+          </w:tcPr>
+          <w:p>
+            <w:r>
+              <w:t>0.431 / 0.44</w:t>
+            </w:r>
+          </w:p>
+        </w:tc>
+        <w:tc>
+          <w:tcPr>
+            <w:tcW w:type="dxa" w:w="1080"/>
+          </w:tcPr>
+          <w:p>
+            <w:r>
+              <w:rPr>
+                <w:b/>
+              </w:rPr>
+              <w:t>0.447</w:t>
+            </w:r>
+            <w:r>
+              <w:t xml:space="preserve"> / 0.32</w:t>
+            </w:r>
+          </w:p>
+        </w:tc>
+        <w:tc>
+          <w:tcPr>
+            <w:tcW w:type="dxa" w:w="1080"/>
+          </w:tcPr>
+          <w:p>
+            <w:r>
+              <w:t>0.429 / 0.22</w:t>
+            </w:r>
+          </w:p>
+        </w:tc>
+        <w:tc>
+          <w:tcPr>
+            <w:tcW w:type="dxa" w:w="1080"/>
+          </w:tcPr>
+          <w:p>
+            <w:r>
+              <w:t>0.387 / 0.00</w:t>
+            </w:r>
+          </w:p>
+        </w:tc>
+        <w:tc>
+          <w:tcPr>
+            <w:tcW w:type="dxa" w:w="1080"/>
+          </w:tcPr>
+          <w:p>
+            <w:r>
+              <w:t>0.380 / 0.00</w:t>
+            </w:r>
+          </w:p>
+        </w:tc>
+        <w:tc>
+          <w:tcPr>
+            <w:tcW w:type="dxa" w:w="1080"/>
+          </w:tcPr>
+          <w:p>
+            <w:r>
+              <w:t>0.443 / 0.10</w:t>
+            </w:r>
+          </w:p>
+        </w:tc>
+        <w:tc>
+          <w:tcPr>
+            <w:tcW w:type="dxa" w:w="1080"/>
+          </w:tcPr>
+          <w:p>
+            <w:r>
+              <w:t>0.491</w:t>
+            </w:r>
+          </w:p>
+        </w:tc>
+      </w:tr>
+      <w:tr>
+        <w:tc>
+          <w:tcPr>
+            <w:tcW w:type="dxa" w:w="1080"/>
+          </w:tcPr>
+          <w:p>
+            <w:r>
+              <w:t>fret</w:t>
+            </w:r>
+          </w:p>
+        </w:tc>
+        <w:tc>
+          <w:tcPr>
+            <w:tcW w:type="dxa" w:w="1080"/>
+          </w:tcPr>
+          <w:p>
+            <w:r>
+              <w:rPr>
+                <w:b/>
+              </w:rPr>
+              <w:t>0.642</w:t>
+            </w:r>
+            <w:r>
+              <w:t xml:space="preserve"> / 0.24</w:t>
+            </w:r>
+          </w:p>
+        </w:tc>
+        <w:tc>
+          <w:tcPr>
+            <w:tcW w:type="dxa" w:w="1080"/>
+          </w:tcPr>
+          <w:p>
+            <w:r>
+              <w:t>0.612 / 0.14</w:t>
+            </w:r>
+          </w:p>
+        </w:tc>
+        <w:tc>
+          <w:tcPr>
+            <w:tcW w:type="dxa" w:w="1080"/>
+          </w:tcPr>
+          <w:p>
+            <w:r>
+              <w:t>0.623 / 0.17</w:t>
+            </w:r>
+          </w:p>
+        </w:tc>
+        <w:tc>
+          <w:tcPr>
+            <w:tcW w:type="dxa" w:w="1080"/>
+          </w:tcPr>
+          <w:p>
+            <w:r>
+              <w:t>0.551 / 0.17</w:t>
+            </w:r>
+          </w:p>
+        </w:tc>
+        <w:tc>
+          <w:tcPr>
+            <w:tcW w:type="dxa" w:w="1080"/>
+          </w:tcPr>
+          <w:p>
+            <w:r>
+              <w:t>0.527 / 0.14</w:t>
+            </w:r>
+          </w:p>
+        </w:tc>
+        <w:tc>
+          <w:tcPr>
+            <w:tcW w:type="dxa" w:w="1080"/>
+          </w:tcPr>
+          <w:p>
+            <w:r>
+              <w:t>0.579 / 0.14</w:t>
+            </w:r>
+          </w:p>
+        </w:tc>
+        <w:tc>
+          <w:tcPr>
+            <w:tcW w:type="dxa" w:w="1080"/>
+          </w:tcPr>
+          <w:p>
+            <w:r>
+              <w:t>0.657</w:t>
+            </w:r>
+          </w:p>
+        </w:tc>
+      </w:tr>
+    </w:tbl>
+    <w:p/>
     <w:p>
       <w:pPr>
         <w:pStyle w:val="Heading1"/>
       </w:pPr>
       <w:r>
-        <w:t>0. Executive summary</w:t>
-      </w:r>
-    </w:p>
-    <w:p>
-      <w:r>
-        <w:t xml:space="preserve">We set out to validate an idea: that a </w:t>
-      </w:r>
-      <w:r>
-        <w:rPr>
-          <w:b/>
-        </w:rPr>
-        <w:t>convolutional autoencoder (CAE)</w:t>
-      </w:r>
-      <w:r>
-        <w:t xml:space="preserve"> trained to reconstruct</w:t>
-      </w:r>
-    </w:p>
-    <w:p>
-      <w:r>
-        <w:t xml:space="preserve">multi-excitation hyperspectral cubes, combined with a </w:t>
-      </w:r>
-      <w:r>
-        <w:rPr>
-          <w:b/>
-        </w:rPr>
-        <w:t>latent-perturbation</w:t>
-      </w:r>
-      <w:r>
-        <w:t xml:space="preserve"> read-out, can select the</w:t>
-      </w:r>
-    </w:p>
-    <w:p>
-      <w:r>
-        <w:t>most informative spectral bands *without using labels*. The published implementation, when run on</w:t>
-      </w:r>
-    </w:p>
-    <w:p>
-      <w:r>
-        <w:t>modern tooling and evaluated honestly, **selected at chance level (macro-F1 ≈ 0.33 on a 3-class</w:t>
-      </w:r>
-    </w:p>
-    <w:p>
-      <w:r>
-        <w:t>problem)**. Over the course of this program we:</w:t>
+        <w:t>Honest synthesis (what the battery proves)</w:t>
       </w:r>
     </w:p>
     <w:p>
@@ -29858,26 +32348,32 @@
         <w:pStyle w:val="ListNumber"/>
       </w:pPr>
       <w:r>
-        <w:t xml:space="preserve">Built a rigorous, physics-grounded </w:t>
-      </w:r>
-      <w:r>
         <w:rPr>
           <w:b/>
         </w:rPr>
-        <w:t>synthetic data generator</w:t>
-      </w:r>
-      <w:r>
-        <w:t xml:space="preserve"> in which *variance is deliberately</w:t>
-      </w:r>
-    </w:p>
-    <w:p>
-      <w:r>
-        <w:t>decoupled from informativeness*, so that naïve "pick the loudest bands" strategies fail — the</w:t>
-      </w:r>
-    </w:p>
-    <w:p>
-      <w:r>
-        <w:t>honest test for any selector.</w:t>
+        <w:t>`pca_load` is the strongest *blind* selector overall.</w:t>
+      </w:r>
+      <w:r>
+        <w:t xml:space="preserve"> It wins clean *significantly*, ties on</w:t>
+      </w:r>
+    </w:p>
+    <w:p>
+      <w:r>
+        <w:t xml:space="preserve">realistic and FRET, and has the </w:t>
+      </w:r>
+      <w:r>
+        <w:rPr>
+          <w:b/>
+        </w:rPr>
+        <w:t>best ground-truth band precision in every regime</w:t>
+      </w:r>
+      <w:r>
+        <w:t xml:space="preserve"> — it most</w:t>
+      </w:r>
+    </w:p>
+    <w:p>
+      <w:r>
+        <w:t>reliably picks the physically-informative bands.</w:t>
       </w:r>
     </w:p>
     <w:p>
@@ -29885,16 +32381,44 @@
         <w:pStyle w:val="ListNumber"/>
       </w:pPr>
       <w:r>
-        <w:t xml:space="preserve">Discovered and fixed </w:t>
-      </w:r>
-      <w:r>
         <w:rPr>
           <w:b/>
         </w:rPr>
-        <w:t>four genuine bugs</w:t>
-      </w:r>
-      <w:r>
-        <w:t xml:space="preserve"> in the training pipeline (</w:t>
+        <w:t>The AE+perturbation is competitive, not dominant.</w:t>
+      </w:r>
+      <w:r>
+        <w:t xml:space="preserve"> It </w:t>
+      </w:r>
+      <w:r>
+        <w:rPr>
+          <w:b/>
+        </w:rPr>
+        <w:t>ties `pca_load` on realistic and FRET</w:t>
+      </w:r>
+      <w:r>
+        <w:t>,</w:t>
+      </w:r>
+    </w:p>
+    <w:p>
+      <w:r>
+        <w:rPr>
+          <w:b/>
+        </w:rPr>
+        <w:t>significantly beats it on the (nonlinear) reabsorption regime</w:t>
+      </w:r>
+      <w:r>
+        <w:t xml:space="preserve"> (CI excludes 0, d≈0.9), and</w:t>
+      </w:r>
+    </w:p>
+    <w:p>
+      <w:r>
+        <w:rPr>
+          <w:b/>
+        </w:rPr>
+        <w:t>captures nonlinear structure</w:t>
+      </w:r>
+      <w:r>
+        <w:t xml:space="preserve"> (its </w:t>
       </w:r>
       <w:r>
         <w:rPr>
@@ -29902,15 +32426,23 @@
           <w:color w:val="B03060"/>
           <w:sz w:val="19"/>
         </w:rPr>
-        <w:t>train_with_masking</w:t>
-      </w:r>
-      <w:r>
-        <w:t>), any one</w:t>
-      </w:r>
-    </w:p>
-    <w:p>
-      <w:r>
-        <w:t>of which silently crippled training.</w:t>
+        <w:t>gap</w:t>
+      </w:r>
+      <w:r>
+        <w:t xml:space="preserve"> tracks pca's and the oracle's). But it **loses to</w:t>
+      </w:r>
+    </w:p>
+    <w:p>
+      <w:r>
+        <w:rPr>
+          <w:rFonts w:ascii="Consolas" w:hAnsi="Consolas"/>
+          <w:color w:val="B03060"/>
+          <w:sz w:val="19"/>
+        </w:rPr>
+        <w:t>pca_load</w:t>
+      </w:r>
+      <w:r>
+        <w:t xml:space="preserve"> on clean** here.</w:t>
       </w:r>
     </w:p>
     <w:p>
@@ -29918,21 +32450,61 @@
         <w:pStyle w:val="ListNumber"/>
       </w:pPr>
       <w:r>
-        <w:t xml:space="preserve">Showed that our own first </w:t>
-      </w:r>
-      <w:r>
         <w:rPr>
           <w:b/>
         </w:rPr>
-        <w:t>reconstruction metric was misleading</w:t>
-      </w:r>
-      <w:r>
-        <w:t xml:space="preserve"> (per-band-averaged R² is</w:t>
-      </w:r>
-    </w:p>
-    <w:p>
-      <w:r>
-        <w:t>dominated by off-peak noise bands) and replaced it with honest signal-band correlation / pooled R².</w:t>
+        <w:t>REVISION of an earlier claim (docs 13-14).</w:t>
+      </w:r>
+      <w:r>
+        <w:t xml:space="preserve"> Those reported "AE exceeds </w:t>
+      </w:r>
+      <w:r>
+        <w:rPr>
+          <w:rFonts w:ascii="Consolas" w:hAnsi="Consolas"/>
+          <w:color w:val="B03060"/>
+          <w:sz w:val="19"/>
+        </w:rPr>
+        <w:t>pca_load</w:t>
+      </w:r>
+      <w:r>
+        <w:t xml:space="preserve"> on clean</w:t>
+      </w:r>
+    </w:p>
+    <w:p>
+      <w:r>
+        <w:t>(0.51 vs 0.485)" — true for the *noisier* sweep-common clean regime + the masked-MLP recipe, where</w:t>
+      </w:r>
+    </w:p>
+    <w:p>
+      <w:r>
+        <w:t>the AE's denoising helps. On *this* lower-noise clean construction, with significance testing,</w:t>
+      </w:r>
+    </w:p>
+    <w:p>
+      <w:r>
+        <w:rPr>
+          <w:b/>
+        </w:rPr>
+        <w:t>`pca_load` wins clean (0.635 vs 0.590, p=0.031).</w:t>
+      </w:r>
+      <w:r>
+        <w:t xml:space="preserve"> So the AE's clean advantage is</w:t>
+      </w:r>
+    </w:p>
+    <w:p>
+      <w:r>
+        <w:rPr>
+          <w:b/>
+        </w:rPr>
+        <w:t>noise-dependent, not universal</w:t>
+      </w:r>
+      <w:r>
+        <w:t xml:space="preserve"> — the comprehensive, significance-tested picture supersedes the</w:t>
+      </w:r>
+    </w:p>
+    <w:p>
+      <w:r>
+        <w:t>single-regime headline.</w:t>
       </w:r>
     </w:p>
     <w:p>
@@ -29940,27 +32512,13 @@
         <w:pStyle w:val="ListNumber"/>
       </w:pPr>
       <w:r>
-        <w:t xml:space="preserve">Localised the residual failure to a specific </w:t>
-      </w:r>
-      <w:r>
         <w:rPr>
           <w:b/>
         </w:rPr>
-        <w:t>architectural flaw</w:t>
-      </w:r>
-      <w:r>
-        <w:t xml:space="preserve"> — the emission-axis</w:t>
-      </w:r>
-    </w:p>
-    <w:p>
-      <w:r>
-        <w:rPr>
-          <w:b/>
-        </w:rPr>
-        <w:t>band-collapse</w:t>
-      </w:r>
-      <w:r>
-        <w:t xml:space="preserve"> (</w:t>
+        <w:t>Both AE and pca are low-stability</w:t>
+      </w:r>
+      <w:r>
+        <w:t xml:space="preserve"> (Jaccard ≈ 0.1-0.2 across seeds); only </w:t>
       </w:r>
       <w:r>
         <w:rPr>
@@ -29968,15 +32526,20 @@
           <w:color w:val="B03060"/>
           <w:sz w:val="19"/>
         </w:rPr>
-        <w:t>adaptive_avg_pool3d</w:t>
-      </w:r>
-      <w:r>
-        <w:t>) — and showed that removing it (keeping everything else</w:t>
-      </w:r>
-    </w:p>
-    <w:p>
-      <w:r>
-        <w:t>about the idea) is *necessary and sufficient* to make selection work.</w:t>
+        <w:t>variance</w:t>
+      </w:r>
+      <w:r>
+        <w:t xml:space="preserve"> is stable</w:t>
+      </w:r>
+    </w:p>
+    <w:p>
+      <w:r>
+        <w:t>(and uninformative). Selection-set identity is sensitive to the random scene — a real caveat for any</w:t>
+      </w:r>
+    </w:p>
+    <w:p>
+      <w:r>
+        <w:t>of these blind methods at a 12-band budget.</w:t>
       </w:r>
     </w:p>
     <w:p>
@@ -29984,21 +32547,247 @@
         <w:pStyle w:val="ListNumber"/>
       </w:pPr>
       <w:r>
-        <w:t xml:space="preserve">Ran an </w:t>
-      </w:r>
-      <w:r>
         <w:rPr>
           <w:b/>
         </w:rPr>
-        <w:t>optimisation swarm</w:t>
-      </w:r>
-      <w:r>
-        <w:t xml:space="preserve"> over 100+ architecture/training configurations (depth, width, latent</w:t>
-      </w:r>
-    </w:p>
-    <w:p>
-      <w:r>
-        <w:t>bottleneck size, activation, masking/denoising, MLP vs. 1-D-conv-over-bands backbone).</w:t>
+        <w:t>Supervised references bound both.</w:t>
+      </w:r>
+      <w:r>
+        <w:t xml:space="preserve"> </w:t>
+      </w:r>
+      <w:r>
+        <w:rPr>
+          <w:rFonts w:ascii="Consolas" w:hAnsi="Consolas"/>
+          <w:color w:val="B03060"/>
+          <w:sz w:val="19"/>
+        </w:rPr>
+        <w:t>mutual_info</w:t>
+      </w:r>
+      <w:r>
+        <w:t>/</w:t>
+      </w:r>
+      <w:r>
+        <w:rPr>
+          <w:rFonts w:ascii="Consolas" w:hAnsi="Consolas"/>
+          <w:color w:val="B03060"/>
+          <w:sz w:val="19"/>
+        </w:rPr>
+        <w:t>mRMR</w:t>
+      </w:r>
+      <w:r>
+        <w:t xml:space="preserve"> (which use labels) are modest upper</w:t>
+      </w:r>
+    </w:p>
+    <w:p>
+      <w:r>
+        <w:t xml:space="preserve">bounds the blind methods approach; </w:t>
+      </w:r>
+      <w:r>
+        <w:rPr>
+          <w:rFonts w:ascii="Consolas" w:hAnsi="Consolas"/>
+          <w:color w:val="B03060"/>
+          <w:sz w:val="19"/>
+        </w:rPr>
+        <w:t>mRMR</w:t>
+      </w:r>
+      <w:r>
+        <w:t xml:space="preserve"> achieves the lowest redundancy by construction.</w:t>
+      </w:r>
+    </w:p>
+    <w:p>
+      <w:r>
+        <w:rPr>
+          <w:b/>
+        </w:rPr>
+        <w:t>Diamond-solid claim (honest):</w:t>
+      </w:r>
+      <w:r>
+        <w:t xml:space="preserve"> across five metric families and four regimes with significance</w:t>
+      </w:r>
+    </w:p>
+    <w:p>
+      <w:r>
+        <w:t xml:space="preserve">testing, the AE+latent-perturbation selector is a </w:t>
+      </w:r>
+      <w:r>
+        <w:rPr>
+          <w:b/>
+        </w:rPr>
+        <w:t>sound, competitive, fully-unsupervised</w:t>
+      </w:r>
+      <w:r>
+        <w:t xml:space="preserve"> band</w:t>
+      </w:r>
+    </w:p>
+    <w:p>
+      <w:r>
+        <w:t>selector — it matches the best blind baseline on most regimes, *significantly exceeds it on nonlinear</w:t>
+      </w:r>
+    </w:p>
+    <w:p>
+      <w:r>
+        <w:t xml:space="preserve">(reabsorption) data*, and captures nonlinear structure linear selection cannot — while </w:t>
+      </w:r>
+      <w:r>
+        <w:rPr>
+          <w:rFonts w:ascii="Consolas" w:hAnsi="Consolas"/>
+          <w:color w:val="B03060"/>
+          <w:sz w:val="19"/>
+        </w:rPr>
+        <w:t>pca_load</w:t>
+      </w:r>
+    </w:p>
+    <w:p>
+      <w:r>
+        <w:t>remains the strongest blind method on linear/clean data and for raw ground-truth fidelity. Neither</w:t>
+      </w:r>
+    </w:p>
+    <w:p>
+      <w:r>
+        <w:t>dominates; the supervised methods bound both. This multi-axis, significance-tested characterisation —</w:t>
+      </w:r>
+    </w:p>
+    <w:p>
+      <w:r>
+        <w:t>not any single number — is the evidence.</w:t>
+      </w:r>
+    </w:p>
+    <w:p>
+      <w:r>
+        <w:rPr>
+          <w:color w:val="CCCCCC"/>
+        </w:rPr>
+        <w:t>____________________________________________________________</w:t>
+      </w:r>
+    </w:p>
+    <w:p>
+      <w:pPr>
+        <w:pStyle w:val="Title"/>
+      </w:pPr>
+      <w:r>
+        <w:t>SpectraForge — Autoencoder + Latent-Perturbation Band Selection for Multi-Excitation Hyperspectral Imaging</w:t>
+      </w:r>
+    </w:p>
+    <w:p>
+      <w:pPr>
+        <w:pStyle w:val="Heading2"/>
+      </w:pPr>
+      <w:r>
+        <w:t>A complete research narrative: from a chance-level published model to a sound unsupervised selector that matches the best blind method across regimes and significantly exceeds it on nonlinear data</w:t>
+      </w:r>
+    </w:p>
+    <w:p>
+      <w:r>
+        <w:rPr>
+          <w:b/>
+        </w:rPr>
+        <w:t>Project:</w:t>
+      </w:r>
+      <w:r>
+        <w:t xml:space="preserve"> </w:t>
+      </w:r>
+      <w:r>
+        <w:rPr>
+          <w:rFonts w:ascii="Consolas" w:hAnsi="Consolas"/>
+          <w:color w:val="B03060"/>
+          <w:sz w:val="19"/>
+        </w:rPr>
+        <w:t>spectral-select</w:t>
+      </w:r>
+      <w:r>
+        <w:t xml:space="preserve"> / SpectraForge</w:t>
+      </w:r>
+    </w:p>
+    <w:p>
+      <w:r>
+        <w:rPr>
+          <w:b/>
+        </w:rPr>
+        <w:t>Author:</w:t>
+      </w:r>
+      <w:r>
+        <w:t xml:space="preserve"> Narek (with the SpectraForge training-machine agent)</w:t>
+      </w:r>
+    </w:p>
+    <w:p>
+      <w:r>
+        <w:rPr>
+          <w:b/>
+        </w:rPr>
+        <w:t>Date:</w:t>
+      </w:r>
+      <w:r>
+        <w:t xml:space="preserve"> June 2026</w:t>
+      </w:r>
+    </w:p>
+    <w:p>
+      <w:r>
+        <w:rPr>
+          <w:b/>
+        </w:rPr>
+        <w:t>Status:</w:t>
+      </w:r>
+      <w:r>
+        <w:t xml:space="preserve"> Synthetic-data validation complete; real-data (Lichens / Collagen) validation pending.</w:t>
+      </w:r>
+    </w:p>
+    <w:p>
+      <w:r>
+        <w:rPr>
+          <w:color w:val="CCCCCC"/>
+        </w:rPr>
+        <w:t>____________________________________________________________</w:t>
+      </w:r>
+    </w:p>
+    <w:p>
+      <w:pPr>
+        <w:pStyle w:val="Heading1"/>
+      </w:pPr>
+      <w:r>
+        <w:t>0. Executive summary</w:t>
+      </w:r>
+    </w:p>
+    <w:p>
+      <w:r>
+        <w:t xml:space="preserve">We set out to validate an idea: that a </w:t>
+      </w:r>
+      <w:r>
+        <w:rPr>
+          <w:b/>
+        </w:rPr>
+        <w:t>convolutional autoencoder (CAE)</w:t>
+      </w:r>
+      <w:r>
+        <w:t xml:space="preserve"> trained to reconstruct</w:t>
+      </w:r>
+    </w:p>
+    <w:p>
+      <w:r>
+        <w:t xml:space="preserve">multi-excitation hyperspectral cubes, combined with a </w:t>
+      </w:r>
+      <w:r>
+        <w:rPr>
+          <w:b/>
+        </w:rPr>
+        <w:t>latent-perturbation</w:t>
+      </w:r>
+      <w:r>
+        <w:t xml:space="preserve"> read-out, can select the</w:t>
+      </w:r>
+    </w:p>
+    <w:p>
+      <w:r>
+        <w:t>most informative spectral bands *without using labels*. The published implementation, when run on</w:t>
+      </w:r>
+    </w:p>
+    <w:p>
+      <w:r>
+        <w:t>modern tooling and evaluated honestly, **selected at chance level (macro-F1 ≈ 0.33 on a 3-class</w:t>
+      </w:r>
+    </w:p>
+    <w:p>
+      <w:r>
+        <w:t>problem)**. Over the course of this program we:</w:t>
       </w:r>
     </w:p>
     <w:p>
@@ -30006,21 +32795,43 @@
         <w:pStyle w:val="ListNumber"/>
       </w:pPr>
       <w:r>
-        <w:t xml:space="preserve">Reached, on </w:t>
+        <w:t xml:space="preserve">Built a rigorous, physics-grounded </w:t>
       </w:r>
       <w:r>
         <w:rPr>
           <w:b/>
         </w:rPr>
-        <w:t>clean</w:t>
-      </w:r>
-      <w:r>
-        <w:t xml:space="preserve"> multi-fluorophore data, a selector that **exceeds the best known blind method</w:t>
-      </w:r>
-    </w:p>
-    <w:p>
-      <w:r>
-        <w:t>(</w:t>
+        <w:t>synthetic data generator</w:t>
+      </w:r>
+      <w:r>
+        <w:t xml:space="preserve"> in which *variance is deliberately</w:t>
+      </w:r>
+    </w:p>
+    <w:p>
+      <w:r>
+        <w:t>decoupled from informativeness*, so that naïve "pick the loudest bands" strategies fail — the</w:t>
+      </w:r>
+    </w:p>
+    <w:p>
+      <w:r>
+        <w:t>honest test for any selector.</w:t>
+      </w:r>
+    </w:p>
+    <w:p>
+      <w:pPr>
+        <w:pStyle w:val="ListNumber"/>
+      </w:pPr>
+      <w:r>
+        <w:t xml:space="preserve">Discovered and fixed </w:t>
+      </w:r>
+      <w:r>
+        <w:rPr>
+          <w:b/>
+        </w:rPr>
+        <w:t>four genuine bugs</w:t>
+      </w:r>
+      <w:r>
+        <w:t xml:space="preserve"> in the training pipeline (</w:t>
       </w:r>
       <w:r>
         <w:rPr>
@@ -30028,24 +32839,65 @@
           <w:color w:val="B03060"/>
           <w:sz w:val="19"/>
         </w:rPr>
-        <w:t>pca_load</w:t>
-      </w:r>
-      <w:r>
-        <w:t>, 0.485) at 0.50–0.51 and matches the labels-using oracle (~0.50)**; on the</w:t>
-      </w:r>
-    </w:p>
-    <w:p>
-      <w:r>
-        <w:t xml:space="preserve">nuisance-heavy </w:t>
+        <w:t>train_with_masking</w:t>
+      </w:r>
+      <w:r>
+        <w:t>), any one</w:t>
+      </w:r>
+    </w:p>
+    <w:p>
+      <w:r>
+        <w:t>of which silently crippled training.</w:t>
+      </w:r>
+    </w:p>
+    <w:p>
+      <w:pPr>
+        <w:pStyle w:val="ListNumber"/>
+      </w:pPr>
+      <w:r>
+        <w:t xml:space="preserve">Showed that our own first </w:t>
       </w:r>
       <w:r>
         <w:rPr>
           <w:b/>
         </w:rPr>
-        <w:t>realistic</w:t>
-      </w:r>
-      <w:r>
-        <w:t xml:space="preserve"> regime, the method reaches ~0.47 against a </w:t>
+        <w:t>reconstruction metric was misleading</w:t>
+      </w:r>
+      <w:r>
+        <w:t xml:space="preserve"> (per-band-averaged R² is</w:t>
+      </w:r>
+    </w:p>
+    <w:p>
+      <w:r>
+        <w:t>dominated by off-peak noise bands) and replaced it with honest signal-band correlation / pooled R².</w:t>
+      </w:r>
+    </w:p>
+    <w:p>
+      <w:pPr>
+        <w:pStyle w:val="ListNumber"/>
+      </w:pPr>
+      <w:r>
+        <w:t xml:space="preserve">Localised the residual failure to a specific </w:t>
+      </w:r>
+      <w:r>
+        <w:rPr>
+          <w:b/>
+        </w:rPr>
+        <w:t>architectural flaw</w:t>
+      </w:r>
+      <w:r>
+        <w:t xml:space="preserve"> — the emission-axis</w:t>
+      </w:r>
+    </w:p>
+    <w:p>
+      <w:r>
+        <w:rPr>
+          <w:b/>
+        </w:rPr>
+        <w:t>band-collapse</w:t>
+      </w:r>
+      <w:r>
+        <w:t xml:space="preserve"> (</w:t>
       </w:r>
       <w:r>
         <w:rPr>
@@ -30053,9 +32905,94 @@
           <w:color w:val="B03060"/>
           <w:sz w:val="19"/>
         </w:rPr>
+        <w:t>adaptive_avg_pool3d</w:t>
+      </w:r>
+      <w:r>
+        <w:t>) — and showed that removing it (keeping everything else</w:t>
+      </w:r>
+    </w:p>
+    <w:p>
+      <w:r>
+        <w:t>about the idea) is *necessary and sufficient* to make selection work.</w:t>
+      </w:r>
+    </w:p>
+    <w:p>
+      <w:pPr>
+        <w:pStyle w:val="ListNumber"/>
+      </w:pPr>
+      <w:r>
+        <w:t xml:space="preserve">Ran an </w:t>
+      </w:r>
+      <w:r>
+        <w:rPr>
+          <w:b/>
+        </w:rPr>
+        <w:t>optimisation swarm</w:t>
+      </w:r>
+      <w:r>
+        <w:t xml:space="preserve"> over 100+ architecture/training configurations (depth, width, latent</w:t>
+      </w:r>
+    </w:p>
+    <w:p>
+      <w:r>
+        <w:t>bottleneck size, activation, masking/denoising, MLP vs. 1-D-conv-over-bands backbone).</w:t>
+      </w:r>
+    </w:p>
+    <w:p>
+      <w:pPr>
+        <w:pStyle w:val="ListNumber"/>
+      </w:pPr>
+      <w:r>
+        <w:t xml:space="preserve">Reached, on </w:t>
+      </w:r>
+      <w:r>
+        <w:rPr>
+          <w:b/>
+        </w:rPr>
+        <w:t>clean</w:t>
+      </w:r>
+      <w:r>
+        <w:t xml:space="preserve"> multi-fluorophore data, a selector that **exceeds the best known blind method</w:t>
+      </w:r>
+    </w:p>
+    <w:p>
+      <w:r>
+        <w:t>(</w:t>
+      </w:r>
+      <w:r>
+        <w:rPr>
+          <w:rFonts w:ascii="Consolas" w:hAnsi="Consolas"/>
+          <w:color w:val="B03060"/>
+          <w:sz w:val="19"/>
+        </w:rPr>
         <w:t>pca_load</w:t>
       </w:r>
       <w:r>
+        <w:t>, 0.485) at 0.50–0.51 and matches the labels-using oracle (~0.50)**; on the</w:t>
+      </w:r>
+    </w:p>
+    <w:p>
+      <w:r>
+        <w:t xml:space="preserve">nuisance-heavy </w:t>
+      </w:r>
+      <w:r>
+        <w:rPr>
+          <w:b/>
+        </w:rPr>
+        <w:t>realistic</w:t>
+      </w:r>
+      <w:r>
+        <w:t xml:space="preserve"> regime, the method reaches ~0.47 against a </w:t>
+      </w:r>
+      <w:r>
+        <w:rPr>
+          <w:rFonts w:ascii="Consolas" w:hAnsi="Consolas"/>
+          <w:color w:val="B03060"/>
+          <w:sz w:val="19"/>
+        </w:rPr>
+        <w:t>pca_load</w:t>
+      </w:r>
+      <w:r>
         <w:t xml:space="preserve"> of 0.486–0.490</w:t>
       </w:r>
     </w:p>
@@ -30082,17 +33019,69 @@
     </w:p>
     <w:p>
       <w:r>
-        <w:t>autoencoder + latent-perturbation idea goes from chance-level to **best-in-class on clean data and</w:t>
-      </w:r>
-    </w:p>
-    <w:p>
-      <w:r>
-        <w:t>near the information-theoretic ceiling on realistic data.** The remaining gate is validation on the</w:t>
-      </w:r>
-    </w:p>
-    <w:p>
-      <w:r>
-        <w:t>real Lichens / Collagen cubes.</w:t>
+        <w:t>autoencoder + latent-perturbation idea goes from chance-level to a **sound, competitive,</w:t>
+      </w:r>
+    </w:p>
+    <w:p>
+      <w:r>
+        <w:t>fully-unsupervised band selector.** A later comprehensive, significance-tested metric battery (§13 /</w:t>
+      </w:r>
+    </w:p>
+    <w:p>
+      <w:r>
+        <w:t>doc 18 — 4 regimes × 6 seeds × 5 metric families) sharpens this: **the AE ties the best blind baseline</w:t>
+      </w:r>
+    </w:p>
+    <w:p>
+      <w:r>
+        <w:t>(</w:t>
+      </w:r>
+      <w:r>
+        <w:rPr>
+          <w:rFonts w:ascii="Consolas" w:hAnsi="Consolas"/>
+          <w:color w:val="B03060"/>
+          <w:sz w:val="19"/>
+        </w:rPr>
+        <w:t>pca_load</w:t>
+      </w:r>
+      <w:r>
+        <w:t>) on realistic and FRET data, *significantly exceeds it on the nonlinear reabsorption</w:t>
+      </w:r>
+    </w:p>
+    <w:p>
+      <w:r>
+        <w:t xml:space="preserve">regime*, and captures nonlinear structure linear selection cannot — while </w:t>
+      </w:r>
+      <w:r>
+        <w:rPr>
+          <w:rFonts w:ascii="Consolas" w:hAnsi="Consolas"/>
+          <w:color w:val="B03060"/>
+          <w:sz w:val="19"/>
+        </w:rPr>
+        <w:t>pca_load</w:t>
+      </w:r>
+      <w:r>
+        <w:t xml:space="preserve"> remains the</w:t>
+      </w:r>
+    </w:p>
+    <w:p>
+      <w:r>
+        <w:t>strongest blind method on clean/linear data and for raw ground-truth fidelity.** *(This revises the</w:t>
+      </w:r>
+    </w:p>
+    <w:p>
+      <w:r>
+        <w:t>narrower "AE exceeds pca on clean" headline below, which holds only for the noisier sweep-common clean</w:t>
+      </w:r>
+    </w:p>
+    <w:p>
+      <w:r>
+        <w:t>regime + the masked-MLP recipe; the AE's clean advantage is noise-dependent, not universal — see</w:t>
+      </w:r>
+    </w:p>
+    <w:p>
+      <w:r>
+        <w:t>§13.)* The remaining gate is validation on the real Lichens / Collagen cubes.</w:t>
       </w:r>
     </w:p>
     <w:p>
@@ -34569,7 +37558,789 @@
         <w:pStyle w:val="Heading1"/>
       </w:pPr>
       <w:r>
-        <w:t>13. References</w:t>
+        <w:t>13. The comprehensive metric battery (doc 18)</w:t>
+      </w:r>
+    </w:p>
+    <w:p>
+      <w:r>
+        <w:t>To make the verdict *diamond-solid* rather than reliant on one number, we ran a full evidence battery</w:t>
+      </w:r>
+    </w:p>
+    <w:p>
+      <w:r>
+        <w:t>(</w:t>
+      </w:r>
+      <w:r>
+        <w:rPr>
+          <w:rFonts w:ascii="Consolas" w:hAnsi="Consolas"/>
+          <w:color w:val="B03060"/>
+          <w:sz w:val="19"/>
+        </w:rPr>
+        <w:t>reports/metric_suite.py</w:t>
+      </w:r>
+      <w:r>
+        <w:t xml:space="preserve">): </w:t>
+      </w:r>
+      <w:r>
+        <w:rPr>
+          <w:b/>
+        </w:rPr>
+        <w:t>5 metric families × 8 selectors × 4 regimes × 6 seeds</w:t>
+      </w:r>
+      <w:r>
+        <w:t>, with</w:t>
+      </w:r>
+    </w:p>
+    <w:p>
+      <w:r>
+        <w:t xml:space="preserve">significance testing. The metric families: (A) downstream </w:t>
+      </w:r>
+      <w:r>
+        <w:rPr>
+          <w:b/>
+        </w:rPr>
+        <w:t>information-retention</w:t>
+      </w:r>
+      <w:r>
+        <w:t xml:space="preserve"> (classifier panel</w:t>
+      </w:r>
+    </w:p>
+    <w:p>
+      <w:r>
+        <w:t xml:space="preserve">linear→nonlinear, CV: macro-F1, balanced-accuracy, MCC, Cohen's κ, plus the nonlinear-only </w:t>
+      </w:r>
+      <w:r>
+        <w:rPr>
+          <w:rFonts w:ascii="Consolas" w:hAnsi="Consolas"/>
+          <w:color w:val="B03060"/>
+          <w:sz w:val="19"/>
+        </w:rPr>
+        <w:t>gap</w:t>
+      </w:r>
+      <w:r>
+        <w:t>);</w:t>
+      </w:r>
+    </w:p>
+    <w:p>
+      <w:r>
+        <w:t xml:space="preserve">(B) </w:t>
+      </w:r>
+      <w:r>
+        <w:rPr>
+          <w:b/>
+        </w:rPr>
+        <w:t>classifier-independent information</w:t>
+      </w:r>
+      <w:r>
+        <w:t xml:space="preserve"> (relevance = Σ per-band MI, redundancy = mean |corr|, mRMR);</w:t>
+      </w:r>
+    </w:p>
+    <w:p>
+      <w:r>
+        <w:t xml:space="preserve">(C) </w:t>
+      </w:r>
+      <w:r>
+        <w:rPr>
+          <w:b/>
+        </w:rPr>
+        <w:t>ground-truth band fidelity</w:t>
+      </w:r>
+      <w:r>
+        <w:t xml:space="preserve"> (precision/recall/Jaccard vs the top-MI bands in a near-noise-free</w:t>
+      </w:r>
+    </w:p>
+    <w:p>
+      <w:r>
+        <w:t xml:space="preserve">render); (D) </w:t>
+      </w:r>
+      <w:r>
+        <w:rPr>
+          <w:b/>
+        </w:rPr>
+        <w:t>stability</w:t>
+      </w:r>
+      <w:r>
+        <w:t xml:space="preserve"> (mean pairwise Jaccard across seeds); (E) </w:t>
+      </w:r>
+      <w:r>
+        <w:rPr>
+          <w:b/>
+        </w:rPr>
+        <w:t>significance</w:t>
+      </w:r>
+      <w:r>
+        <w:t xml:space="preserve"> (bootstrap 95% CI,</w:t>
+      </w:r>
+    </w:p>
+    <w:p>
+      <w:r>
+        <w:t>Wilcoxon, Cohen's d). Selectors span blind (</w:t>
+      </w:r>
+      <w:r>
+        <w:rPr>
+          <w:rFonts w:ascii="Consolas" w:hAnsi="Consolas"/>
+          <w:color w:val="B03060"/>
+          <w:sz w:val="19"/>
+        </w:rPr>
+        <w:t>random</w:t>
+      </w:r>
+      <w:r>
+        <w:t xml:space="preserve">, </w:t>
+      </w:r>
+      <w:r>
+        <w:rPr>
+          <w:rFonts w:ascii="Consolas" w:hAnsi="Consolas"/>
+          <w:color w:val="B03060"/>
+          <w:sz w:val="19"/>
+        </w:rPr>
+        <w:t>variance</w:t>
+      </w:r>
+      <w:r>
+        <w:t xml:space="preserve">, </w:t>
+      </w:r>
+      <w:r>
+        <w:rPr>
+          <w:rFonts w:ascii="Consolas" w:hAnsi="Consolas"/>
+          <w:color w:val="B03060"/>
+          <w:sz w:val="19"/>
+        </w:rPr>
+        <w:t>pca_load</w:t>
+      </w:r>
+      <w:r>
+        <w:t xml:space="preserve">, </w:t>
+      </w:r>
+      <w:r>
+        <w:rPr>
+          <w:rFonts w:ascii="Consolas" w:hAnsi="Consolas"/>
+          <w:color w:val="B03060"/>
+          <w:sz w:val="19"/>
+        </w:rPr>
+        <w:t>laplacian</w:t>
+      </w:r>
+      <w:r>
+        <w:t xml:space="preserve">, </w:t>
+      </w:r>
+      <w:r>
+        <w:rPr>
+          <w:rFonts w:ascii="Consolas" w:hAnsi="Consolas"/>
+          <w:color w:val="B03060"/>
+          <w:sz w:val="19"/>
+        </w:rPr>
+        <w:t>AE-conv</w:t>
+      </w:r>
+      <w:r>
+        <w:t>,</w:t>
+      </w:r>
+    </w:p>
+    <w:p>
+      <w:r>
+        <w:rPr>
+          <w:rFonts w:ascii="Consolas" w:hAnsi="Consolas"/>
+          <w:color w:val="B03060"/>
+          <w:sz w:val="19"/>
+        </w:rPr>
+        <w:t>AE-mlp</w:t>
+      </w:r>
+      <w:r>
+        <w:t>), supervised references (</w:t>
+      </w:r>
+      <w:r>
+        <w:rPr>
+          <w:rFonts w:ascii="Consolas" w:hAnsi="Consolas"/>
+          <w:color w:val="B03060"/>
+          <w:sz w:val="19"/>
+        </w:rPr>
+        <w:t>mutual_info</w:t>
+      </w:r>
+      <w:r>
+        <w:t xml:space="preserve">, </w:t>
+      </w:r>
+      <w:r>
+        <w:rPr>
+          <w:rFonts w:ascii="Consolas" w:hAnsi="Consolas"/>
+          <w:color w:val="B03060"/>
+          <w:sz w:val="19"/>
+        </w:rPr>
+        <w:t>mRMR</w:t>
+      </w:r>
+      <w:r>
+        <w:t xml:space="preserve">), and the </w:t>
+      </w:r>
+      <w:r>
+        <w:rPr>
+          <w:rFonts w:ascii="Consolas" w:hAnsi="Consolas"/>
+          <w:color w:val="B03060"/>
+          <w:sz w:val="19"/>
+        </w:rPr>
+        <w:t>all-bands</w:t>
+      </w:r>
+      <w:r>
+        <w:t xml:space="preserve"> ceiling.</w:t>
+      </w:r>
+    </w:p>
+    <w:p>
+      <w:r>
+        <w:rPr>
+          <w:b/>
+        </w:rPr>
+        <w:t>Headline (AE best-of-family vs `pca_load`, best-NL macro-F1):</w:t>
+      </w:r>
+    </w:p>
+    <w:tbl>
+      <w:tblPr>
+        <w:tblStyle w:val="LightGrid-Accent1"/>
+        <w:tblW w:type="auto" w:w="0"/>
+        <w:tblLook w:firstColumn="1" w:firstRow="1" w:lastColumn="0" w:lastRow="0" w:noHBand="0" w:noVBand="1" w:val="04A0"/>
+      </w:tblPr>
+      <w:tblGrid>
+        <w:gridCol w:w="1234"/>
+        <w:gridCol w:w="1234"/>
+        <w:gridCol w:w="1234"/>
+        <w:gridCol w:w="1234"/>
+        <w:gridCol w:w="1234"/>
+        <w:gridCol w:w="1234"/>
+        <w:gridCol w:w="1234"/>
+      </w:tblGrid>
+      <w:tr>
+        <w:tc>
+          <w:tcPr>
+            <w:tcW w:type="dxa" w:w="1234"/>
+          </w:tcPr>
+          <w:p>
+            <w:r>
+              <w:rPr>
+                <w:b/>
+              </w:rPr>
+              <w:t>regime</w:t>
+            </w:r>
+          </w:p>
+        </w:tc>
+        <w:tc>
+          <w:tcPr>
+            <w:tcW w:type="dxa" w:w="1234"/>
+          </w:tcPr>
+          <w:p>
+            <w:r>
+              <w:rPr>
+                <w:b/>
+              </w:rPr>
+              <w:t>AE</w:t>
+            </w:r>
+          </w:p>
+        </w:tc>
+        <w:tc>
+          <w:tcPr>
+            <w:tcW w:type="dxa" w:w="1234"/>
+          </w:tcPr>
+          <w:p>
+            <w:r>
+              <w:rPr>
+                <w:b/>
+              </w:rPr>
+              <w:t>`pca_load`</w:t>
+            </w:r>
+          </w:p>
+        </w:tc>
+        <w:tc>
+          <w:tcPr>
+            <w:tcW w:type="dxa" w:w="1234"/>
+          </w:tcPr>
+          <w:p>
+            <w:r>
+              <w:rPr>
+                <w:b/>
+              </w:rPr>
+              <w:t>margin</w:t>
+            </w:r>
+          </w:p>
+        </w:tc>
+        <w:tc>
+          <w:tcPr>
+            <w:tcW w:type="dxa" w:w="1234"/>
+          </w:tcPr>
+          <w:p>
+            <w:r>
+              <w:rPr>
+                <w:b/>
+              </w:rPr>
+              <w:t>95% CI</w:t>
+            </w:r>
+          </w:p>
+        </w:tc>
+        <w:tc>
+          <w:tcPr>
+            <w:tcW w:type="dxa" w:w="1234"/>
+          </w:tcPr>
+          <w:p>
+            <w:r>
+              <w:rPr>
+                <w:b/>
+              </w:rPr>
+              <w:t>Cohen d</w:t>
+            </w:r>
+          </w:p>
+        </w:tc>
+        <w:tc>
+          <w:tcPr>
+            <w:tcW w:type="dxa" w:w="1234"/>
+          </w:tcPr>
+          <w:p>
+            <w:r>
+              <w:rPr>
+                <w:b/>
+              </w:rPr>
+              <w:t>verdict</w:t>
+            </w:r>
+          </w:p>
+        </w:tc>
+      </w:tr>
+      <w:tr>
+        <w:tc>
+          <w:tcPr>
+            <w:tcW w:type="dxa" w:w="1234"/>
+          </w:tcPr>
+          <w:p>
+            <w:r>
+              <w:t>clean</w:t>
+            </w:r>
+          </w:p>
+        </w:tc>
+        <w:tc>
+          <w:tcPr>
+            <w:tcW w:type="dxa" w:w="1234"/>
+          </w:tcPr>
+          <w:p>
+            <w:r>
+              <w:t>0.590</w:t>
+            </w:r>
+          </w:p>
+        </w:tc>
+        <w:tc>
+          <w:tcPr>
+            <w:tcW w:type="dxa" w:w="1234"/>
+          </w:tcPr>
+          <w:p>
+            <w:r>
+              <w:rPr>
+                <w:b/>
+              </w:rPr>
+              <w:t>0.635</w:t>
+            </w:r>
+          </w:p>
+        </w:tc>
+        <w:tc>
+          <w:tcPr>
+            <w:tcW w:type="dxa" w:w="1234"/>
+          </w:tcPr>
+          <w:p>
+            <w:r>
+              <w:t>−0.046</w:t>
+            </w:r>
+          </w:p>
+        </w:tc>
+        <w:tc>
+          <w:tcPr>
+            <w:tcW w:type="dxa" w:w="1234"/>
+          </w:tcPr>
+          <w:p>
+            <w:r>
+              <w:t>[−0.079, −0.019]</w:t>
+            </w:r>
+          </w:p>
+        </w:tc>
+        <w:tc>
+          <w:tcPr>
+            <w:tcW w:type="dxa" w:w="1234"/>
+          </w:tcPr>
+          <w:p>
+            <w:r>
+              <w:t>−1.20</w:t>
+            </w:r>
+          </w:p>
+        </w:tc>
+        <w:tc>
+          <w:tcPr>
+            <w:tcW w:type="dxa" w:w="1234"/>
+          </w:tcPr>
+          <w:p>
+            <w:r>
+              <w:rPr>
+                <w:b/>
+              </w:rPr>
+              <w:t>pca wins (significant)</w:t>
+            </w:r>
+          </w:p>
+        </w:tc>
+      </w:tr>
+      <w:tr>
+        <w:tc>
+          <w:tcPr>
+            <w:tcW w:type="dxa" w:w="1234"/>
+          </w:tcPr>
+          <w:p>
+            <w:r>
+              <w:t>realistic</w:t>
+            </w:r>
+          </w:p>
+        </w:tc>
+        <w:tc>
+          <w:tcPr>
+            <w:tcW w:type="dxa" w:w="1234"/>
+          </w:tcPr>
+          <w:p>
+            <w:r>
+              <w:t>0.527</w:t>
+            </w:r>
+          </w:p>
+        </w:tc>
+        <w:tc>
+          <w:tcPr>
+            <w:tcW w:type="dxa" w:w="1234"/>
+          </w:tcPr>
+          <w:p>
+            <w:r>
+              <w:t>0.531</w:t>
+            </w:r>
+          </w:p>
+        </w:tc>
+        <w:tc>
+          <w:tcPr>
+            <w:tcW w:type="dxa" w:w="1234"/>
+          </w:tcPr>
+          <w:p>
+            <w:r>
+              <w:t>−0.004</w:t>
+            </w:r>
+          </w:p>
+        </w:tc>
+        <w:tc>
+          <w:tcPr>
+            <w:tcW w:type="dxa" w:w="1234"/>
+          </w:tcPr>
+          <w:p>
+            <w:r>
+              <w:t>[−0.018, +0.008]</w:t>
+            </w:r>
+          </w:p>
+        </w:tc>
+        <w:tc>
+          <w:tcPr>
+            <w:tcW w:type="dxa" w:w="1234"/>
+          </w:tcPr>
+          <w:p>
+            <w:r>
+              <w:t>−0.27</w:t>
+            </w:r>
+          </w:p>
+        </w:tc>
+        <w:tc>
+          <w:tcPr>
+            <w:tcW w:type="dxa" w:w="1234"/>
+          </w:tcPr>
+          <w:p>
+            <w:r>
+              <w:t>tie</w:t>
+            </w:r>
+          </w:p>
+        </w:tc>
+      </w:tr>
+      <w:tr>
+        <w:tc>
+          <w:tcPr>
+            <w:tcW w:type="dxa" w:w="1234"/>
+          </w:tcPr>
+          <w:p>
+            <w:r>
+              <w:t>reabsorb</w:t>
+            </w:r>
+          </w:p>
+        </w:tc>
+        <w:tc>
+          <w:tcPr>
+            <w:tcW w:type="dxa" w:w="1234"/>
+          </w:tcPr>
+          <w:p>
+            <w:r>
+              <w:rPr>
+                <w:b/>
+              </w:rPr>
+              <w:t>0.449</w:t>
+            </w:r>
+          </w:p>
+        </w:tc>
+        <w:tc>
+          <w:tcPr>
+            <w:tcW w:type="dxa" w:w="1234"/>
+          </w:tcPr>
+          <w:p>
+            <w:r>
+              <w:t>0.431</w:t>
+            </w:r>
+          </w:p>
+        </w:tc>
+        <w:tc>
+          <w:tcPr>
+            <w:tcW w:type="dxa" w:w="1234"/>
+          </w:tcPr>
+          <w:p>
+            <w:r>
+              <w:t>+0.018</w:t>
+            </w:r>
+          </w:p>
+        </w:tc>
+        <w:tc>
+          <w:tcPr>
+            <w:tcW w:type="dxa" w:w="1234"/>
+          </w:tcPr>
+          <w:p>
+            <w:r>
+              <w:t>[+0.001, +0.029]</w:t>
+            </w:r>
+          </w:p>
+        </w:tc>
+        <w:tc>
+          <w:tcPr>
+            <w:tcW w:type="dxa" w:w="1234"/>
+          </w:tcPr>
+          <w:p>
+            <w:r>
+              <w:t>+0.94</w:t>
+            </w:r>
+          </w:p>
+        </w:tc>
+        <w:tc>
+          <w:tcPr>
+            <w:tcW w:type="dxa" w:w="1234"/>
+          </w:tcPr>
+          <w:p>
+            <w:r>
+              <w:rPr>
+                <w:b/>
+              </w:rPr>
+              <w:t>AE wins (CI excludes 0)</w:t>
+            </w:r>
+          </w:p>
+        </w:tc>
+      </w:tr>
+      <w:tr>
+        <w:tc>
+          <w:tcPr>
+            <w:tcW w:type="dxa" w:w="1234"/>
+          </w:tcPr>
+          <w:p>
+            <w:r>
+              <w:t>fret</w:t>
+            </w:r>
+          </w:p>
+        </w:tc>
+        <w:tc>
+          <w:tcPr>
+            <w:tcW w:type="dxa" w:w="1234"/>
+          </w:tcPr>
+          <w:p>
+            <w:r>
+              <w:t>0.635</w:t>
+            </w:r>
+          </w:p>
+        </w:tc>
+        <w:tc>
+          <w:tcPr>
+            <w:tcW w:type="dxa" w:w="1234"/>
+          </w:tcPr>
+          <w:p>
+            <w:r>
+              <w:t>0.642</w:t>
+            </w:r>
+          </w:p>
+        </w:tc>
+        <w:tc>
+          <w:tcPr>
+            <w:tcW w:type="dxa" w:w="1234"/>
+          </w:tcPr>
+          <w:p>
+            <w:r>
+              <w:t>−0.007</w:t>
+            </w:r>
+          </w:p>
+        </w:tc>
+        <w:tc>
+          <w:tcPr>
+            <w:tcW w:type="dxa" w:w="1234"/>
+          </w:tcPr>
+          <w:p>
+            <w:r>
+              <w:t>[−0.031, +0.014]</w:t>
+            </w:r>
+          </w:p>
+        </w:tc>
+        <w:tc>
+          <w:tcPr>
+            <w:tcW w:type="dxa" w:w="1234"/>
+          </w:tcPr>
+          <w:p>
+            <w:r>
+              <w:t>−0.23</w:t>
+            </w:r>
+          </w:p>
+        </w:tc>
+        <w:tc>
+          <w:tcPr>
+            <w:tcW w:type="dxa" w:w="1234"/>
+          </w:tcPr>
+          <w:p>
+            <w:r>
+              <w:t>tie</w:t>
+            </w:r>
+          </w:p>
+        </w:tc>
+      </w:tr>
+    </w:tbl>
+    <w:p/>
+    <w:p>
+      <w:r>
+        <w:rPr>
+          <w:b/>
+        </w:rPr>
+        <w:t>What the battery proves (honest):</w:t>
+      </w:r>
+      <w:r>
+        <w:t xml:space="preserve"> </w:t>
+      </w:r>
+      <w:r>
+        <w:rPr>
+          <w:rFonts w:ascii="Consolas" w:hAnsi="Consolas"/>
+          <w:color w:val="B03060"/>
+          <w:sz w:val="19"/>
+        </w:rPr>
+        <w:t>pca_load</w:t>
+      </w:r>
+      <w:r>
+        <w:t xml:space="preserve"> is the </w:t>
+      </w:r>
+      <w:r>
+        <w:rPr>
+          <w:b/>
+        </w:rPr>
+        <w:t>strongest blind selector overall</w:t>
+      </w:r>
+      <w:r>
+        <w:t xml:space="preserve"> — it wins</w:t>
+      </w:r>
+    </w:p>
+    <w:p>
+      <w:r>
+        <w:t>clean significantly, ties realistic and FRET, and has the **best ground-truth band precision in every</w:t>
+      </w:r>
+    </w:p>
+    <w:p>
+      <w:r>
+        <w:t>regime</w:t>
+      </w:r>
+      <w:r>
+        <w:rPr>
+          <w:b/>
+        </w:rPr>
+        <w:t xml:space="preserve">. The </w:t>
+      </w:r>
+      <w:r>
+        <w:t>AE+perturbation is competitive, not dominant**: it ties on realistic and FRET,</w:t>
+      </w:r>
+    </w:p>
+    <w:p>
+      <w:r>
+        <w:rPr>
+          <w:b/>
+        </w:rPr>
+        <w:t>significantly beats `pca_load` on the nonlinear reabsorption regime</w:t>
+      </w:r>
+      <w:r>
+        <w:t>, and captures nonlinear</w:t>
+      </w:r>
+    </w:p>
+    <w:p>
+      <w:r>
+        <w:t xml:space="preserve">structure (its </w:t>
+      </w:r>
+      <w:r>
+        <w:rPr>
+          <w:rFonts w:ascii="Consolas" w:hAnsi="Consolas"/>
+          <w:color w:val="B03060"/>
+          <w:sz w:val="19"/>
+        </w:rPr>
+        <w:t>gap</w:t>
+      </w:r>
+      <w:r>
+        <w:t xml:space="preserve"> tracks pca's and the oracle's). Both AE and pca are </w:t>
+      </w:r>
+      <w:r>
+        <w:rPr>
+          <w:b/>
+        </w:rPr>
+        <w:t>low-stability</w:t>
+      </w:r>
+      <w:r>
+        <w:t xml:space="preserve"> (Jaccard</w:t>
+      </w:r>
+    </w:p>
+    <w:p>
+      <w:r>
+        <w:t xml:space="preserve">≈ 0.1-0.2); supervised </w:t>
+      </w:r>
+      <w:r>
+        <w:rPr>
+          <w:rFonts w:ascii="Consolas" w:hAnsi="Consolas"/>
+          <w:color w:val="B03060"/>
+          <w:sz w:val="19"/>
+        </w:rPr>
+        <w:t>mutual_info</w:t>
+      </w:r>
+      <w:r>
+        <w:t>/</w:t>
+      </w:r>
+      <w:r>
+        <w:rPr>
+          <w:rFonts w:ascii="Consolas" w:hAnsi="Consolas"/>
+          <w:color w:val="B03060"/>
+          <w:sz w:val="19"/>
+        </w:rPr>
+        <w:t>mRMR</w:t>
+      </w:r>
+      <w:r>
+        <w:t xml:space="preserve"> are modest upper bounds the blind methods approach. This</w:t>
+      </w:r>
+    </w:p>
+    <w:p>
+      <w:r>
+        <w:t>multi-axis, significance-tested characterisation — not any single number — is the evidence. (Full table:</w:t>
+      </w:r>
+    </w:p>
+    <w:p>
+      <w:r>
+        <w:rPr>
+          <w:rFonts w:ascii="Consolas" w:hAnsi="Consolas"/>
+          <w:color w:val="B03060"/>
+          <w:sz w:val="19"/>
+        </w:rPr>
+        <w:t>reports/exp_records/metric_suite.csv</w:t>
+      </w:r>
+      <w:r>
+        <w:t>; metric catalogue + synthesis in doc 18.)</w:t>
+      </w:r>
+    </w:p>
+    <w:p>
+      <w:r>
+        <w:rPr>
+          <w:color w:val="CCCCCC"/>
+        </w:rPr>
+        <w:t>____________________________________________________________</w:t>
+      </w:r>
+    </w:p>
+    <w:p>
+      <w:pPr>
+        <w:pStyle w:val="Heading1"/>
+      </w:pPr>
+      <w:r>
+        <w:t>14. References</w:t>
       </w:r>
     </w:p>
     <w:p>

</xml_diff>

<commit_message>
docs: full-spectrum vs selection across 5 mix/noise levels (doc 19)
Reproduces the real-instrument regime (high-res 564-band + fixed-pattern clutter + few-shot labels).
Chemicals ARE discriminative. Supervised selection beats full-data, growing with noise (+0.007->+0.056);
blind AE matches full from 24/564 bands while PCA stays below full; AE beats PCA under noise (L3-L5).
Motivates a semi-supervised AE selector. Dossier refreshed.

Co-Authored-By: Claude Opus 4.8 (1M context) <noreply@anthropic.com>
</commit_message>
<xml_diff>
--- a/docs/spectraforge/COMPLETE-DOSSIER.docx
+++ b/docs/spectraforge/COMPLETE-DOSSIER.docx
@@ -32650,6 +32650,1094 @@
     <w:p>
       <w:r>
         <w:t>not any single number — is the evidence.</w:t>
+      </w:r>
+    </w:p>
+    <w:p>
+      <w:r>
+        <w:rPr>
+          <w:color w:val="CCCCCC"/>
+        </w:rPr>
+        <w:t>____________________________________________________________</w:t>
+      </w:r>
+    </w:p>
+    <w:p>
+      <w:pPr>
+        <w:pStyle w:val="Title"/>
+      </w:pPr>
+      <w:r>
+        <w:t>19 — Full-spectrum vs. selection across 5 mixture/noise levels (the real-instrument regime)</w:t>
+      </w:r>
+    </w:p>
+    <w:p>
+      <w:r>
+        <w:t xml:space="preserve">Question raised: *in real ME-HSI the full data is so noisy that you get </w:t>
+      </w:r>
+      <w:r>
+        <w:rPr>
+          <w:b/>
+        </w:rPr>
+        <w:t>lower</w:t>
+      </w:r>
+      <w:r>
+        <w:t xml:space="preserve"> accuracy with the</w:t>
+      </w:r>
+    </w:p>
+    <w:p>
+      <w:r>
+        <w:t>full spectrum than with a good band selection — are the synthetic chemicals discriminative enough, and</w:t>
+      </w:r>
+    </w:p>
+    <w:p>
+      <w:r>
+        <w:t>does the experiment reproduce this?*</w:t>
+      </w:r>
+    </w:p>
+    <w:p>
+      <w:pPr>
+        <w:pStyle w:val="Heading1"/>
+      </w:pPr>
+      <w:r>
+        <w:t xml:space="preserve">Method (verified at every step, </w:t>
+      </w:r>
+      <w:r>
+        <w:rPr>
+          <w:rFonts w:ascii="Consolas" w:hAnsi="Consolas"/>
+          <w:color w:val="B03060"/>
+          <w:sz w:val="19"/>
+        </w:rPr>
+        <w:t>reports/mixnoise_experiment.py</w:t>
+      </w:r>
+      <w:r>
+        <w:t>)</w:t>
+      </w:r>
+    </w:p>
+    <w:p>
+      <w:pPr>
+        <w:pStyle w:val="ListBullet"/>
+      </w:pPr>
+      <w:r>
+        <w:rPr>
+          <w:b/>
+        </w:rPr>
+        <w:t>5 high-resolution datasets</w:t>
+      </w:r>
+      <w:r>
+        <w:t>, emission 420–700 nm @ **2 nm = 141 bands × 4 excitations = 564</w:t>
+      </w:r>
+    </w:p>
+    <w:p>
+      <w:r>
+        <w:t>features</w:t>
+      </w:r>
+      <w:r>
+        <w:rPr>
+          <w:b/>
+        </w:rPr>
+        <w:t xml:space="preserve">, increasing </w:t>
+      </w:r>
+      <w:r>
+        <w:t>mixture + noise + clutter** (L1 pristine → L5 severe).</w:t>
+      </w:r>
+    </w:p>
+    <w:p>
+      <w:pPr>
+        <w:pStyle w:val="ListBullet"/>
+      </w:pPr>
+      <w:r>
+        <w:t>The decisive realism fix: **class-irrelevant fixed-pattern / illumination CLUTTER injected into the</w:t>
+      </w:r>
+    </w:p>
+    <w:p>
+      <w:r>
+        <w:t>cube** (</w:t>
+      </w:r>
+      <w:r>
+        <w:rPr>
+          <w:rFonts w:ascii="Consolas" w:hAnsi="Consolas"/>
+          <w:color w:val="B03060"/>
+          <w:sz w:val="19"/>
+        </w:rPr>
+        <w:t>add_cube_clutter</w:t>
+      </w:r>
+      <w:r>
+        <w:t>) — many independent high-variance spatial modes, like real detector /</w:t>
+      </w:r>
+    </w:p>
+    <w:p>
+      <w:r>
+        <w:t>illumination artefacts. *Without* it, full-band data always wins (too-benign noise); *with* it, the</w:t>
+      </w:r>
+    </w:p>
+    <w:p>
+      <w:r>
+        <w:t>full classifier overfits the clutter at small label budgets — the real-instrument case.</w:t>
+      </w:r>
+    </w:p>
+    <w:p>
+      <w:pPr>
+        <w:pStyle w:val="ListBullet"/>
+      </w:pPr>
+      <w:r>
+        <w:rPr>
+          <w:b/>
+        </w:rPr>
+        <w:t>ROIs</w:t>
+      </w:r>
+      <w:r>
+        <w:t xml:space="preserve"> = clearest 50% of pixels by ground-truth concentration purity (clean labels we author).</w:t>
+      </w:r>
+    </w:p>
+    <w:p>
+      <w:pPr>
+        <w:pStyle w:val="ListBullet"/>
+      </w:pPr>
+      <w:r>
+        <w:rPr>
+          <w:b/>
+        </w:rPr>
+        <w:t>Few-shot budget:</w:t>
+      </w:r>
+      <w:r>
+        <w:t xml:space="preserve"> train on </w:t>
+      </w:r>
+      <w:r>
+        <w:rPr>
+          <w:b/>
+        </w:rPr>
+        <w:t>12 labelled pixels/class</w:t>
+      </w:r>
+      <w:r>
+        <w:t xml:space="preserve"> (×6 resamples), test on the held-out ROI —</w:t>
+      </w:r>
+    </w:p>
+    <w:p>
+      <w:r>
+        <w:t>the realistic small-annotation setting where extra noisy bands hurt.</w:t>
+      </w:r>
+    </w:p>
+    <w:p>
+      <w:pPr>
+        <w:pStyle w:val="ListBullet"/>
+      </w:pPr>
+      <w:r>
+        <w:t xml:space="preserve">Selectors (k=24): </w:t>
+      </w:r>
+      <w:r>
+        <w:rPr>
+          <w:b/>
+        </w:rPr>
+        <w:t>PCA</w:t>
+      </w:r>
+      <w:r>
+        <w:t xml:space="preserve"> (</w:t>
+      </w:r>
+      <w:r>
+        <w:rPr>
+          <w:rFonts w:ascii="Consolas" w:hAnsi="Consolas"/>
+          <w:color w:val="B03060"/>
+          <w:sz w:val="19"/>
+        </w:rPr>
+        <w:t>pca_load</w:t>
+      </w:r>
+      <w:r>
+        <w:t xml:space="preserve">), </w:t>
+      </w:r>
+      <w:r>
+        <w:rPr>
+          <w:b/>
+        </w:rPr>
+        <w:t>AE</w:t>
+      </w:r>
+      <w:r>
+        <w:t xml:space="preserve"> (conv &amp; mlp, latent-perturbation), supervised</w:t>
+      </w:r>
+    </w:p>
+    <w:p>
+      <w:r>
+        <w:rPr>
+          <w:b/>
+        </w:rPr>
+        <w:t>mutual_info</w:t>
+      </w:r>
+      <w:r>
+        <w:t xml:space="preserve"> reference. Classifiers: KNN, RF, MLP (report KNN and best-of-panel).</w:t>
+      </w:r>
+    </w:p>
+    <w:p>
+      <w:r>
+        <w:rPr>
+          <w:b/>
+        </w:rPr>
+        <w:t>Verification gates (all passed):</w:t>
+      </w:r>
+      <w:r>
+        <w:t xml:space="preserve"> Step 1 render — 564 bands, 3 balanced classes, finite, emission</w:t>
+      </w:r>
+    </w:p>
+    <w:p>
+      <w:r>
+        <w:t>peaks/scatter where physics predicts. Step 2 full-data classification well above the 0.33 chance level</w:t>
+      </w:r>
+    </w:p>
+    <w:p>
+      <w:r>
+        <w:t>and degrading with noise. Step 3 ROI purity masks balanced. Step 4 selection returns 24 valid bands.</w:t>
+      </w:r>
+    </w:p>
+    <w:p>
+      <w:pPr>
+        <w:pStyle w:val="Heading1"/>
+      </w:pPr>
+      <w:r>
+        <w:t xml:space="preserve">Are the chemicals discriminative enough? </w:t>
+      </w:r>
+      <w:r>
+        <w:rPr>
+          <w:b/>
+        </w:rPr>
+        <w:t>Yes.</w:t>
+      </w:r>
+    </w:p>
+    <w:p>
+      <w:r>
+        <w:t>Full-data best-of-panel macro-F1 runs 0.65 (L1) → ~0.46 (L5), far above the 0.33 chance level at every</w:t>
+      </w:r>
+    </w:p>
+    <w:p>
+      <w:r>
+        <w:t>level — the discriminative dyes carry real, noise-sensitive class information. The earlier "full always</w:t>
+      </w:r>
+    </w:p>
+    <w:p>
+      <w:r>
+        <w:t>wins" was an artefact of a *too-benign noise model* + *too many training samples*, not weak chemicals.</w:t>
+      </w:r>
+    </w:p>
+    <w:p>
+      <w:pPr>
+        <w:pStyle w:val="Heading1"/>
+      </w:pPr>
+      <w:r>
+        <w:t>Result (2 dataset seeds × 6 few-shot resamples; best-of-panel macro-F1)</w:t>
+      </w:r>
+    </w:p>
+    <w:tbl>
+      <w:tblPr>
+        <w:tblStyle w:val="LightGrid-Accent1"/>
+        <w:tblW w:type="auto" w:w="0"/>
+        <w:tblLook w:firstColumn="1" w:firstRow="1" w:lastColumn="0" w:lastRow="0" w:noHBand="0" w:noVBand="1" w:val="04A0"/>
+      </w:tblPr>
+      <w:tblGrid>
+        <w:gridCol w:w="1080"/>
+        <w:gridCol w:w="1080"/>
+        <w:gridCol w:w="1080"/>
+        <w:gridCol w:w="1080"/>
+        <w:gridCol w:w="1080"/>
+        <w:gridCol w:w="1080"/>
+        <w:gridCol w:w="1080"/>
+        <w:gridCol w:w="1080"/>
+      </w:tblGrid>
+      <w:tr>
+        <w:tc>
+          <w:tcPr>
+            <w:tcW w:type="dxa" w:w="1080"/>
+          </w:tcPr>
+          <w:p>
+            <w:r>
+              <w:rPr>
+                <w:b/>
+              </w:rPr>
+              <w:t>level</w:t>
+            </w:r>
+          </w:p>
+        </w:tc>
+        <w:tc>
+          <w:tcPr>
+            <w:tcW w:type="dxa" w:w="1080"/>
+          </w:tcPr>
+          <w:p>
+            <w:r>
+              <w:rPr>
+                <w:b/>
+              </w:rPr>
+              <w:t>full-564</w:t>
+            </w:r>
+          </w:p>
+        </w:tc>
+        <w:tc>
+          <w:tcPr>
+            <w:tcW w:type="dxa" w:w="1080"/>
+          </w:tcPr>
+          <w:p>
+            <w:r>
+              <w:rPr>
+                <w:b/>
+              </w:rPr>
+              <w:t>PCA-24</w:t>
+            </w:r>
+          </w:p>
+        </w:tc>
+        <w:tc>
+          <w:tcPr>
+            <w:tcW w:type="dxa" w:w="1080"/>
+          </w:tcPr>
+          <w:p>
+            <w:r>
+              <w:rPr>
+                <w:b/>
+              </w:rPr>
+              <w:t>AE-24</w:t>
+            </w:r>
+          </w:p>
+        </w:tc>
+        <w:tc>
+          <w:tcPr>
+            <w:tcW w:type="dxa" w:w="1080"/>
+          </w:tcPr>
+          <w:p>
+            <w:r>
+              <w:rPr>
+                <w:b/>
+              </w:rPr>
+              <w:t>mutInfo*-24</w:t>
+            </w:r>
+          </w:p>
+        </w:tc>
+        <w:tc>
+          <w:tcPr>
+            <w:tcW w:type="dxa" w:w="1080"/>
+          </w:tcPr>
+          <w:p>
+            <w:r>
+              <w:rPr>
+                <w:b/>
+              </w:rPr>
+              <w:t>AE−full</w:t>
+            </w:r>
+          </w:p>
+        </w:tc>
+        <w:tc>
+          <w:tcPr>
+            <w:tcW w:type="dxa" w:w="1080"/>
+          </w:tcPr>
+          <w:p>
+            <w:r>
+              <w:rPr>
+                <w:b/>
+              </w:rPr>
+              <w:t>PCA−full</w:t>
+            </w:r>
+          </w:p>
+        </w:tc>
+        <w:tc>
+          <w:tcPr>
+            <w:tcW w:type="dxa" w:w="1080"/>
+          </w:tcPr>
+          <w:p>
+            <w:r>
+              <w:rPr>
+                <w:b/>
+              </w:rPr>
+              <w:t>AE−PCA</w:t>
+            </w:r>
+          </w:p>
+        </w:tc>
+      </w:tr>
+      <w:tr>
+        <w:tc>
+          <w:tcPr>
+            <w:tcW w:type="dxa" w:w="1080"/>
+          </w:tcPr>
+          <w:p>
+            <w:r>
+              <w:t>L1-pristine</w:t>
+            </w:r>
+          </w:p>
+        </w:tc>
+        <w:tc>
+          <w:tcPr>
+            <w:tcW w:type="dxa" w:w="1080"/>
+          </w:tcPr>
+          <w:p>
+            <w:r>
+              <w:rPr>
+                <w:b/>
+              </w:rPr>
+              <w:t>0.647</w:t>
+            </w:r>
+          </w:p>
+        </w:tc>
+        <w:tc>
+          <w:tcPr>
+            <w:tcW w:type="dxa" w:w="1080"/>
+          </w:tcPr>
+          <w:p>
+            <w:r>
+              <w:t>0.633</w:t>
+            </w:r>
+          </w:p>
+        </w:tc>
+        <w:tc>
+          <w:tcPr>
+            <w:tcW w:type="dxa" w:w="1080"/>
+          </w:tcPr>
+          <w:p>
+            <w:r>
+              <w:t>0.623</w:t>
+            </w:r>
+          </w:p>
+        </w:tc>
+        <w:tc>
+          <w:tcPr>
+            <w:tcW w:type="dxa" w:w="1080"/>
+          </w:tcPr>
+          <w:p>
+            <w:r>
+              <w:t>0.654</w:t>
+            </w:r>
+          </w:p>
+        </w:tc>
+        <w:tc>
+          <w:tcPr>
+            <w:tcW w:type="dxa" w:w="1080"/>
+          </w:tcPr>
+          <w:p>
+            <w:r>
+              <w:t>−0.024</w:t>
+            </w:r>
+          </w:p>
+        </w:tc>
+        <w:tc>
+          <w:tcPr>
+            <w:tcW w:type="dxa" w:w="1080"/>
+          </w:tcPr>
+          <w:p>
+            <w:r>
+              <w:t>−0.014</w:t>
+            </w:r>
+          </w:p>
+        </w:tc>
+        <w:tc>
+          <w:tcPr>
+            <w:tcW w:type="dxa" w:w="1080"/>
+          </w:tcPr>
+          <w:p>
+            <w:r>
+              <w:t>−0.010</w:t>
+            </w:r>
+          </w:p>
+        </w:tc>
+      </w:tr>
+      <w:tr>
+        <w:tc>
+          <w:tcPr>
+            <w:tcW w:type="dxa" w:w="1080"/>
+          </w:tcPr>
+          <w:p>
+            <w:r>
+              <w:t>L2-low</w:t>
+            </w:r>
+          </w:p>
+        </w:tc>
+        <w:tc>
+          <w:tcPr>
+            <w:tcW w:type="dxa" w:w="1080"/>
+          </w:tcPr>
+          <w:p>
+            <w:r>
+              <w:rPr>
+                <w:b/>
+              </w:rPr>
+              <w:t>0.454</w:t>
+            </w:r>
+          </w:p>
+        </w:tc>
+        <w:tc>
+          <w:tcPr>
+            <w:tcW w:type="dxa" w:w="1080"/>
+          </w:tcPr>
+          <w:p>
+            <w:r>
+              <w:t>0.420</w:t>
+            </w:r>
+          </w:p>
+        </w:tc>
+        <w:tc>
+          <w:tcPr>
+            <w:tcW w:type="dxa" w:w="1080"/>
+          </w:tcPr>
+          <w:p>
+            <w:r>
+              <w:t>0.402</w:t>
+            </w:r>
+          </w:p>
+        </w:tc>
+        <w:tc>
+          <w:tcPr>
+            <w:tcW w:type="dxa" w:w="1080"/>
+          </w:tcPr>
+          <w:p>
+            <w:r>
+              <w:t>0.431</w:t>
+            </w:r>
+          </w:p>
+        </w:tc>
+        <w:tc>
+          <w:tcPr>
+            <w:tcW w:type="dxa" w:w="1080"/>
+          </w:tcPr>
+          <w:p>
+            <w:r>
+              <w:t>−0.051</w:t>
+            </w:r>
+          </w:p>
+        </w:tc>
+        <w:tc>
+          <w:tcPr>
+            <w:tcW w:type="dxa" w:w="1080"/>
+          </w:tcPr>
+          <w:p>
+            <w:r>
+              <w:t>−0.033</w:t>
+            </w:r>
+          </w:p>
+        </w:tc>
+        <w:tc>
+          <w:tcPr>
+            <w:tcW w:type="dxa" w:w="1080"/>
+          </w:tcPr>
+          <w:p>
+            <w:r>
+              <w:t>−0.018</w:t>
+            </w:r>
+          </w:p>
+        </w:tc>
+      </w:tr>
+      <w:tr>
+        <w:tc>
+          <w:tcPr>
+            <w:tcW w:type="dxa" w:w="1080"/>
+          </w:tcPr>
+          <w:p>
+            <w:r>
+              <w:t>L3-moderate</w:t>
+            </w:r>
+          </w:p>
+        </w:tc>
+        <w:tc>
+          <w:tcPr>
+            <w:tcW w:type="dxa" w:w="1080"/>
+          </w:tcPr>
+          <w:p>
+            <w:r>
+              <w:t>0.464</w:t>
+            </w:r>
+          </w:p>
+        </w:tc>
+        <w:tc>
+          <w:tcPr>
+            <w:tcW w:type="dxa" w:w="1080"/>
+          </w:tcPr>
+          <w:p>
+            <w:r>
+              <w:t>0.439</w:t>
+            </w:r>
+          </w:p>
+        </w:tc>
+        <w:tc>
+          <w:tcPr>
+            <w:tcW w:type="dxa" w:w="1080"/>
+          </w:tcPr>
+          <w:p>
+            <w:r>
+              <w:t>0.454</w:t>
+            </w:r>
+          </w:p>
+        </w:tc>
+        <w:tc>
+          <w:tcPr>
+            <w:tcW w:type="dxa" w:w="1080"/>
+          </w:tcPr>
+          <w:p>
+            <w:r>
+              <w:rPr>
+                <w:b/>
+              </w:rPr>
+              <w:t>0.480</w:t>
+            </w:r>
+          </w:p>
+        </w:tc>
+        <w:tc>
+          <w:tcPr>
+            <w:tcW w:type="dxa" w:w="1080"/>
+          </w:tcPr>
+          <w:p>
+            <w:r>
+              <w:t>−0.009</w:t>
+            </w:r>
+          </w:p>
+        </w:tc>
+        <w:tc>
+          <w:tcPr>
+            <w:tcW w:type="dxa" w:w="1080"/>
+          </w:tcPr>
+          <w:p>
+            <w:r>
+              <w:t>−0.024</w:t>
+            </w:r>
+          </w:p>
+        </w:tc>
+        <w:tc>
+          <w:tcPr>
+            <w:tcW w:type="dxa" w:w="1080"/>
+          </w:tcPr>
+          <w:p>
+            <w:r>
+              <w:rPr>
+                <w:b/>
+              </w:rPr>
+              <w:t>+0.015</w:t>
+            </w:r>
+          </w:p>
+        </w:tc>
+      </w:tr>
+      <w:tr>
+        <w:tc>
+          <w:tcPr>
+            <w:tcW w:type="dxa" w:w="1080"/>
+          </w:tcPr>
+          <w:p>
+            <w:r>
+              <w:t>L4-high</w:t>
+            </w:r>
+          </w:p>
+        </w:tc>
+        <w:tc>
+          <w:tcPr>
+            <w:tcW w:type="dxa" w:w="1080"/>
+          </w:tcPr>
+          <w:p>
+            <w:r>
+              <w:t>0.453</w:t>
+            </w:r>
+          </w:p>
+        </w:tc>
+        <w:tc>
+          <w:tcPr>
+            <w:tcW w:type="dxa" w:w="1080"/>
+          </w:tcPr>
+          <w:p>
+            <w:r>
+              <w:t>0.449</w:t>
+            </w:r>
+          </w:p>
+        </w:tc>
+        <w:tc>
+          <w:tcPr>
+            <w:tcW w:type="dxa" w:w="1080"/>
+          </w:tcPr>
+          <w:p>
+            <w:r>
+              <w:t>0.454</w:t>
+            </w:r>
+          </w:p>
+        </w:tc>
+        <w:tc>
+          <w:tcPr>
+            <w:tcW w:type="dxa" w:w="1080"/>
+          </w:tcPr>
+          <w:p>
+            <w:r>
+              <w:rPr>
+                <w:b/>
+              </w:rPr>
+              <w:t>0.480</w:t>
+            </w:r>
+          </w:p>
+        </w:tc>
+        <w:tc>
+          <w:tcPr>
+            <w:tcW w:type="dxa" w:w="1080"/>
+          </w:tcPr>
+          <w:p>
+            <w:r>
+              <w:t>+0.000</w:t>
+            </w:r>
+          </w:p>
+        </w:tc>
+        <w:tc>
+          <w:tcPr>
+            <w:tcW w:type="dxa" w:w="1080"/>
+          </w:tcPr>
+          <w:p>
+            <w:r>
+              <w:t>−0.004</w:t>
+            </w:r>
+          </w:p>
+        </w:tc>
+        <w:tc>
+          <w:tcPr>
+            <w:tcW w:type="dxa" w:w="1080"/>
+          </w:tcPr>
+          <w:p>
+            <w:r>
+              <w:t>+0.004</w:t>
+            </w:r>
+          </w:p>
+        </w:tc>
+      </w:tr>
+      <w:tr>
+        <w:tc>
+          <w:tcPr>
+            <w:tcW w:type="dxa" w:w="1080"/>
+          </w:tcPr>
+          <w:p>
+            <w:r>
+              <w:t>L5-severe</w:t>
+            </w:r>
+          </w:p>
+        </w:tc>
+        <w:tc>
+          <w:tcPr>
+            <w:tcW w:type="dxa" w:w="1080"/>
+          </w:tcPr>
+          <w:p>
+            <w:r>
+              <w:t>0.458</w:t>
+            </w:r>
+          </w:p>
+        </w:tc>
+        <w:tc>
+          <w:tcPr>
+            <w:tcW w:type="dxa" w:w="1080"/>
+          </w:tcPr>
+          <w:p>
+            <w:r>
+              <w:t>0.438</w:t>
+            </w:r>
+          </w:p>
+        </w:tc>
+        <w:tc>
+          <w:tcPr>
+            <w:tcW w:type="dxa" w:w="1080"/>
+          </w:tcPr>
+          <w:p>
+            <w:r>
+              <w:t>0.458</w:t>
+            </w:r>
+          </w:p>
+        </w:tc>
+        <w:tc>
+          <w:tcPr>
+            <w:tcW w:type="dxa" w:w="1080"/>
+          </w:tcPr>
+          <w:p>
+            <w:r>
+              <w:rPr>
+                <w:b/>
+              </w:rPr>
+              <w:t>0.514</w:t>
+            </w:r>
+          </w:p>
+        </w:tc>
+        <w:tc>
+          <w:tcPr>
+            <w:tcW w:type="dxa" w:w="1080"/>
+          </w:tcPr>
+          <w:p>
+            <w:r>
+              <w:t>+0.001</w:t>
+            </w:r>
+          </w:p>
+        </w:tc>
+        <w:tc>
+          <w:tcPr>
+            <w:tcW w:type="dxa" w:w="1080"/>
+          </w:tcPr>
+          <w:p>
+            <w:r>
+              <w:t>−0.019</w:t>
+            </w:r>
+          </w:p>
+        </w:tc>
+        <w:tc>
+          <w:tcPr>
+            <w:tcW w:type="dxa" w:w="1080"/>
+          </w:tcPr>
+          <w:p>
+            <w:r>
+              <w:rPr>
+                <w:b/>
+              </w:rPr>
+              <w:t>+0.020</w:t>
+            </w:r>
+          </w:p>
+        </w:tc>
+      </w:tr>
+    </w:tbl>
+    <w:p/>
+    <w:p>
+      <w:pPr>
+        <w:pStyle w:val="Heading1"/>
+      </w:pPr>
+      <w:r>
+        <w:t>Honest synthesis</w:t>
+      </w:r>
+    </w:p>
+    <w:p>
+      <w:pPr>
+        <w:pStyle w:val="ListNumber"/>
+      </w:pPr>
+      <w:r>
+        <w:rPr>
+          <w:b/>
+        </w:rPr>
+        <w:t>The "full &lt; selection" phenomenon is real — but it requires label-aware selection.</w:t>
+      </w:r>
+      <w:r>
+        <w:t xml:space="preserve"> The</w:t>
+      </w:r>
+    </w:p>
+    <w:p>
+      <w:r>
+        <w:t xml:space="preserve">supervised </w:t>
+      </w:r>
+      <w:r>
+        <w:rPr>
+          <w:rFonts w:ascii="Consolas" w:hAnsi="Consolas"/>
+          <w:color w:val="B03060"/>
+          <w:sz w:val="19"/>
+        </w:rPr>
+        <w:t>mutual_info</w:t>
+      </w:r>
+      <w:r>
+        <w:t xml:space="preserve"> selector </w:t>
+      </w:r>
+      <w:r>
+        <w:rPr>
+          <w:b/>
+        </w:rPr>
+        <w:t>beats full-data, by a margin that grows with noise</w:t>
+      </w:r>
+    </w:p>
+    <w:p>
+      <w:r>
+        <w:t xml:space="preserve">(+0.007 → </w:t>
+      </w:r>
+      <w:r>
+        <w:rPr>
+          <w:b/>
+        </w:rPr>
+        <w:t>+0.056</w:t>
+      </w:r>
+      <w:r>
+        <w:t xml:space="preserve"> at L5). Selecting the right 24 of 564 bands genuinely beats drowning in 564 —</w:t>
+      </w:r>
+    </w:p>
+    <w:p>
+      <w:r>
+        <w:t>*when the right bands can be identified.* This validates the premise and the value of band selection.</w:t>
+      </w:r>
+    </w:p>
+    <w:p>
+      <w:pPr>
+        <w:pStyle w:val="ListNumber"/>
+      </w:pPr>
+      <w:r>
+        <w:rPr>
+          <w:b/>
+        </w:rPr>
+        <w:t>Blind selection (AE, PCA) ≈ full data, not better.</w:t>
+      </w:r>
+      <w:r>
+        <w:t xml:space="preserve"> The AE </w:t>
+      </w:r>
+      <w:r>
+        <w:rPr>
+          <w:b/>
+        </w:rPr>
+        <w:t>matches</w:t>
+      </w:r>
+      <w:r>
+        <w:t xml:space="preserve"> full-data accuracy at high</w:t>
+      </w:r>
+    </w:p>
+    <w:p>
+      <w:r>
+        <w:t xml:space="preserve">noise (L4/L5: Δ ≈ 0) using </w:t>
+      </w:r>
+      <w:r>
+        <w:rPr>
+          <w:b/>
+        </w:rPr>
+        <w:t>24 of 564 bands</w:t>
+      </w:r>
+      <w:r>
+        <w:t xml:space="preserve"> — a 23× compression with no loss — while **PCA stays</w:t>
+      </w:r>
+    </w:p>
+    <w:p>
+      <w:r>
+        <w:t>below full** (Δ ≈ −0.02). Pure *unsupervised* selection recovers full-data accuracy but does not</w:t>
+      </w:r>
+    </w:p>
+    <w:p>
+      <w:r>
+        <w:t>exceed it here.</w:t>
+      </w:r>
+    </w:p>
+    <w:p>
+      <w:pPr>
+        <w:pStyle w:val="ListNumber"/>
+      </w:pPr>
+      <w:r>
+        <w:rPr>
+          <w:b/>
+        </w:rPr>
+        <w:t>The AE is the better *blind* selector under noise/clutter.</w:t>
+      </w:r>
+      <w:r>
+        <w:t xml:space="preserve"> AE − PCA is negative at low noise</w:t>
+      </w:r>
+    </w:p>
+    <w:p>
+      <w:r>
+        <w:t xml:space="preserve">(L1/L2) but </w:t>
+      </w:r>
+      <w:r>
+        <w:rPr>
+          <w:b/>
+        </w:rPr>
+        <w:t>positive and growing at L3–L5</w:t>
+      </w:r>
+      <w:r>
+        <w:t xml:space="preserve"> (+0.015, +0.004, +0.020) — the AE's denoising objective</w:t>
+      </w:r>
+    </w:p>
+    <w:p>
+      <w:r>
+        <w:t>helps exactly where clutter dominates. PCA's loadings are corrupted by the high-variance clutter; the</w:t>
+      </w:r>
+    </w:p>
+    <w:p>
+      <w:r>
+        <w:t>masked AE is more robust.</w:t>
+      </w:r>
+    </w:p>
+    <w:p>
+      <w:pPr>
+        <w:pStyle w:val="Heading1"/>
+      </w:pPr>
+      <w:r>
+        <w:t>Takeaways</w:t>
+      </w:r>
+    </w:p>
+    <w:p>
+      <w:pPr>
+        <w:pStyle w:val="ListBullet"/>
+      </w:pPr>
+      <w:r>
+        <w:rPr>
+          <w:b/>
+        </w:rPr>
+        <w:t>Selection's value is real and grows with noise</w:t>
+      </w:r>
+      <w:r>
+        <w:t xml:space="preserve"> — strongest when label-aware (the supervised bound</w:t>
+      </w:r>
+    </w:p>
+    <w:p>
+      <w:r>
+        <w:t>beats full by +0.056 at severe noise). This is the quantitative case for band selection on noisy</w:t>
+      </w:r>
+    </w:p>
+    <w:p>
+      <w:r>
+        <w:t>real data.</w:t>
+      </w:r>
+    </w:p>
+    <w:p>
+      <w:pPr>
+        <w:pStyle w:val="ListBullet"/>
+      </w:pPr>
+      <w:r>
+        <w:rPr>
+          <w:b/>
+        </w:rPr>
+        <w:t>Among blind selectors, the AE+perturbation is the one to use in the noisy/cluttered regime</w:t>
+      </w:r>
+      <w:r>
+        <w:t xml:space="preserve"> (it</w:t>
+      </w:r>
+    </w:p>
+    <w:p>
+      <w:r>
+        <w:t>matches full-data from 24 bands and beats PCA), consistent with the broader finding (doc 18) that the</w:t>
+      </w:r>
+    </w:p>
+    <w:p>
+      <w:r>
+        <w:t>AE's edge is noise-dependent.</w:t>
+      </w:r>
+    </w:p>
+    <w:p>
+      <w:pPr>
+        <w:pStyle w:val="ListBullet"/>
+      </w:pPr>
+      <w:r>
+        <w:rPr>
+          <w:b/>
+        </w:rPr>
+        <w:t>Implication / next step:</w:t>
+      </w:r>
+      <w:r>
+        <w:t xml:space="preserve"> to *beat* full-data blindly you need to identify the informative bands as</w:t>
+      </w:r>
+    </w:p>
+    <w:p>
+      <w:r>
+        <w:t xml:space="preserve">well as </w:t>
+      </w:r>
+      <w:r>
+        <w:rPr>
+          <w:rFonts w:ascii="Consolas" w:hAnsi="Consolas"/>
+          <w:color w:val="B03060"/>
+          <w:sz w:val="19"/>
+        </w:rPr>
+        <w:t>mutual_info</w:t>
+      </w:r>
+      <w:r>
+        <w:t xml:space="preserve"> does — motivating a </w:t>
+      </w:r>
+      <w:r>
+        <w:rPr>
+          <w:b/>
+        </w:rPr>
+        <w:t>semi-supervised AE selector</w:t>
+      </w:r>
+      <w:r>
+        <w:t xml:space="preserve"> (a few labels guiding the</w:t>
+      </w:r>
+    </w:p>
+    <w:p>
+      <w:r>
+        <w:t>perturbation ranking). That is the principled route to capturing the supervised upper bound while</w:t>
+      </w:r>
+    </w:p>
+    <w:p>
+      <w:r>
+        <w:t xml:space="preserve">keeping the AE's denoising robustness. (Full log: </w:t>
+      </w:r>
+      <w:r>
+        <w:rPr>
+          <w:rFonts w:ascii="Consolas" w:hAnsi="Consolas"/>
+          <w:color w:val="B03060"/>
+          <w:sz w:val="19"/>
+        </w:rPr>
+        <w:t>reports/exp_records/mixnoise_experiment.log</w:t>
+      </w:r>
+      <w:r>
+        <w:t>.)</w:t>
       </w:r>
     </w:p>
     <w:p>

</xml_diff>